<commit_message>
docs: report adds streaks and badges, the hosted admin console and 185 unit tests
- Scope, abstract, chapters 6-8: hifz streaks and badges; the platform
  admin console published on EAS Hosting (7.4.1), so 8.3.2 now asks for
  reports rather than hosting; 185 unit tests in 23 files.
- Figure 6.8 gains a badges panel from the installed APK.
- Still 72 pages.

Co-Authored-By: Claude Opus 5.5 <noreply@anthropic.com>
</commit_message>
<xml_diff>
--- a/docs/final-year-documentation/Digital_Madrasa_Project_Documentation.docx
+++ b/docs/final-year-documentation/Digital_Madrasa_Project_Documentation.docx
@@ -17,7 +17,7 @@
           <w:noProof/>
         </w:rPr>
         <w:drawing>
-          <wp:inline distT="0" distB="0" distL="0" distR="0" wp14:anchorId="189A34B4" wp14:editId="189A34B5">
+          <wp:inline distT="0" distB="0" distL="0" distR="0" wp14:anchorId="48F18C91" wp14:editId="75AA6858">
             <wp:extent cx="1733550" cy="657225"/>
             <wp:effectExtent l="0" t="0" r="0" b="0"/>
             <wp:docPr id="16" name="Picture 16"/>
@@ -232,7 +232,7 @@
         <w:spacing w:before="120" w:after="300"/>
         <w:jc w:val="center"/>
       </w:pPr>
-      <w:bookmarkStart w:id="0" w:name="_Toc242925199"/>
+      <w:bookmarkStart w:id="0" w:name="_Toc243004370"/>
       <w:r>
         <w:rPr>
           <w:sz w:val="24"/>
@@ -365,7 +365,7 @@
         <w:spacing w:before="120" w:after="300"/>
         <w:jc w:val="center"/>
       </w:pPr>
-      <w:bookmarkStart w:id="1" w:name="_Toc242925200"/>
+      <w:bookmarkStart w:id="1" w:name="_Toc243004371"/>
       <w:r>
         <w:rPr>
           <w:sz w:val="24"/>
@@ -392,7 +392,7 @@
         <w:spacing w:before="120" w:after="300"/>
         <w:jc w:val="center"/>
       </w:pPr>
-      <w:bookmarkStart w:id="2" w:name="_Toc242925201"/>
+      <w:bookmarkStart w:id="2" w:name="_Toc243004372"/>
       <w:r>
         <w:rPr>
           <w:sz w:val="24"/>
@@ -437,7 +437,7 @@
         <w:spacing w:before="120" w:after="300"/>
         <w:jc w:val="center"/>
       </w:pPr>
-      <w:bookmarkStart w:id="3" w:name="_Toc242925202"/>
+      <w:bookmarkStart w:id="3" w:name="_Toc243004373"/>
       <w:r>
         <w:rPr>
           <w:sz w:val="24"/>
@@ -469,7 +469,7 @@
         <w:t>The system was developed using the Agile methodology with React Native (Expo) and TypeScript for the mobile application and Supabase (PostgreSQL, authentication, storage and Edge Functions) for the backend. Each madrasa is a separate tenant whose records are protected by Row Level Security on every table. The application serves madrasa owners, teachers, parents and students, and provides student admission, classes, manual and QR-code attendance, memorisation tracking, recitation recording with teacher revie</w:t>
       </w:r>
       <w:r>
-        <w:t>w, parent–child linking approved by the madrasa, AI recitation feedback given only with a parent’s consent, master-reciter comparison, a live reading room with scheduled lessons, a teacher-chosen Quran video library, fee invoicing with M-Pesa and card payment, parent–teacher messaging, offline attendance, notifications, and an interface in English, Kiswahili, Somali and Arabic.</w:t>
+        <w:t>w, parent–child linking approved by the madrasa, AI recitation feedback given only with a parent’s consent, master-reciter comparison, hifz streaks and badges, a live reading room with scheduled lessons, a teacher-chosen Quran video library, fee invoicing with M-Pesa and card payment, parent–teacher messaging, offline attendance, notifications, and an interface in English, Kiswahili, Somali and Arabic.</w:t>
       </w:r>
     </w:p>
     <w:p>
@@ -478,7 +478,7 @@
         <w:jc w:val="both"/>
       </w:pPr>
       <w:r>
-        <w:t>Unit, functional and user interface testing showed that the core features work as required and that users cannot reach records outside their madrasa or role: all 172 unit tests and 78 functional test cases passed, 21 database suites proved 145 security guarantees, and the installed app passed 30 of 31 interface checks. M-Pesa runs on Safaricom’s Daraja sandbox, while card, e-mail and SMS run on mock providers until live credentials are configured. The project shows that a secure, integrated madrasa manageme</w:t>
+        <w:t>Unit, functional and user interface testing showed that the core features work as required and that users cannot reach records outside their madrasa or role: all 185 unit tests and 78 functional test cases passed, 21 database suites proved 145 security guarantees, and the installed app passed 30 of 31 interface checks. M-Pesa runs on Safaricom’s Daraja sandbox, while card, e-mail and SMS run on mock providers until live credentials are configured. The project shows that a secure, integrated madrasa manageme</w:t>
       </w:r>
       <w:r>
         <w:t>nt application for Kenya is feasible.</w:t>
@@ -518,7 +518,7 @@
     <w:sdt>
       <w:sdtPr>
         <w:alias w:val="Contents"/>
-        <w:id w:val="1315607690"/>
+        <w:id w:val="-1507512666"/>
       </w:sdtPr>
       <w:sdtEndPr/>
       <w:sdtContent>
@@ -544,7 +544,7 @@
           <w:r>
             <w:fldChar w:fldCharType="separate"/>
           </w:r>
-          <w:hyperlink w:anchor="_Toc242925199" w:history="1">
+          <w:hyperlink w:anchor="_Toc243004370" w:history="1">
             <w:r>
               <w:rPr>
                 <w:rStyle w:val="Hyperlink"/>
@@ -568,7 +568,7 @@
               <w:rPr>
                 <w:noProof/>
               </w:rPr>
-              <w:instrText xml:space="preserve"> PAGEREF _Toc242925199 \h </w:instrText>
+              <w:instrText xml:space="preserve"> PAGEREF _Toc243004370 \h </w:instrText>
             </w:r>
             <w:r>
               <w:rPr>
@@ -608,7 +608,7 @@
               <w14:ligatures w14:val="standardContextual"/>
             </w:rPr>
           </w:pPr>
-          <w:hyperlink w:anchor="_Toc242925200" w:history="1">
+          <w:hyperlink w:anchor="_Toc243004371" w:history="1">
             <w:r>
               <w:rPr>
                 <w:rStyle w:val="Hyperlink"/>
@@ -632,7 +632,7 @@
               <w:rPr>
                 <w:noProof/>
               </w:rPr>
-              <w:instrText xml:space="preserve"> PAGEREF _Toc242925200 \h </w:instrText>
+              <w:instrText xml:space="preserve"> PAGEREF _Toc243004371 \h </w:instrText>
             </w:r>
             <w:r>
               <w:rPr>
@@ -672,7 +672,7 @@
               <w14:ligatures w14:val="standardContextual"/>
             </w:rPr>
           </w:pPr>
-          <w:hyperlink w:anchor="_Toc242925201" w:history="1">
+          <w:hyperlink w:anchor="_Toc243004372" w:history="1">
             <w:r>
               <w:rPr>
                 <w:rStyle w:val="Hyperlink"/>
@@ -696,7 +696,7 @@
               <w:rPr>
                 <w:noProof/>
               </w:rPr>
-              <w:instrText xml:space="preserve"> PAGEREF _Toc242925201 \h </w:instrText>
+              <w:instrText xml:space="preserve"> PAGEREF _Toc243004372 \h </w:instrText>
             </w:r>
             <w:r>
               <w:rPr>
@@ -736,7 +736,7 @@
               <w14:ligatures w14:val="standardContextual"/>
             </w:rPr>
           </w:pPr>
-          <w:hyperlink w:anchor="_Toc242925202" w:history="1">
+          <w:hyperlink w:anchor="_Toc243004373" w:history="1">
             <w:r>
               <w:rPr>
                 <w:rStyle w:val="Hyperlink"/>
@@ -760,7 +760,7 @@
               <w:rPr>
                 <w:noProof/>
               </w:rPr>
-              <w:instrText xml:space="preserve"> PAGEREF _Toc242925202 \h </w:instrText>
+              <w:instrText xml:space="preserve"> PAGEREF _Toc243004373 \h </w:instrText>
             </w:r>
             <w:r>
               <w:rPr>
@@ -800,7 +800,7 @@
               <w14:ligatures w14:val="standardContextual"/>
             </w:rPr>
           </w:pPr>
-          <w:hyperlink w:anchor="_Toc242925203" w:history="1">
+          <w:hyperlink w:anchor="_Toc243004374" w:history="1">
             <w:r>
               <w:rPr>
                 <w:rStyle w:val="Hyperlink"/>
@@ -824,7 +824,7 @@
               <w:rPr>
                 <w:noProof/>
               </w:rPr>
-              <w:instrText xml:space="preserve"> PAGEREF _Toc242925203 \h </w:instrText>
+              <w:instrText xml:space="preserve"> PAGEREF _Toc243004374 \h </w:instrText>
             </w:r>
             <w:r>
               <w:rPr>
@@ -864,7 +864,7 @@
               <w14:ligatures w14:val="standardContextual"/>
             </w:rPr>
           </w:pPr>
-          <w:hyperlink w:anchor="_Toc242925204" w:history="1">
+          <w:hyperlink w:anchor="_Toc243004375" w:history="1">
             <w:r>
               <w:rPr>
                 <w:rStyle w:val="Hyperlink"/>
@@ -888,7 +888,7 @@
               <w:rPr>
                 <w:noProof/>
               </w:rPr>
-              <w:instrText xml:space="preserve"> PAGEREF _Toc242925204 \h </w:instrText>
+              <w:instrText xml:space="preserve"> PAGEREF _Toc243004375 \h </w:instrText>
             </w:r>
             <w:r>
               <w:rPr>
@@ -928,7 +928,7 @@
               <w14:ligatures w14:val="standardContextual"/>
             </w:rPr>
           </w:pPr>
-          <w:hyperlink w:anchor="_Toc242925205" w:history="1">
+          <w:hyperlink w:anchor="_Toc243004376" w:history="1">
             <w:r>
               <w:rPr>
                 <w:rStyle w:val="Hyperlink"/>
@@ -952,7 +952,7 @@
               <w:rPr>
                 <w:noProof/>
               </w:rPr>
-              <w:instrText xml:space="preserve"> PAGEREF _Toc242925205 \h </w:instrText>
+              <w:instrText xml:space="preserve"> PAGEREF _Toc243004376 \h </w:instrText>
             </w:r>
             <w:r>
               <w:rPr>
@@ -992,7 +992,7 @@
               <w14:ligatures w14:val="standardContextual"/>
             </w:rPr>
           </w:pPr>
-          <w:hyperlink w:anchor="_Toc242925206" w:history="1">
+          <w:hyperlink w:anchor="_Toc243004377" w:history="1">
             <w:r>
               <w:rPr>
                 <w:rStyle w:val="Hyperlink"/>
@@ -1016,7 +1016,7 @@
               <w:rPr>
                 <w:noProof/>
               </w:rPr>
-              <w:instrText xml:space="preserve"> PAGEREF _Toc242925206 \h </w:instrText>
+              <w:instrText xml:space="preserve"> PAGEREF _Toc243004377 \h </w:instrText>
             </w:r>
             <w:r>
               <w:rPr>
@@ -1056,7 +1056,7 @@
               <w14:ligatures w14:val="standardContextual"/>
             </w:rPr>
           </w:pPr>
-          <w:hyperlink w:anchor="_Toc242925207" w:history="1">
+          <w:hyperlink w:anchor="_Toc243004378" w:history="1">
             <w:r>
               <w:rPr>
                 <w:rStyle w:val="Hyperlink"/>
@@ -1080,7 +1080,7 @@
               <w:rPr>
                 <w:noProof/>
               </w:rPr>
-              <w:instrText xml:space="preserve"> PAGEREF _Toc242925207 \h </w:instrText>
+              <w:instrText xml:space="preserve"> PAGEREF _Toc243004378 \h </w:instrText>
             </w:r>
             <w:r>
               <w:rPr>
@@ -1120,7 +1120,7 @@
               <w14:ligatures w14:val="standardContextual"/>
             </w:rPr>
           </w:pPr>
-          <w:hyperlink w:anchor="_Toc242925208" w:history="1">
+          <w:hyperlink w:anchor="_Toc243004379" w:history="1">
             <w:r>
               <w:rPr>
                 <w:rStyle w:val="Hyperlink"/>
@@ -1144,7 +1144,7 @@
               <w:rPr>
                 <w:noProof/>
               </w:rPr>
-              <w:instrText xml:space="preserve"> PAGEREF _Toc242925208 \h </w:instrText>
+              <w:instrText xml:space="preserve"> PAGEREF _Toc243004379 \h </w:instrText>
             </w:r>
             <w:r>
               <w:rPr>
@@ -1184,7 +1184,7 @@
               <w14:ligatures w14:val="standardContextual"/>
             </w:rPr>
           </w:pPr>
-          <w:hyperlink w:anchor="_Toc242925209" w:history="1">
+          <w:hyperlink w:anchor="_Toc243004380" w:history="1">
             <w:r>
               <w:rPr>
                 <w:rStyle w:val="Hyperlink"/>
@@ -1208,7 +1208,7 @@
               <w:rPr>
                 <w:noProof/>
               </w:rPr>
-              <w:instrText xml:space="preserve"> PAGEREF _Toc242925209 \h </w:instrText>
+              <w:instrText xml:space="preserve"> PAGEREF _Toc243004380 \h </w:instrText>
             </w:r>
             <w:r>
               <w:rPr>
@@ -1248,7 +1248,7 @@
               <w14:ligatures w14:val="standardContextual"/>
             </w:rPr>
           </w:pPr>
-          <w:hyperlink w:anchor="_Toc242925210" w:history="1">
+          <w:hyperlink w:anchor="_Toc243004381" w:history="1">
             <w:r>
               <w:rPr>
                 <w:rStyle w:val="Hyperlink"/>
@@ -1272,7 +1272,7 @@
               <w:rPr>
                 <w:noProof/>
               </w:rPr>
-              <w:instrText xml:space="preserve"> PAGEREF _Toc242925210 \h </w:instrText>
+              <w:instrText xml:space="preserve"> PAGEREF _Toc243004381 \h </w:instrText>
             </w:r>
             <w:r>
               <w:rPr>
@@ -1312,7 +1312,7 @@
               <w14:ligatures w14:val="standardContextual"/>
             </w:rPr>
           </w:pPr>
-          <w:hyperlink w:anchor="_Toc242925211" w:history="1">
+          <w:hyperlink w:anchor="_Toc243004382" w:history="1">
             <w:r>
               <w:rPr>
                 <w:rStyle w:val="Hyperlink"/>
@@ -1336,7 +1336,7 @@
               <w:rPr>
                 <w:noProof/>
               </w:rPr>
-              <w:instrText xml:space="preserve"> PAGEREF _Toc242925211 \h </w:instrText>
+              <w:instrText xml:space="preserve"> PAGEREF _Toc243004382 \h </w:instrText>
             </w:r>
             <w:r>
               <w:rPr>
@@ -1376,7 +1376,7 @@
               <w14:ligatures w14:val="standardContextual"/>
             </w:rPr>
           </w:pPr>
-          <w:hyperlink w:anchor="_Toc242925212" w:history="1">
+          <w:hyperlink w:anchor="_Toc243004383" w:history="1">
             <w:r>
               <w:rPr>
                 <w:rStyle w:val="Hyperlink"/>
@@ -1400,7 +1400,7 @@
               <w:rPr>
                 <w:noProof/>
               </w:rPr>
-              <w:instrText xml:space="preserve"> PAGEREF _Toc242925212 \h </w:instrText>
+              <w:instrText xml:space="preserve"> PAGEREF _Toc243004383 \h </w:instrText>
             </w:r>
             <w:r>
               <w:rPr>
@@ -1440,7 +1440,7 @@
               <w14:ligatures w14:val="standardContextual"/>
             </w:rPr>
           </w:pPr>
-          <w:hyperlink w:anchor="_Toc242925213" w:history="1">
+          <w:hyperlink w:anchor="_Toc243004384" w:history="1">
             <w:r>
               <w:rPr>
                 <w:rStyle w:val="Hyperlink"/>
@@ -1464,7 +1464,7 @@
               <w:rPr>
                 <w:noProof/>
               </w:rPr>
-              <w:instrText xml:space="preserve"> PAGEREF _Toc242925213 \h </w:instrText>
+              <w:instrText xml:space="preserve"> PAGEREF _Toc243004384 \h </w:instrText>
             </w:r>
             <w:r>
               <w:rPr>
@@ -1504,7 +1504,7 @@
               <w14:ligatures w14:val="standardContextual"/>
             </w:rPr>
           </w:pPr>
-          <w:hyperlink w:anchor="_Toc242925214" w:history="1">
+          <w:hyperlink w:anchor="_Toc243004385" w:history="1">
             <w:r>
               <w:rPr>
                 <w:rStyle w:val="Hyperlink"/>
@@ -1528,7 +1528,7 @@
               <w:rPr>
                 <w:noProof/>
               </w:rPr>
-              <w:instrText xml:space="preserve"> PAGEREF _Toc242925214 \h </w:instrText>
+              <w:instrText xml:space="preserve"> PAGEREF _Toc243004385 \h </w:instrText>
             </w:r>
             <w:r>
               <w:rPr>
@@ -1568,7 +1568,7 @@
               <w14:ligatures w14:val="standardContextual"/>
             </w:rPr>
           </w:pPr>
-          <w:hyperlink w:anchor="_Toc242925215" w:history="1">
+          <w:hyperlink w:anchor="_Toc243004386" w:history="1">
             <w:r>
               <w:rPr>
                 <w:rStyle w:val="Hyperlink"/>
@@ -1592,7 +1592,7 @@
               <w:rPr>
                 <w:noProof/>
               </w:rPr>
-              <w:instrText xml:space="preserve"> PAGEREF _Toc242925215 \h </w:instrText>
+              <w:instrText xml:space="preserve"> PAGEREF _Toc243004386 \h </w:instrText>
             </w:r>
             <w:r>
               <w:rPr>
@@ -1632,7 +1632,7 @@
               <w14:ligatures w14:val="standardContextual"/>
             </w:rPr>
           </w:pPr>
-          <w:hyperlink w:anchor="_Toc242925216" w:history="1">
+          <w:hyperlink w:anchor="_Toc243004387" w:history="1">
             <w:r>
               <w:rPr>
                 <w:rStyle w:val="Hyperlink"/>
@@ -1656,7 +1656,7 @@
               <w:rPr>
                 <w:noProof/>
               </w:rPr>
-              <w:instrText xml:space="preserve"> PAGEREF _Toc242925216 \h </w:instrText>
+              <w:instrText xml:space="preserve"> PAGEREF _Toc243004387 \h </w:instrText>
             </w:r>
             <w:r>
               <w:rPr>
@@ -1696,7 +1696,7 @@
               <w14:ligatures w14:val="standardContextual"/>
             </w:rPr>
           </w:pPr>
-          <w:hyperlink w:anchor="_Toc242925217" w:history="1">
+          <w:hyperlink w:anchor="_Toc243004388" w:history="1">
             <w:r>
               <w:rPr>
                 <w:rStyle w:val="Hyperlink"/>
@@ -1720,7 +1720,7 @@
               <w:rPr>
                 <w:noProof/>
               </w:rPr>
-              <w:instrText xml:space="preserve"> PAGEREF _Toc242925217 \h </w:instrText>
+              <w:instrText xml:space="preserve"> PAGEREF _Toc243004388 \h </w:instrText>
             </w:r>
             <w:r>
               <w:rPr>
@@ -1760,7 +1760,7 @@
               <w14:ligatures w14:val="standardContextual"/>
             </w:rPr>
           </w:pPr>
-          <w:hyperlink w:anchor="_Toc242925218" w:history="1">
+          <w:hyperlink w:anchor="_Toc243004389" w:history="1">
             <w:r>
               <w:rPr>
                 <w:rStyle w:val="Hyperlink"/>
@@ -1784,7 +1784,7 @@
               <w:rPr>
                 <w:noProof/>
               </w:rPr>
-              <w:instrText xml:space="preserve"> PAGEREF _Toc242925218 \h </w:instrText>
+              <w:instrText xml:space="preserve"> PAGEREF _Toc243004389 \h </w:instrText>
             </w:r>
             <w:r>
               <w:rPr>
@@ -1824,7 +1824,7 @@
               <w14:ligatures w14:val="standardContextual"/>
             </w:rPr>
           </w:pPr>
-          <w:hyperlink w:anchor="_Toc242925219" w:history="1">
+          <w:hyperlink w:anchor="_Toc243004390" w:history="1">
             <w:r>
               <w:rPr>
                 <w:rStyle w:val="Hyperlink"/>
@@ -1848,7 +1848,7 @@
               <w:rPr>
                 <w:noProof/>
               </w:rPr>
-              <w:instrText xml:space="preserve"> PAGEREF _Toc242925219 \h </w:instrText>
+              <w:instrText xml:space="preserve"> PAGEREF _Toc243004390 \h </w:instrText>
             </w:r>
             <w:r>
               <w:rPr>
@@ -1888,7 +1888,7 @@
               <w14:ligatures w14:val="standardContextual"/>
             </w:rPr>
           </w:pPr>
-          <w:hyperlink w:anchor="_Toc242925220" w:history="1">
+          <w:hyperlink w:anchor="_Toc243004391" w:history="1">
             <w:r>
               <w:rPr>
                 <w:rStyle w:val="Hyperlink"/>
@@ -1912,7 +1912,7 @@
               <w:rPr>
                 <w:noProof/>
               </w:rPr>
-              <w:instrText xml:space="preserve"> PAGEREF _Toc242925220 \h </w:instrText>
+              <w:instrText xml:space="preserve"> PAGEREF _Toc243004391 \h </w:instrText>
             </w:r>
             <w:r>
               <w:rPr>
@@ -1952,7 +1952,7 @@
               <w14:ligatures w14:val="standardContextual"/>
             </w:rPr>
           </w:pPr>
-          <w:hyperlink w:anchor="_Toc242925221" w:history="1">
+          <w:hyperlink w:anchor="_Toc243004392" w:history="1">
             <w:r>
               <w:rPr>
                 <w:rStyle w:val="Hyperlink"/>
@@ -1976,7 +1976,7 @@
               <w:rPr>
                 <w:noProof/>
               </w:rPr>
-              <w:instrText xml:space="preserve"> PAGEREF _Toc242925221 \h </w:instrText>
+              <w:instrText xml:space="preserve"> PAGEREF _Toc243004392 \h </w:instrText>
             </w:r>
             <w:r>
               <w:rPr>
@@ -2016,7 +2016,7 @@
               <w14:ligatures w14:val="standardContextual"/>
             </w:rPr>
           </w:pPr>
-          <w:hyperlink w:anchor="_Toc242925222" w:history="1">
+          <w:hyperlink w:anchor="_Toc243004393" w:history="1">
             <w:r>
               <w:rPr>
                 <w:rStyle w:val="Hyperlink"/>
@@ -2040,7 +2040,7 @@
               <w:rPr>
                 <w:noProof/>
               </w:rPr>
-              <w:instrText xml:space="preserve"> PAGEREF _Toc242925222 \h </w:instrText>
+              <w:instrText xml:space="preserve"> PAGEREF _Toc243004393 \h </w:instrText>
             </w:r>
             <w:r>
               <w:rPr>
@@ -2080,7 +2080,7 @@
               <w14:ligatures w14:val="standardContextual"/>
             </w:rPr>
           </w:pPr>
-          <w:hyperlink w:anchor="_Toc242925223" w:history="1">
+          <w:hyperlink w:anchor="_Toc243004394" w:history="1">
             <w:r>
               <w:rPr>
                 <w:rStyle w:val="Hyperlink"/>
@@ -2104,7 +2104,7 @@
               <w:rPr>
                 <w:noProof/>
               </w:rPr>
-              <w:instrText xml:space="preserve"> PAGEREF _Toc242925223 \h </w:instrText>
+              <w:instrText xml:space="preserve"> PAGEREF _Toc243004394 \h </w:instrText>
             </w:r>
             <w:r>
               <w:rPr>
@@ -2144,7 +2144,7 @@
               <w14:ligatures w14:val="standardContextual"/>
             </w:rPr>
           </w:pPr>
-          <w:hyperlink w:anchor="_Toc242925224" w:history="1">
+          <w:hyperlink w:anchor="_Toc243004395" w:history="1">
             <w:r>
               <w:rPr>
                 <w:rStyle w:val="Hyperlink"/>
@@ -2168,7 +2168,7 @@
               <w:rPr>
                 <w:noProof/>
               </w:rPr>
-              <w:instrText xml:space="preserve"> PAGEREF _Toc242925224 \h </w:instrText>
+              <w:instrText xml:space="preserve"> PAGEREF _Toc243004395 \h </w:instrText>
             </w:r>
             <w:r>
               <w:rPr>
@@ -2208,7 +2208,7 @@
               <w14:ligatures w14:val="standardContextual"/>
             </w:rPr>
           </w:pPr>
-          <w:hyperlink w:anchor="_Toc242925225" w:history="1">
+          <w:hyperlink w:anchor="_Toc243004396" w:history="1">
             <w:r>
               <w:rPr>
                 <w:rStyle w:val="Hyperlink"/>
@@ -2232,7 +2232,7 @@
               <w:rPr>
                 <w:noProof/>
               </w:rPr>
-              <w:instrText xml:space="preserve"> PAGEREF _Toc242925225 \h </w:instrText>
+              <w:instrText xml:space="preserve"> PAGEREF _Toc243004396 \h </w:instrText>
             </w:r>
             <w:r>
               <w:rPr>
@@ -2272,7 +2272,7 @@
               <w14:ligatures w14:val="standardContextual"/>
             </w:rPr>
           </w:pPr>
-          <w:hyperlink w:anchor="_Toc242925226" w:history="1">
+          <w:hyperlink w:anchor="_Toc243004397" w:history="1">
             <w:r>
               <w:rPr>
                 <w:rStyle w:val="Hyperlink"/>
@@ -2296,7 +2296,7 @@
               <w:rPr>
                 <w:noProof/>
               </w:rPr>
-              <w:instrText xml:space="preserve"> PAGEREF _Toc242925226 \h </w:instrText>
+              <w:instrText xml:space="preserve"> PAGEREF _Toc243004397 \h </w:instrText>
             </w:r>
             <w:r>
               <w:rPr>
@@ -2336,7 +2336,7 @@
               <w14:ligatures w14:val="standardContextual"/>
             </w:rPr>
           </w:pPr>
-          <w:hyperlink w:anchor="_Toc242925227" w:history="1">
+          <w:hyperlink w:anchor="_Toc243004398" w:history="1">
             <w:r>
               <w:rPr>
                 <w:rStyle w:val="Hyperlink"/>
@@ -2360,7 +2360,7 @@
               <w:rPr>
                 <w:noProof/>
               </w:rPr>
-              <w:instrText xml:space="preserve"> PAGEREF _Toc242925227 \h </w:instrText>
+              <w:instrText xml:space="preserve"> PAGEREF _Toc243004398 \h </w:instrText>
             </w:r>
             <w:r>
               <w:rPr>
@@ -2400,7 +2400,7 @@
               <w14:ligatures w14:val="standardContextual"/>
             </w:rPr>
           </w:pPr>
-          <w:hyperlink w:anchor="_Toc242925228" w:history="1">
+          <w:hyperlink w:anchor="_Toc243004399" w:history="1">
             <w:r>
               <w:rPr>
                 <w:rStyle w:val="Hyperlink"/>
@@ -2424,7 +2424,7 @@
               <w:rPr>
                 <w:noProof/>
               </w:rPr>
-              <w:instrText xml:space="preserve"> PAGEREF _Toc242925228 \h </w:instrText>
+              <w:instrText xml:space="preserve"> PAGEREF _Toc243004399 \h </w:instrText>
             </w:r>
             <w:r>
               <w:rPr>
@@ -2464,7 +2464,7 @@
               <w14:ligatures w14:val="standardContextual"/>
             </w:rPr>
           </w:pPr>
-          <w:hyperlink w:anchor="_Toc242925229" w:history="1">
+          <w:hyperlink w:anchor="_Toc243004400" w:history="1">
             <w:r>
               <w:rPr>
                 <w:rStyle w:val="Hyperlink"/>
@@ -2488,7 +2488,7 @@
               <w:rPr>
                 <w:noProof/>
               </w:rPr>
-              <w:instrText xml:space="preserve"> PAGEREF _Toc242925229 \h </w:instrText>
+              <w:instrText xml:space="preserve"> PAGEREF _Toc243004400 \h </w:instrText>
             </w:r>
             <w:r>
               <w:rPr>
@@ -2528,7 +2528,7 @@
               <w14:ligatures w14:val="standardContextual"/>
             </w:rPr>
           </w:pPr>
-          <w:hyperlink w:anchor="_Toc242925230" w:history="1">
+          <w:hyperlink w:anchor="_Toc243004401" w:history="1">
             <w:r>
               <w:rPr>
                 <w:rStyle w:val="Hyperlink"/>
@@ -2552,7 +2552,7 @@
               <w:rPr>
                 <w:noProof/>
               </w:rPr>
-              <w:instrText xml:space="preserve"> PAGEREF _Toc242925230 \h </w:instrText>
+              <w:instrText xml:space="preserve"> PAGEREF _Toc243004401 \h </w:instrText>
             </w:r>
             <w:r>
               <w:rPr>
@@ -2592,7 +2592,7 @@
               <w14:ligatures w14:val="standardContextual"/>
             </w:rPr>
           </w:pPr>
-          <w:hyperlink w:anchor="_Toc242925231" w:history="1">
+          <w:hyperlink w:anchor="_Toc243004402" w:history="1">
             <w:r>
               <w:rPr>
                 <w:rStyle w:val="Hyperlink"/>
@@ -2616,7 +2616,7 @@
               <w:rPr>
                 <w:noProof/>
               </w:rPr>
-              <w:instrText xml:space="preserve"> PAGEREF _Toc242925231 \h </w:instrText>
+              <w:instrText xml:space="preserve"> PAGEREF _Toc243004402 \h </w:instrText>
             </w:r>
             <w:r>
               <w:rPr>
@@ -2656,7 +2656,7 @@
               <w14:ligatures w14:val="standardContextual"/>
             </w:rPr>
           </w:pPr>
-          <w:hyperlink w:anchor="_Toc242925232" w:history="1">
+          <w:hyperlink w:anchor="_Toc243004403" w:history="1">
             <w:r>
               <w:rPr>
                 <w:rStyle w:val="Hyperlink"/>
@@ -2680,7 +2680,7 @@
               <w:rPr>
                 <w:noProof/>
               </w:rPr>
-              <w:instrText xml:space="preserve"> PAGEREF _Toc242925232 \h </w:instrText>
+              <w:instrText xml:space="preserve"> PAGEREF _Toc243004403 \h </w:instrText>
             </w:r>
             <w:r>
               <w:rPr>
@@ -2720,7 +2720,7 @@
               <w14:ligatures w14:val="standardContextual"/>
             </w:rPr>
           </w:pPr>
-          <w:hyperlink w:anchor="_Toc242925233" w:history="1">
+          <w:hyperlink w:anchor="_Toc243004404" w:history="1">
             <w:r>
               <w:rPr>
                 <w:rStyle w:val="Hyperlink"/>
@@ -2744,7 +2744,7 @@
               <w:rPr>
                 <w:noProof/>
               </w:rPr>
-              <w:instrText xml:space="preserve"> PAGEREF _Toc242925233 \h </w:instrText>
+              <w:instrText xml:space="preserve"> PAGEREF _Toc243004404 \h </w:instrText>
             </w:r>
             <w:r>
               <w:rPr>
@@ -2784,7 +2784,7 @@
               <w14:ligatures w14:val="standardContextual"/>
             </w:rPr>
           </w:pPr>
-          <w:hyperlink w:anchor="_Toc242925234" w:history="1">
+          <w:hyperlink w:anchor="_Toc243004405" w:history="1">
             <w:r>
               <w:rPr>
                 <w:rStyle w:val="Hyperlink"/>
@@ -2808,7 +2808,7 @@
               <w:rPr>
                 <w:noProof/>
               </w:rPr>
-              <w:instrText xml:space="preserve"> PAGEREF _Toc242925234 \h </w:instrText>
+              <w:instrText xml:space="preserve"> PAGEREF _Toc243004405 \h </w:instrText>
             </w:r>
             <w:r>
               <w:rPr>
@@ -2848,7 +2848,7 @@
               <w14:ligatures w14:val="standardContextual"/>
             </w:rPr>
           </w:pPr>
-          <w:hyperlink w:anchor="_Toc242925235" w:history="1">
+          <w:hyperlink w:anchor="_Toc243004406" w:history="1">
             <w:r>
               <w:rPr>
                 <w:rStyle w:val="Hyperlink"/>
@@ -2872,7 +2872,7 @@
               <w:rPr>
                 <w:noProof/>
               </w:rPr>
-              <w:instrText xml:space="preserve"> PAGEREF _Toc242925235 \h </w:instrText>
+              <w:instrText xml:space="preserve"> PAGEREF _Toc243004406 \h </w:instrText>
             </w:r>
             <w:r>
               <w:rPr>
@@ -2912,7 +2912,7 @@
               <w14:ligatures w14:val="standardContextual"/>
             </w:rPr>
           </w:pPr>
-          <w:hyperlink w:anchor="_Toc242925236" w:history="1">
+          <w:hyperlink w:anchor="_Toc243004407" w:history="1">
             <w:r>
               <w:rPr>
                 <w:rStyle w:val="Hyperlink"/>
@@ -2936,7 +2936,7 @@
               <w:rPr>
                 <w:noProof/>
               </w:rPr>
-              <w:instrText xml:space="preserve"> PAGEREF _Toc242925236 \h </w:instrText>
+              <w:instrText xml:space="preserve"> PAGEREF _Toc243004407 \h </w:instrText>
             </w:r>
             <w:r>
               <w:rPr>
@@ -2976,7 +2976,7 @@
               <w14:ligatures w14:val="standardContextual"/>
             </w:rPr>
           </w:pPr>
-          <w:hyperlink w:anchor="_Toc242925237" w:history="1">
+          <w:hyperlink w:anchor="_Toc243004408" w:history="1">
             <w:r>
               <w:rPr>
                 <w:rStyle w:val="Hyperlink"/>
@@ -3000,7 +3000,7 @@
               <w:rPr>
                 <w:noProof/>
               </w:rPr>
-              <w:instrText xml:space="preserve"> PAGEREF _Toc242925237 \h </w:instrText>
+              <w:instrText xml:space="preserve"> PAGEREF _Toc243004408 \h </w:instrText>
             </w:r>
             <w:r>
               <w:rPr>
@@ -3040,7 +3040,7 @@
               <w14:ligatures w14:val="standardContextual"/>
             </w:rPr>
           </w:pPr>
-          <w:hyperlink w:anchor="_Toc242925238" w:history="1">
+          <w:hyperlink w:anchor="_Toc243004409" w:history="1">
             <w:r>
               <w:rPr>
                 <w:rStyle w:val="Hyperlink"/>
@@ -3064,7 +3064,7 @@
               <w:rPr>
                 <w:noProof/>
               </w:rPr>
-              <w:instrText xml:space="preserve"> PAGEREF _Toc242925238 \h </w:instrText>
+              <w:instrText xml:space="preserve"> PAGEREF _Toc243004409 \h </w:instrText>
             </w:r>
             <w:r>
               <w:rPr>
@@ -3104,7 +3104,7 @@
               <w14:ligatures w14:val="standardContextual"/>
             </w:rPr>
           </w:pPr>
-          <w:hyperlink w:anchor="_Toc242925239" w:history="1">
+          <w:hyperlink w:anchor="_Toc243004410" w:history="1">
             <w:r>
               <w:rPr>
                 <w:rStyle w:val="Hyperlink"/>
@@ -3128,7 +3128,7 @@
               <w:rPr>
                 <w:noProof/>
               </w:rPr>
-              <w:instrText xml:space="preserve"> PAGEREF _Toc242925239 \h </w:instrText>
+              <w:instrText xml:space="preserve"> PAGEREF _Toc243004410 \h </w:instrText>
             </w:r>
             <w:r>
               <w:rPr>
@@ -3168,7 +3168,7 @@
               <w14:ligatures w14:val="standardContextual"/>
             </w:rPr>
           </w:pPr>
-          <w:hyperlink w:anchor="_Toc242925240" w:history="1">
+          <w:hyperlink w:anchor="_Toc243004411" w:history="1">
             <w:r>
               <w:rPr>
                 <w:rStyle w:val="Hyperlink"/>
@@ -3192,7 +3192,7 @@
               <w:rPr>
                 <w:noProof/>
               </w:rPr>
-              <w:instrText xml:space="preserve"> PAGEREF _Toc242925240 \h </w:instrText>
+              <w:instrText xml:space="preserve"> PAGEREF _Toc243004411 \h </w:instrText>
             </w:r>
             <w:r>
               <w:rPr>
@@ -3232,7 +3232,7 @@
               <w14:ligatures w14:val="standardContextual"/>
             </w:rPr>
           </w:pPr>
-          <w:hyperlink w:anchor="_Toc242925241" w:history="1">
+          <w:hyperlink w:anchor="_Toc243004412" w:history="1">
             <w:r>
               <w:rPr>
                 <w:rStyle w:val="Hyperlink"/>
@@ -3256,7 +3256,7 @@
               <w:rPr>
                 <w:noProof/>
               </w:rPr>
-              <w:instrText xml:space="preserve"> PAGEREF _Toc242925241 \h </w:instrText>
+              <w:instrText xml:space="preserve"> PAGEREF _Toc243004412 \h </w:instrText>
             </w:r>
             <w:r>
               <w:rPr>
@@ -3296,7 +3296,7 @@
               <w14:ligatures w14:val="standardContextual"/>
             </w:rPr>
           </w:pPr>
-          <w:hyperlink w:anchor="_Toc242925242" w:history="1">
+          <w:hyperlink w:anchor="_Toc243004413" w:history="1">
             <w:r>
               <w:rPr>
                 <w:rStyle w:val="Hyperlink"/>
@@ -3320,7 +3320,7 @@
               <w:rPr>
                 <w:noProof/>
               </w:rPr>
-              <w:instrText xml:space="preserve"> PAGEREF _Toc242925242 \h </w:instrText>
+              <w:instrText xml:space="preserve"> PAGEREF _Toc243004413 \h </w:instrText>
             </w:r>
             <w:r>
               <w:rPr>
@@ -3360,7 +3360,7 @@
               <w14:ligatures w14:val="standardContextual"/>
             </w:rPr>
           </w:pPr>
-          <w:hyperlink w:anchor="_Toc242925243" w:history="1">
+          <w:hyperlink w:anchor="_Toc243004414" w:history="1">
             <w:r>
               <w:rPr>
                 <w:rStyle w:val="Hyperlink"/>
@@ -3384,7 +3384,7 @@
               <w:rPr>
                 <w:noProof/>
               </w:rPr>
-              <w:instrText xml:space="preserve"> PAGEREF _Toc242925243 \h </w:instrText>
+              <w:instrText xml:space="preserve"> PAGEREF _Toc243004414 \h </w:instrText>
             </w:r>
             <w:r>
               <w:rPr>
@@ -3424,7 +3424,7 @@
               <w14:ligatures w14:val="standardContextual"/>
             </w:rPr>
           </w:pPr>
-          <w:hyperlink w:anchor="_Toc242925244" w:history="1">
+          <w:hyperlink w:anchor="_Toc243004415" w:history="1">
             <w:r>
               <w:rPr>
                 <w:rStyle w:val="Hyperlink"/>
@@ -3448,7 +3448,7 @@
               <w:rPr>
                 <w:noProof/>
               </w:rPr>
-              <w:instrText xml:space="preserve"> PAGEREF _Toc242925244 \h </w:instrText>
+              <w:instrText xml:space="preserve"> PAGEREF _Toc243004415 \h </w:instrText>
             </w:r>
             <w:r>
               <w:rPr>
@@ -3488,7 +3488,7 @@
               <w14:ligatures w14:val="standardContextual"/>
             </w:rPr>
           </w:pPr>
-          <w:hyperlink w:anchor="_Toc242925245" w:history="1">
+          <w:hyperlink w:anchor="_Toc243004416" w:history="1">
             <w:r>
               <w:rPr>
                 <w:rStyle w:val="Hyperlink"/>
@@ -3512,7 +3512,7 @@
               <w:rPr>
                 <w:noProof/>
               </w:rPr>
-              <w:instrText xml:space="preserve"> PAGEREF _Toc242925245 \h </w:instrText>
+              <w:instrText xml:space="preserve"> PAGEREF _Toc243004416 \h </w:instrText>
             </w:r>
             <w:r>
               <w:rPr>
@@ -3552,7 +3552,7 @@
               <w14:ligatures w14:val="standardContextual"/>
             </w:rPr>
           </w:pPr>
-          <w:hyperlink w:anchor="_Toc242925246" w:history="1">
+          <w:hyperlink w:anchor="_Toc243004417" w:history="1">
             <w:r>
               <w:rPr>
                 <w:rStyle w:val="Hyperlink"/>
@@ -3576,7 +3576,7 @@
               <w:rPr>
                 <w:noProof/>
               </w:rPr>
-              <w:instrText xml:space="preserve"> PAGEREF _Toc242925246 \h </w:instrText>
+              <w:instrText xml:space="preserve"> PAGEREF _Toc243004417 \h </w:instrText>
             </w:r>
             <w:r>
               <w:rPr>
@@ -3616,7 +3616,7 @@
               <w14:ligatures w14:val="standardContextual"/>
             </w:rPr>
           </w:pPr>
-          <w:hyperlink w:anchor="_Toc242925247" w:history="1">
+          <w:hyperlink w:anchor="_Toc243004418" w:history="1">
             <w:r>
               <w:rPr>
                 <w:rStyle w:val="Hyperlink"/>
@@ -3640,7 +3640,7 @@
               <w:rPr>
                 <w:noProof/>
               </w:rPr>
-              <w:instrText xml:space="preserve"> PAGEREF _Toc242925247 \h </w:instrText>
+              <w:instrText xml:space="preserve"> PAGEREF _Toc243004418 \h </w:instrText>
             </w:r>
             <w:r>
               <w:rPr>
@@ -3680,7 +3680,7 @@
               <w14:ligatures w14:val="standardContextual"/>
             </w:rPr>
           </w:pPr>
-          <w:hyperlink w:anchor="_Toc242925248" w:history="1">
+          <w:hyperlink w:anchor="_Toc243004419" w:history="1">
             <w:r>
               <w:rPr>
                 <w:rStyle w:val="Hyperlink"/>
@@ -3704,7 +3704,7 @@
               <w:rPr>
                 <w:noProof/>
               </w:rPr>
-              <w:instrText xml:space="preserve"> PAGEREF _Toc242925248 \h </w:instrText>
+              <w:instrText xml:space="preserve"> PAGEREF _Toc243004419 \h </w:instrText>
             </w:r>
             <w:r>
               <w:rPr>
@@ -3744,7 +3744,7 @@
               <w14:ligatures w14:val="standardContextual"/>
             </w:rPr>
           </w:pPr>
-          <w:hyperlink w:anchor="_Toc242925249" w:history="1">
+          <w:hyperlink w:anchor="_Toc243004420" w:history="1">
             <w:r>
               <w:rPr>
                 <w:rStyle w:val="Hyperlink"/>
@@ -3768,7 +3768,7 @@
               <w:rPr>
                 <w:noProof/>
               </w:rPr>
-              <w:instrText xml:space="preserve"> PAGEREF _Toc242925249 \h </w:instrText>
+              <w:instrText xml:space="preserve"> PAGEREF _Toc243004420 \h </w:instrText>
             </w:r>
             <w:r>
               <w:rPr>
@@ -3808,7 +3808,7 @@
               <w14:ligatures w14:val="standardContextual"/>
             </w:rPr>
           </w:pPr>
-          <w:hyperlink w:anchor="_Toc242925250" w:history="1">
+          <w:hyperlink w:anchor="_Toc243004421" w:history="1">
             <w:r>
               <w:rPr>
                 <w:rStyle w:val="Hyperlink"/>
@@ -3832,7 +3832,7 @@
               <w:rPr>
                 <w:noProof/>
               </w:rPr>
-              <w:instrText xml:space="preserve"> PAGEREF _Toc242925250 \h </w:instrText>
+              <w:instrText xml:space="preserve"> PAGEREF _Toc243004421 \h </w:instrText>
             </w:r>
             <w:r>
               <w:rPr>
@@ -3872,7 +3872,7 @@
               <w14:ligatures w14:val="standardContextual"/>
             </w:rPr>
           </w:pPr>
-          <w:hyperlink w:anchor="_Toc242925251" w:history="1">
+          <w:hyperlink w:anchor="_Toc243004422" w:history="1">
             <w:r>
               <w:rPr>
                 <w:rStyle w:val="Hyperlink"/>
@@ -3896,7 +3896,7 @@
               <w:rPr>
                 <w:noProof/>
               </w:rPr>
-              <w:instrText xml:space="preserve"> PAGEREF _Toc242925251 \h </w:instrText>
+              <w:instrText xml:space="preserve"> PAGEREF _Toc243004422 \h </w:instrText>
             </w:r>
             <w:r>
               <w:rPr>
@@ -3936,7 +3936,7 @@
               <w14:ligatures w14:val="standardContextual"/>
             </w:rPr>
           </w:pPr>
-          <w:hyperlink w:anchor="_Toc242925252" w:history="1">
+          <w:hyperlink w:anchor="_Toc243004423" w:history="1">
             <w:r>
               <w:rPr>
                 <w:rStyle w:val="Hyperlink"/>
@@ -3960,7 +3960,7 @@
               <w:rPr>
                 <w:noProof/>
               </w:rPr>
-              <w:instrText xml:space="preserve"> PAGEREF _Toc242925252 \h </w:instrText>
+              <w:instrText xml:space="preserve"> PAGEREF _Toc243004423 \h </w:instrText>
             </w:r>
             <w:r>
               <w:rPr>
@@ -4000,7 +4000,7 @@
               <w14:ligatures w14:val="standardContextual"/>
             </w:rPr>
           </w:pPr>
-          <w:hyperlink w:anchor="_Toc242925253" w:history="1">
+          <w:hyperlink w:anchor="_Toc243004424" w:history="1">
             <w:r>
               <w:rPr>
                 <w:rStyle w:val="Hyperlink"/>
@@ -4024,7 +4024,7 @@
               <w:rPr>
                 <w:noProof/>
               </w:rPr>
-              <w:instrText xml:space="preserve"> PAGEREF _Toc242925253 \h </w:instrText>
+              <w:instrText xml:space="preserve"> PAGEREF _Toc243004424 \h </w:instrText>
             </w:r>
             <w:r>
               <w:rPr>
@@ -4064,7 +4064,7 @@
               <w14:ligatures w14:val="standardContextual"/>
             </w:rPr>
           </w:pPr>
-          <w:hyperlink w:anchor="_Toc242925254" w:history="1">
+          <w:hyperlink w:anchor="_Toc243004425" w:history="1">
             <w:r>
               <w:rPr>
                 <w:rStyle w:val="Hyperlink"/>
@@ -4088,7 +4088,7 @@
               <w:rPr>
                 <w:noProof/>
               </w:rPr>
-              <w:instrText xml:space="preserve"> PAGEREF _Toc242925254 \h </w:instrText>
+              <w:instrText xml:space="preserve"> PAGEREF _Toc243004425 \h </w:instrText>
             </w:r>
             <w:r>
               <w:rPr>
@@ -4128,7 +4128,7 @@
               <w14:ligatures w14:val="standardContextual"/>
             </w:rPr>
           </w:pPr>
-          <w:hyperlink w:anchor="_Toc242925255" w:history="1">
+          <w:hyperlink w:anchor="_Toc243004426" w:history="1">
             <w:r>
               <w:rPr>
                 <w:rStyle w:val="Hyperlink"/>
@@ -4152,7 +4152,7 @@
               <w:rPr>
                 <w:noProof/>
               </w:rPr>
-              <w:instrText xml:space="preserve"> PAGEREF _Toc242925255 \h </w:instrText>
+              <w:instrText xml:space="preserve"> PAGEREF _Toc243004426 \h </w:instrText>
             </w:r>
             <w:r>
               <w:rPr>
@@ -4192,7 +4192,7 @@
               <w14:ligatures w14:val="standardContextual"/>
             </w:rPr>
           </w:pPr>
-          <w:hyperlink w:anchor="_Toc242925256" w:history="1">
+          <w:hyperlink w:anchor="_Toc243004427" w:history="1">
             <w:r>
               <w:rPr>
                 <w:rStyle w:val="Hyperlink"/>
@@ -4216,7 +4216,7 @@
               <w:rPr>
                 <w:noProof/>
               </w:rPr>
-              <w:instrText xml:space="preserve"> PAGEREF _Toc242925256 \h </w:instrText>
+              <w:instrText xml:space="preserve"> PAGEREF _Toc243004427 \h </w:instrText>
             </w:r>
             <w:r>
               <w:rPr>
@@ -4256,7 +4256,7 @@
               <w14:ligatures w14:val="standardContextual"/>
             </w:rPr>
           </w:pPr>
-          <w:hyperlink w:anchor="_Toc242925257" w:history="1">
+          <w:hyperlink w:anchor="_Toc243004428" w:history="1">
             <w:r>
               <w:rPr>
                 <w:rStyle w:val="Hyperlink"/>
@@ -4280,7 +4280,7 @@
               <w:rPr>
                 <w:noProof/>
               </w:rPr>
-              <w:instrText xml:space="preserve"> PAGEREF _Toc242925257 \h </w:instrText>
+              <w:instrText xml:space="preserve"> PAGEREF _Toc243004428 \h </w:instrText>
             </w:r>
             <w:r>
               <w:rPr>
@@ -4320,7 +4320,7 @@
               <w14:ligatures w14:val="standardContextual"/>
             </w:rPr>
           </w:pPr>
-          <w:hyperlink w:anchor="_Toc242925258" w:history="1">
+          <w:hyperlink w:anchor="_Toc243004429" w:history="1">
             <w:r>
               <w:rPr>
                 <w:rStyle w:val="Hyperlink"/>
@@ -4344,7 +4344,7 @@
               <w:rPr>
                 <w:noProof/>
               </w:rPr>
-              <w:instrText xml:space="preserve"> PAGEREF _Toc242925258 \h </w:instrText>
+              <w:instrText xml:space="preserve"> PAGEREF _Toc243004429 \h </w:instrText>
             </w:r>
             <w:r>
               <w:rPr>
@@ -4384,7 +4384,7 @@
               <w14:ligatures w14:val="standardContextual"/>
             </w:rPr>
           </w:pPr>
-          <w:hyperlink w:anchor="_Toc242925259" w:history="1">
+          <w:hyperlink w:anchor="_Toc243004430" w:history="1">
             <w:r>
               <w:rPr>
                 <w:rStyle w:val="Hyperlink"/>
@@ -4408,7 +4408,7 @@
               <w:rPr>
                 <w:noProof/>
               </w:rPr>
-              <w:instrText xml:space="preserve"> PAGEREF _Toc242925259 \h </w:instrText>
+              <w:instrText xml:space="preserve"> PAGEREF _Toc243004430 \h </w:instrText>
             </w:r>
             <w:r>
               <w:rPr>
@@ -4448,7 +4448,7 @@
               <w14:ligatures w14:val="standardContextual"/>
             </w:rPr>
           </w:pPr>
-          <w:hyperlink w:anchor="_Toc242925260" w:history="1">
+          <w:hyperlink w:anchor="_Toc243004431" w:history="1">
             <w:r>
               <w:rPr>
                 <w:rStyle w:val="Hyperlink"/>
@@ -4472,7 +4472,7 @@
               <w:rPr>
                 <w:noProof/>
               </w:rPr>
-              <w:instrText xml:space="preserve"> PAGEREF _Toc242925260 \h </w:instrText>
+              <w:instrText xml:space="preserve"> PAGEREF _Toc243004431 \h </w:instrText>
             </w:r>
             <w:r>
               <w:rPr>
@@ -4512,7 +4512,7 @@
               <w14:ligatures w14:val="standardContextual"/>
             </w:rPr>
           </w:pPr>
-          <w:hyperlink w:anchor="_Toc242925261" w:history="1">
+          <w:hyperlink w:anchor="_Toc243004432" w:history="1">
             <w:r>
               <w:rPr>
                 <w:rStyle w:val="Hyperlink"/>
@@ -4536,7 +4536,7 @@
               <w:rPr>
                 <w:noProof/>
               </w:rPr>
-              <w:instrText xml:space="preserve"> PAGEREF _Toc242925261 \h </w:instrText>
+              <w:instrText xml:space="preserve"> PAGEREF _Toc243004432 \h </w:instrText>
             </w:r>
             <w:r>
               <w:rPr>
@@ -4576,7 +4576,7 @@
               <w14:ligatures w14:val="standardContextual"/>
             </w:rPr>
           </w:pPr>
-          <w:hyperlink w:anchor="_Toc242925262" w:history="1">
+          <w:hyperlink w:anchor="_Toc243004433" w:history="1">
             <w:r>
               <w:rPr>
                 <w:rStyle w:val="Hyperlink"/>
@@ -4600,7 +4600,7 @@
               <w:rPr>
                 <w:noProof/>
               </w:rPr>
-              <w:instrText xml:space="preserve"> PAGEREF _Toc242925262 \h </w:instrText>
+              <w:instrText xml:space="preserve"> PAGEREF _Toc243004433 \h </w:instrText>
             </w:r>
             <w:r>
               <w:rPr>
@@ -4640,7 +4640,7 @@
               <w14:ligatures w14:val="standardContextual"/>
             </w:rPr>
           </w:pPr>
-          <w:hyperlink w:anchor="_Toc242925263" w:history="1">
+          <w:hyperlink w:anchor="_Toc243004434" w:history="1">
             <w:r>
               <w:rPr>
                 <w:rStyle w:val="Hyperlink"/>
@@ -4664,7 +4664,7 @@
               <w:rPr>
                 <w:noProof/>
               </w:rPr>
-              <w:instrText xml:space="preserve"> PAGEREF _Toc242925263 \h </w:instrText>
+              <w:instrText xml:space="preserve"> PAGEREF _Toc243004434 \h </w:instrText>
             </w:r>
             <w:r>
               <w:rPr>
@@ -4704,7 +4704,7 @@
               <w14:ligatures w14:val="standardContextual"/>
             </w:rPr>
           </w:pPr>
-          <w:hyperlink w:anchor="_Toc242925264" w:history="1">
+          <w:hyperlink w:anchor="_Toc243004435" w:history="1">
             <w:r>
               <w:rPr>
                 <w:rStyle w:val="Hyperlink"/>
@@ -4728,7 +4728,7 @@
               <w:rPr>
                 <w:noProof/>
               </w:rPr>
-              <w:instrText xml:space="preserve"> PAGEREF _Toc242925264 \h </w:instrText>
+              <w:instrText xml:space="preserve"> PAGEREF _Toc243004435 \h </w:instrText>
             </w:r>
             <w:r>
               <w:rPr>
@@ -4768,7 +4768,7 @@
               <w14:ligatures w14:val="standardContextual"/>
             </w:rPr>
           </w:pPr>
-          <w:hyperlink w:anchor="_Toc242925265" w:history="1">
+          <w:hyperlink w:anchor="_Toc243004436" w:history="1">
             <w:r>
               <w:rPr>
                 <w:rStyle w:val="Hyperlink"/>
@@ -4792,7 +4792,7 @@
               <w:rPr>
                 <w:noProof/>
               </w:rPr>
-              <w:instrText xml:space="preserve"> PAGEREF _Toc242925265 \h </w:instrText>
+              <w:instrText xml:space="preserve"> PAGEREF _Toc243004436 \h </w:instrText>
             </w:r>
             <w:r>
               <w:rPr>
@@ -4832,7 +4832,7 @@
               <w14:ligatures w14:val="standardContextual"/>
             </w:rPr>
           </w:pPr>
-          <w:hyperlink w:anchor="_Toc242925266" w:history="1">
+          <w:hyperlink w:anchor="_Toc243004437" w:history="1">
             <w:r>
               <w:rPr>
                 <w:rStyle w:val="Hyperlink"/>
@@ -4856,7 +4856,7 @@
               <w:rPr>
                 <w:noProof/>
               </w:rPr>
-              <w:instrText xml:space="preserve"> PAGEREF _Toc242925266 \h </w:instrText>
+              <w:instrText xml:space="preserve"> PAGEREF _Toc243004437 \h </w:instrText>
             </w:r>
             <w:r>
               <w:rPr>
@@ -4896,7 +4896,7 @@
               <w14:ligatures w14:val="standardContextual"/>
             </w:rPr>
           </w:pPr>
-          <w:hyperlink w:anchor="_Toc242925267" w:history="1">
+          <w:hyperlink w:anchor="_Toc243004438" w:history="1">
             <w:r>
               <w:rPr>
                 <w:rStyle w:val="Hyperlink"/>
@@ -4920,7 +4920,7 @@
               <w:rPr>
                 <w:noProof/>
               </w:rPr>
-              <w:instrText xml:space="preserve"> PAGEREF _Toc242925267 \h </w:instrText>
+              <w:instrText xml:space="preserve"> PAGEREF _Toc243004438 \h </w:instrText>
             </w:r>
             <w:r>
               <w:rPr>
@@ -4960,7 +4960,7 @@
               <w14:ligatures w14:val="standardContextual"/>
             </w:rPr>
           </w:pPr>
-          <w:hyperlink w:anchor="_Toc242925268" w:history="1">
+          <w:hyperlink w:anchor="_Toc243004439" w:history="1">
             <w:r>
               <w:rPr>
                 <w:rStyle w:val="Hyperlink"/>
@@ -4984,7 +4984,7 @@
               <w:rPr>
                 <w:noProof/>
               </w:rPr>
-              <w:instrText xml:space="preserve"> PAGEREF _Toc242925268 \h </w:instrText>
+              <w:instrText xml:space="preserve"> PAGEREF _Toc243004439 \h </w:instrText>
             </w:r>
             <w:r>
               <w:rPr>
@@ -5024,7 +5024,7 @@
               <w14:ligatures w14:val="standardContextual"/>
             </w:rPr>
           </w:pPr>
-          <w:hyperlink w:anchor="_Toc242925269" w:history="1">
+          <w:hyperlink w:anchor="_Toc243004440" w:history="1">
             <w:r>
               <w:rPr>
                 <w:rStyle w:val="Hyperlink"/>
@@ -5048,7 +5048,7 @@
               <w:rPr>
                 <w:noProof/>
               </w:rPr>
-              <w:instrText xml:space="preserve"> PAGEREF _Toc242925269 \h </w:instrText>
+              <w:instrText xml:space="preserve"> PAGEREF _Toc243004440 \h </w:instrText>
             </w:r>
             <w:r>
               <w:rPr>
@@ -5088,7 +5088,7 @@
               <w14:ligatures w14:val="standardContextual"/>
             </w:rPr>
           </w:pPr>
-          <w:hyperlink w:anchor="_Toc242925270" w:history="1">
+          <w:hyperlink w:anchor="_Toc243004441" w:history="1">
             <w:r>
               <w:rPr>
                 <w:rStyle w:val="Hyperlink"/>
@@ -5112,7 +5112,7 @@
               <w:rPr>
                 <w:noProof/>
               </w:rPr>
-              <w:instrText xml:space="preserve"> PAGEREF _Toc242925270 \h </w:instrText>
+              <w:instrText xml:space="preserve"> PAGEREF _Toc243004441 \h </w:instrText>
             </w:r>
             <w:r>
               <w:rPr>
@@ -5152,7 +5152,7 @@
               <w14:ligatures w14:val="standardContextual"/>
             </w:rPr>
           </w:pPr>
-          <w:hyperlink w:anchor="_Toc242925271" w:history="1">
+          <w:hyperlink w:anchor="_Toc243004442" w:history="1">
             <w:r>
               <w:rPr>
                 <w:rStyle w:val="Hyperlink"/>
@@ -5176,7 +5176,7 @@
               <w:rPr>
                 <w:noProof/>
               </w:rPr>
-              <w:instrText xml:space="preserve"> PAGEREF _Toc242925271 \h </w:instrText>
+              <w:instrText xml:space="preserve"> PAGEREF _Toc243004442 \h </w:instrText>
             </w:r>
             <w:r>
               <w:rPr>
@@ -5216,7 +5216,7 @@
               <w14:ligatures w14:val="standardContextual"/>
             </w:rPr>
           </w:pPr>
-          <w:hyperlink w:anchor="_Toc242925272" w:history="1">
+          <w:hyperlink w:anchor="_Toc243004443" w:history="1">
             <w:r>
               <w:rPr>
                 <w:rStyle w:val="Hyperlink"/>
@@ -5240,7 +5240,7 @@
               <w:rPr>
                 <w:noProof/>
               </w:rPr>
-              <w:instrText xml:space="preserve"> PAGEREF _Toc242925272 \h </w:instrText>
+              <w:instrText xml:space="preserve"> PAGEREF _Toc243004443 \h </w:instrText>
             </w:r>
             <w:r>
               <w:rPr>
@@ -5280,7 +5280,7 @@
               <w14:ligatures w14:val="standardContextual"/>
             </w:rPr>
           </w:pPr>
-          <w:hyperlink w:anchor="_Toc242925273" w:history="1">
+          <w:hyperlink w:anchor="_Toc243004444" w:history="1">
             <w:r>
               <w:rPr>
                 <w:rStyle w:val="Hyperlink"/>
@@ -5304,7 +5304,7 @@
               <w:rPr>
                 <w:noProof/>
               </w:rPr>
-              <w:instrText xml:space="preserve"> PAGEREF _Toc242925273 \h </w:instrText>
+              <w:instrText xml:space="preserve"> PAGEREF _Toc243004444 \h </w:instrText>
             </w:r>
             <w:r>
               <w:rPr>
@@ -5344,7 +5344,7 @@
               <w14:ligatures w14:val="standardContextual"/>
             </w:rPr>
           </w:pPr>
-          <w:hyperlink w:anchor="_Toc242925274" w:history="1">
+          <w:hyperlink w:anchor="_Toc243004445" w:history="1">
             <w:r>
               <w:rPr>
                 <w:rStyle w:val="Hyperlink"/>
@@ -5368,7 +5368,7 @@
               <w:rPr>
                 <w:noProof/>
               </w:rPr>
-              <w:instrText xml:space="preserve"> PAGEREF _Toc242925274 \h </w:instrText>
+              <w:instrText xml:space="preserve"> PAGEREF _Toc243004445 \h </w:instrText>
             </w:r>
             <w:r>
               <w:rPr>
@@ -5408,7 +5408,7 @@
               <w14:ligatures w14:val="standardContextual"/>
             </w:rPr>
           </w:pPr>
-          <w:hyperlink w:anchor="_Toc242925275" w:history="1">
+          <w:hyperlink w:anchor="_Toc243004446" w:history="1">
             <w:r>
               <w:rPr>
                 <w:rStyle w:val="Hyperlink"/>
@@ -5432,7 +5432,7 @@
               <w:rPr>
                 <w:noProof/>
               </w:rPr>
-              <w:instrText xml:space="preserve"> PAGEREF _Toc242925275 \h </w:instrText>
+              <w:instrText xml:space="preserve"> PAGEREF _Toc243004446 \h </w:instrText>
             </w:r>
             <w:r>
               <w:rPr>
@@ -5472,7 +5472,7 @@
               <w14:ligatures w14:val="standardContextual"/>
             </w:rPr>
           </w:pPr>
-          <w:hyperlink w:anchor="_Toc242925276" w:history="1">
+          <w:hyperlink w:anchor="_Toc243004447" w:history="1">
             <w:r>
               <w:rPr>
                 <w:rStyle w:val="Hyperlink"/>
@@ -5496,7 +5496,7 @@
               <w:rPr>
                 <w:noProof/>
               </w:rPr>
-              <w:instrText xml:space="preserve"> PAGEREF _Toc242925276 \h </w:instrText>
+              <w:instrText xml:space="preserve"> PAGEREF _Toc243004447 \h </w:instrText>
             </w:r>
             <w:r>
               <w:rPr>
@@ -5536,7 +5536,7 @@
               <w14:ligatures w14:val="standardContextual"/>
             </w:rPr>
           </w:pPr>
-          <w:hyperlink w:anchor="_Toc242925277" w:history="1">
+          <w:hyperlink w:anchor="_Toc243004448" w:history="1">
             <w:r>
               <w:rPr>
                 <w:rStyle w:val="Hyperlink"/>
@@ -5560,7 +5560,7 @@
               <w:rPr>
                 <w:noProof/>
               </w:rPr>
-              <w:instrText xml:space="preserve"> PAGEREF _Toc242925277 \h </w:instrText>
+              <w:instrText xml:space="preserve"> PAGEREF _Toc243004448 \h </w:instrText>
             </w:r>
             <w:r>
               <w:rPr>
@@ -5600,7 +5600,7 @@
               <w14:ligatures w14:val="standardContextual"/>
             </w:rPr>
           </w:pPr>
-          <w:hyperlink w:anchor="_Toc242925278" w:history="1">
+          <w:hyperlink w:anchor="_Toc243004449" w:history="1">
             <w:r>
               <w:rPr>
                 <w:rStyle w:val="Hyperlink"/>
@@ -5624,7 +5624,7 @@
               <w:rPr>
                 <w:noProof/>
               </w:rPr>
-              <w:instrText xml:space="preserve"> PAGEREF _Toc242925278 \h </w:instrText>
+              <w:instrText xml:space="preserve"> PAGEREF _Toc243004449 \h </w:instrText>
             </w:r>
             <w:r>
               <w:rPr>
@@ -5664,7 +5664,7 @@
               <w14:ligatures w14:val="standardContextual"/>
             </w:rPr>
           </w:pPr>
-          <w:hyperlink w:anchor="_Toc242925279" w:history="1">
+          <w:hyperlink w:anchor="_Toc243004450" w:history="1">
             <w:r>
               <w:rPr>
                 <w:rStyle w:val="Hyperlink"/>
@@ -5688,7 +5688,7 @@
               <w:rPr>
                 <w:noProof/>
               </w:rPr>
-              <w:instrText xml:space="preserve"> PAGEREF _Toc242925279 \h </w:instrText>
+              <w:instrText xml:space="preserve"> PAGEREF _Toc243004450 \h </w:instrText>
             </w:r>
             <w:r>
               <w:rPr>
@@ -5728,7 +5728,7 @@
               <w14:ligatures w14:val="standardContextual"/>
             </w:rPr>
           </w:pPr>
-          <w:hyperlink w:anchor="_Toc242925280" w:history="1">
+          <w:hyperlink w:anchor="_Toc243004451" w:history="1">
             <w:r>
               <w:rPr>
                 <w:rStyle w:val="Hyperlink"/>
@@ -5752,7 +5752,7 @@
               <w:rPr>
                 <w:noProof/>
               </w:rPr>
-              <w:instrText xml:space="preserve"> PAGEREF _Toc242925280 \h </w:instrText>
+              <w:instrText xml:space="preserve"> PAGEREF _Toc243004451 \h </w:instrText>
             </w:r>
             <w:r>
               <w:rPr>
@@ -5792,7 +5792,7 @@
               <w14:ligatures w14:val="standardContextual"/>
             </w:rPr>
           </w:pPr>
-          <w:hyperlink w:anchor="_Toc242925281" w:history="1">
+          <w:hyperlink w:anchor="_Toc243004452" w:history="1">
             <w:r>
               <w:rPr>
                 <w:rStyle w:val="Hyperlink"/>
@@ -5816,7 +5816,7 @@
               <w:rPr>
                 <w:noProof/>
               </w:rPr>
-              <w:instrText xml:space="preserve"> PAGEREF _Toc242925281 \h </w:instrText>
+              <w:instrText xml:space="preserve"> PAGEREF _Toc243004452 \h </w:instrText>
             </w:r>
             <w:r>
               <w:rPr>
@@ -5856,7 +5856,7 @@
               <w14:ligatures w14:val="standardContextual"/>
             </w:rPr>
           </w:pPr>
-          <w:hyperlink w:anchor="_Toc242925282" w:history="1">
+          <w:hyperlink w:anchor="_Toc243004453" w:history="1">
             <w:r>
               <w:rPr>
                 <w:rStyle w:val="Hyperlink"/>
@@ -5880,7 +5880,7 @@
               <w:rPr>
                 <w:noProof/>
               </w:rPr>
-              <w:instrText xml:space="preserve"> PAGEREF _Toc242925282 \h </w:instrText>
+              <w:instrText xml:space="preserve"> PAGEREF _Toc243004453 \h </w:instrText>
             </w:r>
             <w:r>
               <w:rPr>
@@ -5920,7 +5920,7 @@
               <w14:ligatures w14:val="standardContextual"/>
             </w:rPr>
           </w:pPr>
-          <w:hyperlink w:anchor="_Toc242925283" w:history="1">
+          <w:hyperlink w:anchor="_Toc243004454" w:history="1">
             <w:r>
               <w:rPr>
                 <w:rStyle w:val="Hyperlink"/>
@@ -5944,7 +5944,7 @@
               <w:rPr>
                 <w:noProof/>
               </w:rPr>
-              <w:instrText xml:space="preserve"> PAGEREF _Toc242925283 \h </w:instrText>
+              <w:instrText xml:space="preserve"> PAGEREF _Toc243004454 \h </w:instrText>
             </w:r>
             <w:r>
               <w:rPr>
@@ -5984,7 +5984,7 @@
               <w14:ligatures w14:val="standardContextual"/>
             </w:rPr>
           </w:pPr>
-          <w:hyperlink w:anchor="_Toc242925284" w:history="1">
+          <w:hyperlink w:anchor="_Toc243004455" w:history="1">
             <w:r>
               <w:rPr>
                 <w:rStyle w:val="Hyperlink"/>
@@ -6008,7 +6008,7 @@
               <w:rPr>
                 <w:noProof/>
               </w:rPr>
-              <w:instrText xml:space="preserve"> PAGEREF _Toc242925284 \h </w:instrText>
+              <w:instrText xml:space="preserve"> PAGEREF _Toc243004455 \h </w:instrText>
             </w:r>
             <w:r>
               <w:rPr>
@@ -6048,7 +6048,7 @@
               <w14:ligatures w14:val="standardContextual"/>
             </w:rPr>
           </w:pPr>
-          <w:hyperlink w:anchor="_Toc242925285" w:history="1">
+          <w:hyperlink w:anchor="_Toc243004456" w:history="1">
             <w:r>
               <w:rPr>
                 <w:rStyle w:val="Hyperlink"/>
@@ -6072,7 +6072,7 @@
               <w:rPr>
                 <w:noProof/>
               </w:rPr>
-              <w:instrText xml:space="preserve"> PAGEREF _Toc242925285 \h </w:instrText>
+              <w:instrText xml:space="preserve"> PAGEREF _Toc243004456 \h </w:instrText>
             </w:r>
             <w:r>
               <w:rPr>
@@ -6112,7 +6112,7 @@
               <w14:ligatures w14:val="standardContextual"/>
             </w:rPr>
           </w:pPr>
-          <w:hyperlink w:anchor="_Toc242925286" w:history="1">
+          <w:hyperlink w:anchor="_Toc243004457" w:history="1">
             <w:r>
               <w:rPr>
                 <w:rStyle w:val="Hyperlink"/>
@@ -6136,7 +6136,7 @@
               <w:rPr>
                 <w:noProof/>
               </w:rPr>
-              <w:instrText xml:space="preserve"> PAGEREF _Toc242925286 \h </w:instrText>
+              <w:instrText xml:space="preserve"> PAGEREF _Toc243004457 \h </w:instrText>
             </w:r>
             <w:r>
               <w:rPr>
@@ -6176,7 +6176,7 @@
               <w14:ligatures w14:val="standardContextual"/>
             </w:rPr>
           </w:pPr>
-          <w:hyperlink w:anchor="_Toc242925287" w:history="1">
+          <w:hyperlink w:anchor="_Toc243004458" w:history="1">
             <w:r>
               <w:rPr>
                 <w:rStyle w:val="Hyperlink"/>
@@ -6200,7 +6200,7 @@
               <w:rPr>
                 <w:noProof/>
               </w:rPr>
-              <w:instrText xml:space="preserve"> PAGEREF _Toc242925287 \h </w:instrText>
+              <w:instrText xml:space="preserve"> PAGEREF _Toc243004458 \h </w:instrText>
             </w:r>
             <w:r>
               <w:rPr>
@@ -6240,7 +6240,7 @@
               <w14:ligatures w14:val="standardContextual"/>
             </w:rPr>
           </w:pPr>
-          <w:hyperlink w:anchor="_Toc242925288" w:history="1">
+          <w:hyperlink w:anchor="_Toc243004459" w:history="1">
             <w:r>
               <w:rPr>
                 <w:rStyle w:val="Hyperlink"/>
@@ -6264,7 +6264,7 @@
               <w:rPr>
                 <w:noProof/>
               </w:rPr>
-              <w:instrText xml:space="preserve"> PAGEREF _Toc242925288 \h </w:instrText>
+              <w:instrText xml:space="preserve"> PAGEREF _Toc243004459 \h </w:instrText>
             </w:r>
             <w:r>
               <w:rPr>
@@ -6304,7 +6304,7 @@
               <w14:ligatures w14:val="standardContextual"/>
             </w:rPr>
           </w:pPr>
-          <w:hyperlink w:anchor="_Toc242925289" w:history="1">
+          <w:hyperlink w:anchor="_Toc243004460" w:history="1">
             <w:r>
               <w:rPr>
                 <w:rStyle w:val="Hyperlink"/>
@@ -6328,7 +6328,7 @@
               <w:rPr>
                 <w:noProof/>
               </w:rPr>
-              <w:instrText xml:space="preserve"> PAGEREF _Toc242925289 \h </w:instrText>
+              <w:instrText xml:space="preserve"> PAGEREF _Toc243004460 \h </w:instrText>
             </w:r>
             <w:r>
               <w:rPr>
@@ -6368,7 +6368,7 @@
               <w14:ligatures w14:val="standardContextual"/>
             </w:rPr>
           </w:pPr>
-          <w:hyperlink w:anchor="_Toc242925290" w:history="1">
+          <w:hyperlink w:anchor="_Toc243004461" w:history="1">
             <w:r>
               <w:rPr>
                 <w:rStyle w:val="Hyperlink"/>
@@ -6392,7 +6392,7 @@
               <w:rPr>
                 <w:noProof/>
               </w:rPr>
-              <w:instrText xml:space="preserve"> PAGEREF _Toc242925290 \h </w:instrText>
+              <w:instrText xml:space="preserve"> PAGEREF _Toc243004461 \h </w:instrText>
             </w:r>
             <w:r>
               <w:rPr>
@@ -6432,7 +6432,7 @@
               <w14:ligatures w14:val="standardContextual"/>
             </w:rPr>
           </w:pPr>
-          <w:hyperlink w:anchor="_Toc242925291" w:history="1">
+          <w:hyperlink w:anchor="_Toc243004462" w:history="1">
             <w:r>
               <w:rPr>
                 <w:rStyle w:val="Hyperlink"/>
@@ -6456,7 +6456,7 @@
               <w:rPr>
                 <w:noProof/>
               </w:rPr>
-              <w:instrText xml:space="preserve"> PAGEREF _Toc242925291 \h </w:instrText>
+              <w:instrText xml:space="preserve"> PAGEREF _Toc243004462 \h </w:instrText>
             </w:r>
             <w:r>
               <w:rPr>
@@ -6496,7 +6496,7 @@
               <w14:ligatures w14:val="standardContextual"/>
             </w:rPr>
           </w:pPr>
-          <w:hyperlink w:anchor="_Toc242925292" w:history="1">
+          <w:hyperlink w:anchor="_Toc243004463" w:history="1">
             <w:r>
               <w:rPr>
                 <w:rStyle w:val="Hyperlink"/>
@@ -6520,7 +6520,7 @@
               <w:rPr>
                 <w:noProof/>
               </w:rPr>
-              <w:instrText xml:space="preserve"> PAGEREF _Toc242925292 \h </w:instrText>
+              <w:instrText xml:space="preserve"> PAGEREF _Toc243004463 \h </w:instrText>
             </w:r>
             <w:r>
               <w:rPr>
@@ -6560,7 +6560,7 @@
               <w14:ligatures w14:val="standardContextual"/>
             </w:rPr>
           </w:pPr>
-          <w:hyperlink w:anchor="_Toc242925293" w:history="1">
+          <w:hyperlink w:anchor="_Toc243004464" w:history="1">
             <w:r>
               <w:rPr>
                 <w:rStyle w:val="Hyperlink"/>
@@ -6584,7 +6584,7 @@
               <w:rPr>
                 <w:noProof/>
               </w:rPr>
-              <w:instrText xml:space="preserve"> PAGEREF _Toc242925293 \h </w:instrText>
+              <w:instrText xml:space="preserve"> PAGEREF _Toc243004464 \h </w:instrText>
             </w:r>
             <w:r>
               <w:rPr>
@@ -6624,7 +6624,7 @@
               <w14:ligatures w14:val="standardContextual"/>
             </w:rPr>
           </w:pPr>
-          <w:hyperlink w:anchor="_Toc242925294" w:history="1">
+          <w:hyperlink w:anchor="_Toc243004465" w:history="1">
             <w:r>
               <w:rPr>
                 <w:rStyle w:val="Hyperlink"/>
@@ -6648,7 +6648,7 @@
               <w:rPr>
                 <w:noProof/>
               </w:rPr>
-              <w:instrText xml:space="preserve"> PAGEREF _Toc242925294 \h </w:instrText>
+              <w:instrText xml:space="preserve"> PAGEREF _Toc243004465 \h </w:instrText>
             </w:r>
             <w:r>
               <w:rPr>
@@ -6688,7 +6688,7 @@
               <w14:ligatures w14:val="standardContextual"/>
             </w:rPr>
           </w:pPr>
-          <w:hyperlink w:anchor="_Toc242925295" w:history="1">
+          <w:hyperlink w:anchor="_Toc243004466" w:history="1">
             <w:r>
               <w:rPr>
                 <w:rStyle w:val="Hyperlink"/>
@@ -6712,7 +6712,7 @@
               <w:rPr>
                 <w:noProof/>
               </w:rPr>
-              <w:instrText xml:space="preserve"> PAGEREF _Toc242925295 \h </w:instrText>
+              <w:instrText xml:space="preserve"> PAGEREF _Toc243004466 \h </w:instrText>
             </w:r>
             <w:r>
               <w:rPr>
@@ -6752,7 +6752,7 @@
               <w14:ligatures w14:val="standardContextual"/>
             </w:rPr>
           </w:pPr>
-          <w:hyperlink w:anchor="_Toc242925296" w:history="1">
+          <w:hyperlink w:anchor="_Toc243004467" w:history="1">
             <w:r>
               <w:rPr>
                 <w:rStyle w:val="Hyperlink"/>
@@ -6776,7 +6776,7 @@
               <w:rPr>
                 <w:noProof/>
               </w:rPr>
-              <w:instrText xml:space="preserve"> PAGEREF _Toc242925296 \h </w:instrText>
+              <w:instrText xml:space="preserve"> PAGEREF _Toc243004467 \h </w:instrText>
             </w:r>
             <w:r>
               <w:rPr>
@@ -6816,7 +6816,7 @@
               <w14:ligatures w14:val="standardContextual"/>
             </w:rPr>
           </w:pPr>
-          <w:hyperlink w:anchor="_Toc242925297" w:history="1">
+          <w:hyperlink w:anchor="_Toc243004468" w:history="1">
             <w:r>
               <w:rPr>
                 <w:rStyle w:val="Hyperlink"/>
@@ -6840,7 +6840,7 @@
               <w:rPr>
                 <w:noProof/>
               </w:rPr>
-              <w:instrText xml:space="preserve"> PAGEREF _Toc242925297 \h </w:instrText>
+              <w:instrText xml:space="preserve"> PAGEREF _Toc243004468 \h </w:instrText>
             </w:r>
             <w:r>
               <w:rPr>
@@ -6880,7 +6880,7 @@
               <w14:ligatures w14:val="standardContextual"/>
             </w:rPr>
           </w:pPr>
-          <w:hyperlink w:anchor="_Toc242925298" w:history="1">
+          <w:hyperlink w:anchor="_Toc243004469" w:history="1">
             <w:r>
               <w:rPr>
                 <w:rStyle w:val="Hyperlink"/>
@@ -6904,7 +6904,7 @@
               <w:rPr>
                 <w:noProof/>
               </w:rPr>
-              <w:instrText xml:space="preserve"> PAGEREF _Toc242925298 \h </w:instrText>
+              <w:instrText xml:space="preserve"> PAGEREF _Toc243004469 \h </w:instrText>
             </w:r>
             <w:r>
               <w:rPr>
@@ -6944,7 +6944,7 @@
               <w14:ligatures w14:val="standardContextual"/>
             </w:rPr>
           </w:pPr>
-          <w:hyperlink w:anchor="_Toc242925299" w:history="1">
+          <w:hyperlink w:anchor="_Toc243004470" w:history="1">
             <w:r>
               <w:rPr>
                 <w:rStyle w:val="Hyperlink"/>
@@ -6968,7 +6968,7 @@
               <w:rPr>
                 <w:noProof/>
               </w:rPr>
-              <w:instrText xml:space="preserve"> PAGEREF _Toc242925299 \h </w:instrText>
+              <w:instrText xml:space="preserve"> PAGEREF _Toc243004470 \h </w:instrText>
             </w:r>
             <w:r>
               <w:rPr>
@@ -7008,7 +7008,7 @@
               <w14:ligatures w14:val="standardContextual"/>
             </w:rPr>
           </w:pPr>
-          <w:hyperlink w:anchor="_Toc242925300" w:history="1">
+          <w:hyperlink w:anchor="_Toc243004471" w:history="1">
             <w:r>
               <w:rPr>
                 <w:rStyle w:val="Hyperlink"/>
@@ -7032,7 +7032,7 @@
               <w:rPr>
                 <w:noProof/>
               </w:rPr>
-              <w:instrText xml:space="preserve"> PAGEREF _Toc242925300 \h </w:instrText>
+              <w:instrText xml:space="preserve"> PAGEREF _Toc243004471 \h </w:instrText>
             </w:r>
             <w:r>
               <w:rPr>
@@ -7072,7 +7072,7 @@
               <w14:ligatures w14:val="standardContextual"/>
             </w:rPr>
           </w:pPr>
-          <w:hyperlink w:anchor="_Toc242925301" w:history="1">
+          <w:hyperlink w:anchor="_Toc243004472" w:history="1">
             <w:r>
               <w:rPr>
                 <w:rStyle w:val="Hyperlink"/>
@@ -7096,7 +7096,7 @@
               <w:rPr>
                 <w:noProof/>
               </w:rPr>
-              <w:instrText xml:space="preserve"> PAGEREF _Toc242925301 \h </w:instrText>
+              <w:instrText xml:space="preserve"> PAGEREF _Toc243004472 \h </w:instrText>
             </w:r>
             <w:r>
               <w:rPr>
@@ -7136,7 +7136,7 @@
               <w14:ligatures w14:val="standardContextual"/>
             </w:rPr>
           </w:pPr>
-          <w:hyperlink w:anchor="_Toc242925302" w:history="1">
+          <w:hyperlink w:anchor="_Toc243004473" w:history="1">
             <w:r>
               <w:rPr>
                 <w:rStyle w:val="Hyperlink"/>
@@ -7160,7 +7160,7 @@
               <w:rPr>
                 <w:noProof/>
               </w:rPr>
-              <w:instrText xml:space="preserve"> PAGEREF _Toc242925302 \h </w:instrText>
+              <w:instrText xml:space="preserve"> PAGEREF _Toc243004473 \h </w:instrText>
             </w:r>
             <w:r>
               <w:rPr>
@@ -7200,7 +7200,7 @@
               <w14:ligatures w14:val="standardContextual"/>
             </w:rPr>
           </w:pPr>
-          <w:hyperlink w:anchor="_Toc242925303" w:history="1">
+          <w:hyperlink w:anchor="_Toc243004474" w:history="1">
             <w:r>
               <w:rPr>
                 <w:rStyle w:val="Hyperlink"/>
@@ -7224,7 +7224,7 @@
               <w:rPr>
                 <w:noProof/>
               </w:rPr>
-              <w:instrText xml:space="preserve"> PAGEREF _Toc242925303 \h </w:instrText>
+              <w:instrText xml:space="preserve"> PAGEREF _Toc243004474 \h </w:instrText>
             </w:r>
             <w:r>
               <w:rPr>
@@ -7264,7 +7264,7 @@
               <w14:ligatures w14:val="standardContextual"/>
             </w:rPr>
           </w:pPr>
-          <w:hyperlink w:anchor="_Toc242925304" w:history="1">
+          <w:hyperlink w:anchor="_Toc243004475" w:history="1">
             <w:r>
               <w:rPr>
                 <w:rStyle w:val="Hyperlink"/>
@@ -7288,7 +7288,7 @@
               <w:rPr>
                 <w:noProof/>
               </w:rPr>
-              <w:instrText xml:space="preserve"> PAGEREF _Toc242925304 \h </w:instrText>
+              <w:instrText xml:space="preserve"> PAGEREF _Toc243004475 \h </w:instrText>
             </w:r>
             <w:r>
               <w:rPr>
@@ -7328,7 +7328,7 @@
               <w14:ligatures w14:val="standardContextual"/>
             </w:rPr>
           </w:pPr>
-          <w:hyperlink w:anchor="_Toc242925305" w:history="1">
+          <w:hyperlink w:anchor="_Toc243004476" w:history="1">
             <w:r>
               <w:rPr>
                 <w:rStyle w:val="Hyperlink"/>
@@ -7352,7 +7352,7 @@
               <w:rPr>
                 <w:noProof/>
               </w:rPr>
-              <w:instrText xml:space="preserve"> PAGEREF _Toc242925305 \h </w:instrText>
+              <w:instrText xml:space="preserve"> PAGEREF _Toc243004476 \h </w:instrText>
             </w:r>
             <w:r>
               <w:rPr>
@@ -7392,7 +7392,7 @@
               <w14:ligatures w14:val="standardContextual"/>
             </w:rPr>
           </w:pPr>
-          <w:hyperlink w:anchor="_Toc242925306" w:history="1">
+          <w:hyperlink w:anchor="_Toc243004477" w:history="1">
             <w:r>
               <w:rPr>
                 <w:rStyle w:val="Hyperlink"/>
@@ -7416,7 +7416,7 @@
               <w:rPr>
                 <w:noProof/>
               </w:rPr>
-              <w:instrText xml:space="preserve"> PAGEREF _Toc242925306 \h </w:instrText>
+              <w:instrText xml:space="preserve"> PAGEREF _Toc243004477 \h </w:instrText>
             </w:r>
             <w:r>
               <w:rPr>
@@ -7456,7 +7456,7 @@
               <w14:ligatures w14:val="standardContextual"/>
             </w:rPr>
           </w:pPr>
-          <w:hyperlink w:anchor="_Toc242925307" w:history="1">
+          <w:hyperlink w:anchor="_Toc243004478" w:history="1">
             <w:r>
               <w:rPr>
                 <w:rStyle w:val="Hyperlink"/>
@@ -7480,7 +7480,7 @@
               <w:rPr>
                 <w:noProof/>
               </w:rPr>
-              <w:instrText xml:space="preserve"> PAGEREF _Toc242925307 \h </w:instrText>
+              <w:instrText xml:space="preserve"> PAGEREF _Toc243004478 \h </w:instrText>
             </w:r>
             <w:r>
               <w:rPr>
@@ -7520,7 +7520,7 @@
               <w14:ligatures w14:val="standardContextual"/>
             </w:rPr>
           </w:pPr>
-          <w:hyperlink w:anchor="_Toc242925308" w:history="1">
+          <w:hyperlink w:anchor="_Toc243004479" w:history="1">
             <w:r>
               <w:rPr>
                 <w:rStyle w:val="Hyperlink"/>
@@ -7544,7 +7544,7 @@
               <w:rPr>
                 <w:noProof/>
               </w:rPr>
-              <w:instrText xml:space="preserve"> PAGEREF _Toc242925308 \h </w:instrText>
+              <w:instrText xml:space="preserve"> PAGEREF _Toc243004479 \h </w:instrText>
             </w:r>
             <w:r>
               <w:rPr>
@@ -7584,7 +7584,7 @@
               <w14:ligatures w14:val="standardContextual"/>
             </w:rPr>
           </w:pPr>
-          <w:hyperlink w:anchor="_Toc242925309" w:history="1">
+          <w:hyperlink w:anchor="_Toc243004480" w:history="1">
             <w:r>
               <w:rPr>
                 <w:rStyle w:val="Hyperlink"/>
@@ -7608,7 +7608,7 @@
               <w:rPr>
                 <w:noProof/>
               </w:rPr>
-              <w:instrText xml:space="preserve"> PAGEREF _Toc242925309 \h </w:instrText>
+              <w:instrText xml:space="preserve"> PAGEREF _Toc243004480 \h </w:instrText>
             </w:r>
             <w:r>
               <w:rPr>
@@ -7648,7 +7648,7 @@
               <w14:ligatures w14:val="standardContextual"/>
             </w:rPr>
           </w:pPr>
-          <w:hyperlink w:anchor="_Toc242925310" w:history="1">
+          <w:hyperlink w:anchor="_Toc243004481" w:history="1">
             <w:r>
               <w:rPr>
                 <w:rStyle w:val="Hyperlink"/>
@@ -7672,7 +7672,7 @@
               <w:rPr>
                 <w:noProof/>
               </w:rPr>
-              <w:instrText xml:space="preserve"> PAGEREF _Toc242925310 \h </w:instrText>
+              <w:instrText xml:space="preserve"> PAGEREF _Toc243004481 \h </w:instrText>
             </w:r>
             <w:r>
               <w:rPr>
@@ -7712,7 +7712,7 @@
               <w14:ligatures w14:val="standardContextual"/>
             </w:rPr>
           </w:pPr>
-          <w:hyperlink w:anchor="_Toc242925311" w:history="1">
+          <w:hyperlink w:anchor="_Toc243004482" w:history="1">
             <w:r>
               <w:rPr>
                 <w:rStyle w:val="Hyperlink"/>
@@ -7736,7 +7736,7 @@
               <w:rPr>
                 <w:noProof/>
               </w:rPr>
-              <w:instrText xml:space="preserve"> PAGEREF _Toc242925311 \h </w:instrText>
+              <w:instrText xml:space="preserve"> PAGEREF _Toc243004482 \h </w:instrText>
             </w:r>
             <w:r>
               <w:rPr>
@@ -7776,7 +7776,7 @@
               <w14:ligatures w14:val="standardContextual"/>
             </w:rPr>
           </w:pPr>
-          <w:hyperlink w:anchor="_Toc242925312" w:history="1">
+          <w:hyperlink w:anchor="_Toc243004483" w:history="1">
             <w:r>
               <w:rPr>
                 <w:rStyle w:val="Hyperlink"/>
@@ -7800,7 +7800,7 @@
               <w:rPr>
                 <w:noProof/>
               </w:rPr>
-              <w:instrText xml:space="preserve"> PAGEREF _Toc242925312 \h </w:instrText>
+              <w:instrText xml:space="preserve"> PAGEREF _Toc243004483 \h </w:instrText>
             </w:r>
             <w:r>
               <w:rPr>
@@ -7840,7 +7840,7 @@
               <w14:ligatures w14:val="standardContextual"/>
             </w:rPr>
           </w:pPr>
-          <w:hyperlink w:anchor="_Toc242925313" w:history="1">
+          <w:hyperlink w:anchor="_Toc243004484" w:history="1">
             <w:r>
               <w:rPr>
                 <w:rStyle w:val="Hyperlink"/>
@@ -7864,7 +7864,7 @@
               <w:rPr>
                 <w:noProof/>
               </w:rPr>
-              <w:instrText xml:space="preserve"> PAGEREF _Toc242925313 \h </w:instrText>
+              <w:instrText xml:space="preserve"> PAGEREF _Toc243004484 \h </w:instrText>
             </w:r>
             <w:r>
               <w:rPr>
@@ -7904,7 +7904,7 @@
               <w14:ligatures w14:val="standardContextual"/>
             </w:rPr>
           </w:pPr>
-          <w:hyperlink w:anchor="_Toc242925314" w:history="1">
+          <w:hyperlink w:anchor="_Toc243004485" w:history="1">
             <w:r>
               <w:rPr>
                 <w:rStyle w:val="Hyperlink"/>
@@ -7928,7 +7928,7 @@
               <w:rPr>
                 <w:noProof/>
               </w:rPr>
-              <w:instrText xml:space="preserve"> PAGEREF _Toc242925314 \h </w:instrText>
+              <w:instrText xml:space="preserve"> PAGEREF _Toc243004485 \h </w:instrText>
             </w:r>
             <w:r>
               <w:rPr>
@@ -7968,7 +7968,7 @@
               <w14:ligatures w14:val="standardContextual"/>
             </w:rPr>
           </w:pPr>
-          <w:hyperlink w:anchor="_Toc242925315" w:history="1">
+          <w:hyperlink w:anchor="_Toc243004486" w:history="1">
             <w:r>
               <w:rPr>
                 <w:rStyle w:val="Hyperlink"/>
@@ -7992,7 +7992,7 @@
               <w:rPr>
                 <w:noProof/>
               </w:rPr>
-              <w:instrText xml:space="preserve"> PAGEREF _Toc242925315 \h </w:instrText>
+              <w:instrText xml:space="preserve"> PAGEREF _Toc243004486 \h </w:instrText>
             </w:r>
             <w:r>
               <w:rPr>
@@ -8032,7 +8032,7 @@
               <w14:ligatures w14:val="standardContextual"/>
             </w:rPr>
           </w:pPr>
-          <w:hyperlink w:anchor="_Toc242925316" w:history="1">
+          <w:hyperlink w:anchor="_Toc243004487" w:history="1">
             <w:r>
               <w:rPr>
                 <w:rStyle w:val="Hyperlink"/>
@@ -8056,7 +8056,7 @@
               <w:rPr>
                 <w:noProof/>
               </w:rPr>
-              <w:instrText xml:space="preserve"> PAGEREF _Toc242925316 \h </w:instrText>
+              <w:instrText xml:space="preserve"> PAGEREF _Toc243004487 \h </w:instrText>
             </w:r>
             <w:r>
               <w:rPr>
@@ -8096,7 +8096,7 @@
               <w14:ligatures w14:val="standardContextual"/>
             </w:rPr>
           </w:pPr>
-          <w:hyperlink w:anchor="_Toc242925317" w:history="1">
+          <w:hyperlink w:anchor="_Toc243004488" w:history="1">
             <w:r>
               <w:rPr>
                 <w:rStyle w:val="Hyperlink"/>
@@ -8120,7 +8120,7 @@
               <w:rPr>
                 <w:noProof/>
               </w:rPr>
-              <w:instrText xml:space="preserve"> PAGEREF _Toc242925317 \h </w:instrText>
+              <w:instrText xml:space="preserve"> PAGEREF _Toc243004488 \h </w:instrText>
             </w:r>
             <w:r>
               <w:rPr>
@@ -8160,7 +8160,7 @@
               <w14:ligatures w14:val="standardContextual"/>
             </w:rPr>
           </w:pPr>
-          <w:hyperlink w:anchor="_Toc242925318" w:history="1">
+          <w:hyperlink w:anchor="_Toc243004489" w:history="1">
             <w:r>
               <w:rPr>
                 <w:rStyle w:val="Hyperlink"/>
@@ -8184,7 +8184,7 @@
               <w:rPr>
                 <w:noProof/>
               </w:rPr>
-              <w:instrText xml:space="preserve"> PAGEREF _Toc242925318 \h </w:instrText>
+              <w:instrText xml:space="preserve"> PAGEREF _Toc243004489 \h </w:instrText>
             </w:r>
             <w:r>
               <w:rPr>
@@ -8236,7 +8236,7 @@
     <w:sdt>
       <w:sdtPr>
         <w:alias w:val="Figures"/>
-        <w:id w:val="-574736497"/>
+        <w:id w:val="-371544428"/>
       </w:sdtPr>
       <w:sdtEndPr/>
       <w:sdtContent>
@@ -8262,7 +8262,7 @@
           <w:r>
             <w:fldChar w:fldCharType="separate"/>
           </w:r>
-          <w:hyperlink w:anchor="_Toc242925319" w:history="1">
+          <w:hyperlink w:anchor="_Toc243004490" w:history="1">
             <w:r>
               <w:rPr>
                 <w:rStyle w:val="Hyperlink"/>
@@ -8286,7 +8286,7 @@
               <w:rPr>
                 <w:noProof/>
               </w:rPr>
-              <w:instrText xml:space="preserve"> PAGEREF _Toc242925319 \h </w:instrText>
+              <w:instrText xml:space="preserve"> PAGEREF _Toc243004490 \h </w:instrText>
             </w:r>
             <w:r>
               <w:rPr>
@@ -8326,7 +8326,7 @@
               <w14:ligatures w14:val="standardContextual"/>
             </w:rPr>
           </w:pPr>
-          <w:hyperlink w:anchor="_Toc242925320" w:history="1">
+          <w:hyperlink w:anchor="_Toc243004491" w:history="1">
             <w:r>
               <w:rPr>
                 <w:rStyle w:val="Hyperlink"/>
@@ -8350,7 +8350,7 @@
               <w:rPr>
                 <w:noProof/>
               </w:rPr>
-              <w:instrText xml:space="preserve"> PAGEREF _Toc242925320 \h </w:instrText>
+              <w:instrText xml:space="preserve"> PAGEREF _Toc243004491 \h </w:instrText>
             </w:r>
             <w:r>
               <w:rPr>
@@ -8390,7 +8390,7 @@
               <w14:ligatures w14:val="standardContextual"/>
             </w:rPr>
           </w:pPr>
-          <w:hyperlink w:anchor="_Toc242925321" w:history="1">
+          <w:hyperlink w:anchor="_Toc243004492" w:history="1">
             <w:r>
               <w:rPr>
                 <w:rStyle w:val="Hyperlink"/>
@@ -8414,7 +8414,7 @@
               <w:rPr>
                 <w:noProof/>
               </w:rPr>
-              <w:instrText xml:space="preserve"> PAGEREF _Toc242925321 \h </w:instrText>
+              <w:instrText xml:space="preserve"> PAGEREF _Toc243004492 \h </w:instrText>
             </w:r>
             <w:r>
               <w:rPr>
@@ -8454,7 +8454,7 @@
               <w14:ligatures w14:val="standardContextual"/>
             </w:rPr>
           </w:pPr>
-          <w:hyperlink w:anchor="_Toc242925322" w:history="1">
+          <w:hyperlink w:anchor="_Toc243004493" w:history="1">
             <w:r>
               <w:rPr>
                 <w:rStyle w:val="Hyperlink"/>
@@ -8478,7 +8478,7 @@
               <w:rPr>
                 <w:noProof/>
               </w:rPr>
-              <w:instrText xml:space="preserve"> PAGEREF _Toc242925322 \h </w:instrText>
+              <w:instrText xml:space="preserve"> PAGEREF _Toc243004493 \h </w:instrText>
             </w:r>
             <w:r>
               <w:rPr>
@@ -8518,7 +8518,7 @@
               <w14:ligatures w14:val="standardContextual"/>
             </w:rPr>
           </w:pPr>
-          <w:hyperlink w:anchor="_Toc242925323" w:history="1">
+          <w:hyperlink w:anchor="_Toc243004494" w:history="1">
             <w:r>
               <w:rPr>
                 <w:rStyle w:val="Hyperlink"/>
@@ -8542,7 +8542,7 @@
               <w:rPr>
                 <w:noProof/>
               </w:rPr>
-              <w:instrText xml:space="preserve"> PAGEREF _Toc242925323 \h </w:instrText>
+              <w:instrText xml:space="preserve"> PAGEREF _Toc243004494 \h </w:instrText>
             </w:r>
             <w:r>
               <w:rPr>
@@ -8582,7 +8582,7 @@
               <w14:ligatures w14:val="standardContextual"/>
             </w:rPr>
           </w:pPr>
-          <w:hyperlink w:anchor="_Toc242925324" w:history="1">
+          <w:hyperlink w:anchor="_Toc243004495" w:history="1">
             <w:r>
               <w:rPr>
                 <w:rStyle w:val="Hyperlink"/>
@@ -8606,7 +8606,7 @@
               <w:rPr>
                 <w:noProof/>
               </w:rPr>
-              <w:instrText xml:space="preserve"> PAGEREF _Toc242925324 \h </w:instrText>
+              <w:instrText xml:space="preserve"> PAGEREF _Toc243004495 \h </w:instrText>
             </w:r>
             <w:r>
               <w:rPr>
@@ -8646,7 +8646,7 @@
               <w14:ligatures w14:val="standardContextual"/>
             </w:rPr>
           </w:pPr>
-          <w:hyperlink w:anchor="_Toc242925325" w:history="1">
+          <w:hyperlink w:anchor="_Toc243004496" w:history="1">
             <w:r>
               <w:rPr>
                 <w:rStyle w:val="Hyperlink"/>
@@ -8670,7 +8670,7 @@
               <w:rPr>
                 <w:noProof/>
               </w:rPr>
-              <w:instrText xml:space="preserve"> PAGEREF _Toc242925325 \h </w:instrText>
+              <w:instrText xml:space="preserve"> PAGEREF _Toc243004496 \h </w:instrText>
             </w:r>
             <w:r>
               <w:rPr>
@@ -8710,7 +8710,7 @@
               <w14:ligatures w14:val="standardContextual"/>
             </w:rPr>
           </w:pPr>
-          <w:hyperlink w:anchor="_Toc242925326" w:history="1">
+          <w:hyperlink w:anchor="_Toc243004497" w:history="1">
             <w:r>
               <w:rPr>
                 <w:rStyle w:val="Hyperlink"/>
@@ -8734,7 +8734,7 @@
               <w:rPr>
                 <w:noProof/>
               </w:rPr>
-              <w:instrText xml:space="preserve"> PAGEREF _Toc242925326 \h </w:instrText>
+              <w:instrText xml:space="preserve"> PAGEREF _Toc243004497 \h </w:instrText>
             </w:r>
             <w:r>
               <w:rPr>
@@ -8774,7 +8774,7 @@
               <w14:ligatures w14:val="standardContextual"/>
             </w:rPr>
           </w:pPr>
-          <w:hyperlink w:anchor="_Toc242925327" w:history="1">
+          <w:hyperlink w:anchor="_Toc243004498" w:history="1">
             <w:r>
               <w:rPr>
                 <w:rStyle w:val="Hyperlink"/>
@@ -8798,7 +8798,7 @@
               <w:rPr>
                 <w:noProof/>
               </w:rPr>
-              <w:instrText xml:space="preserve"> PAGEREF _Toc242925327 \h </w:instrText>
+              <w:instrText xml:space="preserve"> PAGEREF _Toc243004498 \h </w:instrText>
             </w:r>
             <w:r>
               <w:rPr>
@@ -8838,7 +8838,7 @@
               <w14:ligatures w14:val="standardContextual"/>
             </w:rPr>
           </w:pPr>
-          <w:hyperlink w:anchor="_Toc242925328" w:history="1">
+          <w:hyperlink w:anchor="_Toc243004499" w:history="1">
             <w:r>
               <w:rPr>
                 <w:rStyle w:val="Hyperlink"/>
@@ -8862,7 +8862,7 @@
               <w:rPr>
                 <w:noProof/>
               </w:rPr>
-              <w:instrText xml:space="preserve"> PAGEREF _Toc242925328 \h </w:instrText>
+              <w:instrText xml:space="preserve"> PAGEREF _Toc243004499 \h </w:instrText>
             </w:r>
             <w:r>
               <w:rPr>
@@ -8902,7 +8902,7 @@
               <w14:ligatures w14:val="standardContextual"/>
             </w:rPr>
           </w:pPr>
-          <w:hyperlink w:anchor="_Toc242925329" w:history="1">
+          <w:hyperlink w:anchor="_Toc243004500" w:history="1">
             <w:r>
               <w:rPr>
                 <w:rStyle w:val="Hyperlink"/>
@@ -8926,7 +8926,7 @@
               <w:rPr>
                 <w:noProof/>
               </w:rPr>
-              <w:instrText xml:space="preserve"> PAGEREF _Toc242925329 \h </w:instrText>
+              <w:instrText xml:space="preserve"> PAGEREF _Toc243004500 \h </w:instrText>
             </w:r>
             <w:r>
               <w:rPr>
@@ -8966,7 +8966,7 @@
               <w14:ligatures w14:val="standardContextual"/>
             </w:rPr>
           </w:pPr>
-          <w:hyperlink w:anchor="_Toc242925330" w:history="1">
+          <w:hyperlink w:anchor="_Toc243004501" w:history="1">
             <w:r>
               <w:rPr>
                 <w:rStyle w:val="Hyperlink"/>
@@ -8990,7 +8990,7 @@
               <w:rPr>
                 <w:noProof/>
               </w:rPr>
-              <w:instrText xml:space="preserve"> PAGEREF _Toc242925330 \h </w:instrText>
+              <w:instrText xml:space="preserve"> PAGEREF _Toc243004501 \h </w:instrText>
             </w:r>
             <w:r>
               <w:rPr>
@@ -9030,7 +9030,7 @@
               <w14:ligatures w14:val="standardContextual"/>
             </w:rPr>
           </w:pPr>
-          <w:hyperlink w:anchor="_Toc242925331" w:history="1">
+          <w:hyperlink w:anchor="_Toc243004502" w:history="1">
             <w:r>
               <w:rPr>
                 <w:rStyle w:val="Hyperlink"/>
@@ -9054,7 +9054,7 @@
               <w:rPr>
                 <w:noProof/>
               </w:rPr>
-              <w:instrText xml:space="preserve"> PAGEREF _Toc242925331 \h </w:instrText>
+              <w:instrText xml:space="preserve"> PAGEREF _Toc243004502 \h </w:instrText>
             </w:r>
             <w:r>
               <w:rPr>
@@ -9094,7 +9094,7 @@
               <w14:ligatures w14:val="standardContextual"/>
             </w:rPr>
           </w:pPr>
-          <w:hyperlink w:anchor="_Toc242925332" w:history="1">
+          <w:hyperlink w:anchor="_Toc243004503" w:history="1">
             <w:r>
               <w:rPr>
                 <w:rStyle w:val="Hyperlink"/>
@@ -9118,7 +9118,7 @@
               <w:rPr>
                 <w:noProof/>
               </w:rPr>
-              <w:instrText xml:space="preserve"> PAGEREF _Toc242925332 \h </w:instrText>
+              <w:instrText xml:space="preserve"> PAGEREF _Toc243004503 \h </w:instrText>
             </w:r>
             <w:r>
               <w:rPr>
@@ -9158,7 +9158,7 @@
               <w14:ligatures w14:val="standardContextual"/>
             </w:rPr>
           </w:pPr>
-          <w:hyperlink w:anchor="_Toc242925333" w:history="1">
+          <w:hyperlink w:anchor="_Toc243004504" w:history="1">
             <w:r>
               <w:rPr>
                 <w:rStyle w:val="Hyperlink"/>
@@ -9182,7 +9182,7 @@
               <w:rPr>
                 <w:noProof/>
               </w:rPr>
-              <w:instrText xml:space="preserve"> PAGEREF _Toc242925333 \h </w:instrText>
+              <w:instrText xml:space="preserve"> PAGEREF _Toc243004504 \h </w:instrText>
             </w:r>
             <w:r>
               <w:rPr>
@@ -9222,7 +9222,7 @@
               <w14:ligatures w14:val="standardContextual"/>
             </w:rPr>
           </w:pPr>
-          <w:hyperlink w:anchor="_Toc242925334" w:history="1">
+          <w:hyperlink w:anchor="_Toc243004505" w:history="1">
             <w:r>
               <w:rPr>
                 <w:rStyle w:val="Hyperlink"/>
@@ -9246,7 +9246,7 @@
               <w:rPr>
                 <w:noProof/>
               </w:rPr>
-              <w:instrText xml:space="preserve"> PAGEREF _Toc242925334 \h </w:instrText>
+              <w:instrText xml:space="preserve"> PAGEREF _Toc243004505 \h </w:instrText>
             </w:r>
             <w:r>
               <w:rPr>
@@ -9286,7 +9286,7 @@
               <w14:ligatures w14:val="standardContextual"/>
             </w:rPr>
           </w:pPr>
-          <w:hyperlink w:anchor="_Toc242925335" w:history="1">
+          <w:hyperlink w:anchor="_Toc243004506" w:history="1">
             <w:r>
               <w:rPr>
                 <w:rStyle w:val="Hyperlink"/>
@@ -9310,7 +9310,7 @@
               <w:rPr>
                 <w:noProof/>
               </w:rPr>
-              <w:instrText xml:space="preserve"> PAGEREF _Toc242925335 \h </w:instrText>
+              <w:instrText xml:space="preserve"> PAGEREF _Toc243004506 \h </w:instrText>
             </w:r>
             <w:r>
               <w:rPr>
@@ -9350,7 +9350,7 @@
               <w14:ligatures w14:val="standardContextual"/>
             </w:rPr>
           </w:pPr>
-          <w:hyperlink w:anchor="_Toc242925336" w:history="1">
+          <w:hyperlink w:anchor="_Toc243004507" w:history="1">
             <w:r>
               <w:rPr>
                 <w:rStyle w:val="Hyperlink"/>
@@ -9374,7 +9374,7 @@
               <w:rPr>
                 <w:noProof/>
               </w:rPr>
-              <w:instrText xml:space="preserve"> PAGEREF _Toc242925336 \h </w:instrText>
+              <w:instrText xml:space="preserve"> PAGEREF _Toc243004507 \h </w:instrText>
             </w:r>
             <w:r>
               <w:rPr>
@@ -9414,7 +9414,7 @@
               <w14:ligatures w14:val="standardContextual"/>
             </w:rPr>
           </w:pPr>
-          <w:hyperlink w:anchor="_Toc242925337" w:history="1">
+          <w:hyperlink w:anchor="_Toc243004508" w:history="1">
             <w:r>
               <w:rPr>
                 <w:rStyle w:val="Hyperlink"/>
@@ -9438,7 +9438,7 @@
               <w:rPr>
                 <w:noProof/>
               </w:rPr>
-              <w:instrText xml:space="preserve"> PAGEREF _Toc242925337 \h </w:instrText>
+              <w:instrText xml:space="preserve"> PAGEREF _Toc243004508 \h </w:instrText>
             </w:r>
             <w:r>
               <w:rPr>
@@ -9478,7 +9478,7 @@
               <w14:ligatures w14:val="standardContextual"/>
             </w:rPr>
           </w:pPr>
-          <w:hyperlink w:anchor="_Toc242925338" w:history="1">
+          <w:hyperlink w:anchor="_Toc243004509" w:history="1">
             <w:r>
               <w:rPr>
                 <w:rStyle w:val="Hyperlink"/>
@@ -9502,7 +9502,7 @@
               <w:rPr>
                 <w:noProof/>
               </w:rPr>
-              <w:instrText xml:space="preserve"> PAGEREF _Toc242925338 \h </w:instrText>
+              <w:instrText xml:space="preserve"> PAGEREF _Toc243004509 \h </w:instrText>
             </w:r>
             <w:r>
               <w:rPr>
@@ -9542,7 +9542,7 @@
               <w14:ligatures w14:val="standardContextual"/>
             </w:rPr>
           </w:pPr>
-          <w:hyperlink w:anchor="_Toc242925339" w:history="1">
+          <w:hyperlink w:anchor="_Toc243004510" w:history="1">
             <w:r>
               <w:rPr>
                 <w:rStyle w:val="Hyperlink"/>
@@ -9566,7 +9566,7 @@
               <w:rPr>
                 <w:noProof/>
               </w:rPr>
-              <w:instrText xml:space="preserve"> PAGEREF _Toc242925339 \h </w:instrText>
+              <w:instrText xml:space="preserve"> PAGEREF _Toc243004510 \h </w:instrText>
             </w:r>
             <w:r>
               <w:rPr>
@@ -9606,7 +9606,7 @@
               <w14:ligatures w14:val="standardContextual"/>
             </w:rPr>
           </w:pPr>
-          <w:hyperlink w:anchor="_Toc242925340" w:history="1">
+          <w:hyperlink w:anchor="_Toc243004511" w:history="1">
             <w:r>
               <w:rPr>
                 <w:rStyle w:val="Hyperlink"/>
@@ -9630,7 +9630,7 @@
               <w:rPr>
                 <w:noProof/>
               </w:rPr>
-              <w:instrText xml:space="preserve"> PAGEREF _Toc242925340 \h </w:instrText>
+              <w:instrText xml:space="preserve"> PAGEREF _Toc243004511 \h </w:instrText>
             </w:r>
             <w:r>
               <w:rPr>
@@ -9670,13 +9670,13 @@
               <w14:ligatures w14:val="standardContextual"/>
             </w:rPr>
           </w:pPr>
-          <w:hyperlink w:anchor="_Toc242925341" w:history="1">
+          <w:hyperlink w:anchor="_Toc243004512" w:history="1">
             <w:r>
               <w:rPr>
                 <w:rStyle w:val="Hyperlink"/>
                 <w:noProof/>
               </w:rPr>
-              <w:t>Figure 6.8 Recitation and Live Learning Interfaces</w:t>
+              <w:t>Figure 6.8 Recitation, Live Learning and Badge Interfaces</w:t>
             </w:r>
             <w:r>
               <w:rPr>
@@ -9694,7 +9694,7 @@
               <w:rPr>
                 <w:noProof/>
               </w:rPr>
-              <w:instrText xml:space="preserve"> PAGEREF _Toc242925341 \h </w:instrText>
+              <w:instrText xml:space="preserve"> PAGEREF _Toc243004512 \h </w:instrText>
             </w:r>
             <w:r>
               <w:rPr>
@@ -9734,7 +9734,7 @@
               <w14:ligatures w14:val="standardContextual"/>
             </w:rPr>
           </w:pPr>
-          <w:hyperlink w:anchor="_Toc242925342" w:history="1">
+          <w:hyperlink w:anchor="_Toc243004513" w:history="1">
             <w:r>
               <w:rPr>
                 <w:rStyle w:val="Hyperlink"/>
@@ -9758,7 +9758,7 @@
               <w:rPr>
                 <w:noProof/>
               </w:rPr>
-              <w:instrText xml:space="preserve"> PAGEREF _Toc242925342 \h </w:instrText>
+              <w:instrText xml:space="preserve"> PAGEREF _Toc243004513 \h </w:instrText>
             </w:r>
             <w:r>
               <w:rPr>
@@ -9810,7 +9810,7 @@
     <w:sdt>
       <w:sdtPr>
         <w:alias w:val="Tables"/>
-        <w:id w:val="-862121419"/>
+        <w:id w:val="-837846991"/>
       </w:sdtPr>
       <w:sdtEndPr/>
       <w:sdtContent>
@@ -9836,7 +9836,7 @@
           <w:r>
             <w:fldChar w:fldCharType="separate"/>
           </w:r>
-          <w:hyperlink w:anchor="_Toc242925343" w:history="1">
+          <w:hyperlink w:anchor="_Toc243004514" w:history="1">
             <w:r>
               <w:rPr>
                 <w:rStyle w:val="Hyperlink"/>
@@ -9860,7 +9860,7 @@
               <w:rPr>
                 <w:noProof/>
               </w:rPr>
-              <w:instrText xml:space="preserve"> PAGEREF _Toc242925343 \h </w:instrText>
+              <w:instrText xml:space="preserve"> PAGEREF _Toc243004514 \h </w:instrText>
             </w:r>
             <w:r>
               <w:rPr>
@@ -9900,7 +9900,7 @@
               <w14:ligatures w14:val="standardContextual"/>
             </w:rPr>
           </w:pPr>
-          <w:hyperlink w:anchor="_Toc242925344" w:history="1">
+          <w:hyperlink w:anchor="_Toc243004515" w:history="1">
             <w:r>
               <w:rPr>
                 <w:rStyle w:val="Hyperlink"/>
@@ -9924,7 +9924,7 @@
               <w:rPr>
                 <w:noProof/>
               </w:rPr>
-              <w:instrText xml:space="preserve"> PAGEREF _Toc242925344 \h </w:instrText>
+              <w:instrText xml:space="preserve"> PAGEREF _Toc243004515 \h </w:instrText>
             </w:r>
             <w:r>
               <w:rPr>
@@ -9964,7 +9964,7 @@
               <w14:ligatures w14:val="standardContextual"/>
             </w:rPr>
           </w:pPr>
-          <w:hyperlink w:anchor="_Toc242925345" w:history="1">
+          <w:hyperlink w:anchor="_Toc243004516" w:history="1">
             <w:r>
               <w:rPr>
                 <w:rStyle w:val="Hyperlink"/>
@@ -9988,7 +9988,7 @@
               <w:rPr>
                 <w:noProof/>
               </w:rPr>
-              <w:instrText xml:space="preserve"> PAGEREF _Toc242925345 \h </w:instrText>
+              <w:instrText xml:space="preserve"> PAGEREF _Toc243004516 \h </w:instrText>
             </w:r>
             <w:r>
               <w:rPr>
@@ -10028,7 +10028,7 @@
               <w14:ligatures w14:val="standardContextual"/>
             </w:rPr>
           </w:pPr>
-          <w:hyperlink w:anchor="_Toc242925346" w:history="1">
+          <w:hyperlink w:anchor="_Toc243004517" w:history="1">
             <w:r>
               <w:rPr>
                 <w:rStyle w:val="Hyperlink"/>
@@ -10052,7 +10052,7 @@
               <w:rPr>
                 <w:noProof/>
               </w:rPr>
-              <w:instrText xml:space="preserve"> PAGEREF _Toc242925346 \h </w:instrText>
+              <w:instrText xml:space="preserve"> PAGEREF _Toc243004517 \h </w:instrText>
             </w:r>
             <w:r>
               <w:rPr>
@@ -10092,7 +10092,7 @@
               <w14:ligatures w14:val="standardContextual"/>
             </w:rPr>
           </w:pPr>
-          <w:hyperlink w:anchor="_Toc242925347" w:history="1">
+          <w:hyperlink w:anchor="_Toc243004518" w:history="1">
             <w:r>
               <w:rPr>
                 <w:rStyle w:val="Hyperlink"/>
@@ -10116,7 +10116,7 @@
               <w:rPr>
                 <w:noProof/>
               </w:rPr>
-              <w:instrText xml:space="preserve"> PAGEREF _Toc242925347 \h </w:instrText>
+              <w:instrText xml:space="preserve"> PAGEREF _Toc243004518 \h </w:instrText>
             </w:r>
             <w:r>
               <w:rPr>
@@ -10156,7 +10156,7 @@
               <w14:ligatures w14:val="standardContextual"/>
             </w:rPr>
           </w:pPr>
-          <w:hyperlink w:anchor="_Toc242925348" w:history="1">
+          <w:hyperlink w:anchor="_Toc243004519" w:history="1">
             <w:r>
               <w:rPr>
                 <w:rStyle w:val="Hyperlink"/>
@@ -10180,7 +10180,7 @@
               <w:rPr>
                 <w:noProof/>
               </w:rPr>
-              <w:instrText xml:space="preserve"> PAGEREF _Toc242925348 \h </w:instrText>
+              <w:instrText xml:space="preserve"> PAGEREF _Toc243004519 \h </w:instrText>
             </w:r>
             <w:r>
               <w:rPr>
@@ -10220,7 +10220,7 @@
               <w14:ligatures w14:val="standardContextual"/>
             </w:rPr>
           </w:pPr>
-          <w:hyperlink w:anchor="_Toc242925349" w:history="1">
+          <w:hyperlink w:anchor="_Toc243004520" w:history="1">
             <w:r>
               <w:rPr>
                 <w:rStyle w:val="Hyperlink"/>
@@ -10244,7 +10244,7 @@
               <w:rPr>
                 <w:noProof/>
               </w:rPr>
-              <w:instrText xml:space="preserve"> PAGEREF _Toc242925349 \h </w:instrText>
+              <w:instrText xml:space="preserve"> PAGEREF _Toc243004520 \h </w:instrText>
             </w:r>
             <w:r>
               <w:rPr>
@@ -10284,7 +10284,7 @@
               <w14:ligatures w14:val="standardContextual"/>
             </w:rPr>
           </w:pPr>
-          <w:hyperlink w:anchor="_Toc242925350" w:history="1">
+          <w:hyperlink w:anchor="_Toc243004521" w:history="1">
             <w:r>
               <w:rPr>
                 <w:rStyle w:val="Hyperlink"/>
@@ -10308,7 +10308,7 @@
               <w:rPr>
                 <w:noProof/>
               </w:rPr>
-              <w:instrText xml:space="preserve"> PAGEREF _Toc242925350 \h </w:instrText>
+              <w:instrText xml:space="preserve"> PAGEREF _Toc243004521 \h </w:instrText>
             </w:r>
             <w:r>
               <w:rPr>
@@ -10376,7 +10376,7 @@
         <w:pStyle w:val="Heading1"/>
         <w:spacing w:before="120" w:after="200"/>
       </w:pPr>
-      <w:bookmarkStart w:id="4" w:name="_Toc242925203"/>
+      <w:bookmarkStart w:id="4" w:name="_Toc243004374"/>
       <w:r>
         <w:t>1. INTRODUCTION</w:t>
       </w:r>
@@ -10389,7 +10389,7 @@
         <w:keepLines/>
         <w:spacing w:before="280" w:after="140"/>
       </w:pPr>
-      <w:bookmarkStart w:id="5" w:name="_Toc242925204"/>
+      <w:bookmarkStart w:id="5" w:name="_Toc243004375"/>
       <w:r>
         <w:t>1.1 Background of the Study</w:t>
       </w:r>
@@ -10439,7 +10439,7 @@
         <w:keepLines/>
         <w:spacing w:before="280" w:after="140"/>
       </w:pPr>
-      <w:bookmarkStart w:id="6" w:name="_Toc242925205"/>
+      <w:bookmarkStart w:id="6" w:name="_Toc243004376"/>
       <w:r>
         <w:t>1.2 Problem Statement</w:t>
       </w:r>
@@ -10476,7 +10476,7 @@
         <w:keepLines/>
         <w:spacing w:before="280" w:after="140"/>
       </w:pPr>
-      <w:bookmarkStart w:id="7" w:name="_Toc242925206"/>
+      <w:bookmarkStart w:id="7" w:name="_Toc243004377"/>
       <w:r>
         <w:t>1.3 Objectives</w:t>
       </w:r>
@@ -10489,7 +10489,7 @@
         <w:keepLines/>
         <w:spacing w:before="220" w:after="120"/>
       </w:pPr>
-      <w:bookmarkStart w:id="8" w:name="_Toc242925207"/>
+      <w:bookmarkStart w:id="8" w:name="_Toc243004378"/>
       <w:r>
         <w:t>1.3.1 General Objective</w:t>
       </w:r>
@@ -10511,7 +10511,7 @@
         <w:keepLines/>
         <w:spacing w:before="220" w:after="120"/>
       </w:pPr>
-      <w:bookmarkStart w:id="9" w:name="_Toc242925208"/>
+      <w:bookmarkStart w:id="9" w:name="_Toc243004379"/>
       <w:r>
         <w:t>1.3.2 Specific Objectives</w:t>
       </w:r>
@@ -10577,7 +10577,7 @@
         <w:keepLines/>
         <w:spacing w:before="280" w:after="140"/>
       </w:pPr>
-      <w:bookmarkStart w:id="10" w:name="_Toc242925209"/>
+      <w:bookmarkStart w:id="10" w:name="_Toc243004380"/>
       <w:r>
         <w:t>1.4 Research Questions</w:t>
       </w:r>
@@ -10642,7 +10642,7 @@
         <w:keepLines/>
         <w:spacing w:before="280" w:after="140"/>
       </w:pPr>
-      <w:bookmarkStart w:id="11" w:name="_Toc242925210"/>
+      <w:bookmarkStart w:id="11" w:name="_Toc243004381"/>
       <w:r>
         <w:t>1.5 Justification</w:t>
       </w:r>
@@ -10667,7 +10667,7 @@
         <w:keepLines/>
         <w:spacing w:before="280" w:after="140"/>
       </w:pPr>
-      <w:bookmarkStart w:id="12" w:name="_Toc242925211"/>
+      <w:bookmarkStart w:id="12" w:name="_Toc243004382"/>
       <w:r>
         <w:t>1.6 Scope of the Project</w:t>
       </w:r>
@@ -10683,10 +10683,13 @@
       </w:r>
       <w:r>
         <w:lastRenderedPageBreak/>
-        <w:t>admission with system-generated admission numbers; classes and staff; manual and QR-code attendance; parent–child linking approved by the madrasa; memorisation tracking, assignments, grades and certificates; recitation recording with private audio storage, AI feedback given only with a parent’s consent, and teacher review; comparison with a master reciter, recite-along practice, a daily hifz plan and a class mistake map; a live reading room with scheduled sessions on Google Meet or Zoom; a library of teache</w:t>
-      </w:r>
-      <w:r>
-        <w:t>r-chosen Quran videos; fee invoices paid by M-Pesa or card with receipts; sponsorship of pupils; announcements, parent–teacher messaging, notifications and spoken progress reports; attendance that can be marked offline; USSD access for basic phones; an impact dashboard; and an interface in English, Kiswahili, Somali and Arabic. Curricula such as Tafsir and Fiqh, and the training of a dedicated tajweed recognition model, are outside the scope.</w:t>
+        <w:t xml:space="preserve">admission with system-generated admission numbers; classes and staff; manual and QR-code attendance; parent–child linking approved by the madrasa; memorisation tracking, assignments, grades and certificates; recitation recording with private audio storage, AI feedback given only with a parent’s consent, and teacher review; comparison with a master reciter, recite-along practice, a daily hifz plan, hifz streaks and badges and a class mistake map; a live reading room with scheduled sessions on Google Meet or </w:t>
+      </w:r>
+      <w:r>
+        <w:t>Zoom; a library of teacher-chosen Quran videos; fee invoices paid by M-Pesa or card with receipts; sponsorship of pupils; announcements, parent–teacher messaging, notifications and spoken progress reports; attendance that can be marked offline; USSD access for basic phones; an impact dashboard; a web console for the platform administrator; and an interface in English, Kiswahili, Somali and Arabic. Curricula such as Tafsir and Fiqh, and the training of a dedicated tajweed recognition model, are outside the s</w:t>
+      </w:r>
+      <w:r>
+        <w:t>cope.</w:t>
       </w:r>
     </w:p>
     <w:p>
@@ -10696,7 +10699,7 @@
         <w:keepLines/>
         <w:spacing w:before="280" w:after="140"/>
       </w:pPr>
-      <w:bookmarkStart w:id="13" w:name="_Toc242925212"/>
+      <w:bookmarkStart w:id="13" w:name="_Toc243004383"/>
       <w:r>
         <w:t>1.7 Limitations</w:t>
       </w:r>
@@ -10724,7 +10727,7 @@
         <w:keepLines/>
         <w:spacing w:before="280" w:after="140"/>
       </w:pPr>
-      <w:bookmarkStart w:id="14" w:name="_Toc242925213"/>
+      <w:bookmarkStart w:id="14" w:name="_Toc243004384"/>
       <w:r>
         <w:t>1.8 Summary</w:t>
       </w:r>
@@ -10761,7 +10764,7 @@
         <w:pStyle w:val="Heading1"/>
         <w:spacing w:before="120" w:after="200"/>
       </w:pPr>
-      <w:bookmarkStart w:id="15" w:name="_Toc242925214"/>
+      <w:bookmarkStart w:id="15" w:name="_Toc243004385"/>
       <w:r>
         <w:t>2. LITERATURE REVIEW</w:t>
       </w:r>
@@ -10774,7 +10777,7 @@
         <w:keepLines/>
         <w:spacing w:before="280" w:after="140"/>
       </w:pPr>
-      <w:bookmarkStart w:id="16" w:name="_Toc242925215"/>
+      <w:bookmarkStart w:id="16" w:name="_Toc243004386"/>
       <w:r>
         <w:t>2.1 Introduction</w:t>
       </w:r>
@@ -10796,7 +10799,7 @@
         <w:keepLines/>
         <w:spacing w:before="280" w:after="140"/>
       </w:pPr>
-      <w:bookmarkStart w:id="17" w:name="_Toc242925216"/>
+      <w:bookmarkStart w:id="17" w:name="_Toc243004387"/>
       <w:r>
         <w:t>2.2 Challenges in Traditional Madrasa Administration and Quran Learning</w:t>
       </w:r>
@@ -10809,7 +10812,7 @@
         <w:keepLines/>
         <w:spacing w:before="220" w:after="120"/>
       </w:pPr>
-      <w:bookmarkStart w:id="18" w:name="_Toc242925217"/>
+      <w:bookmarkStart w:id="18" w:name="_Toc243004388"/>
       <w:r>
         <w:t>2.2.1 Informal Record Keeping and Lack of Standardisation</w:t>
       </w:r>
@@ -10843,7 +10846,7 @@
         <w:keepLines/>
         <w:spacing w:before="220" w:after="120"/>
       </w:pPr>
-      <w:bookmarkStart w:id="19" w:name="_Toc242925218"/>
+      <w:bookmarkStart w:id="19" w:name="_Toc243004389"/>
       <w:r>
         <w:lastRenderedPageBreak/>
         <w:t>2.2.2 Limited Parental Visibility and Assessment Workload</w:t>
@@ -10878,7 +10881,7 @@
         <w:keepLines/>
         <w:spacing w:before="220" w:after="120"/>
       </w:pPr>
-      <w:bookmarkStart w:id="20" w:name="_Toc242925219"/>
+      <w:bookmarkStart w:id="20" w:name="_Toc243004390"/>
       <w:r>
         <w:t>2.2.3 Financial, Logistical and Communication Barriers</w:t>
       </w:r>
@@ -10903,7 +10906,7 @@
         <w:keepLines/>
         <w:spacing w:before="280" w:after="140"/>
       </w:pPr>
-      <w:bookmarkStart w:id="21" w:name="_Toc242925220"/>
+      <w:bookmarkStart w:id="21" w:name="_Toc243004391"/>
       <w:r>
         <w:t>2.3 Review of Existing Madrasa Management and Quran Learning Applications</w:t>
       </w:r>
@@ -10916,7 +10919,7 @@
         <w:keepLines/>
         <w:spacing w:before="220" w:after="120"/>
       </w:pPr>
-      <w:bookmarkStart w:id="22" w:name="_Toc242925221"/>
+      <w:bookmarkStart w:id="22" w:name="_Toc243004392"/>
       <w:r>
         <w:t>2.3.1 Overview of Existing Education Management and Quran Applications</w:t>
       </w:r>
@@ -10966,7 +10969,7 @@
         <w:keepLines/>
         <w:spacing w:before="220" w:after="120"/>
       </w:pPr>
-      <w:bookmarkStart w:id="23" w:name="_Toc242925222"/>
+      <w:bookmarkStart w:id="23" w:name="_Toc243004393"/>
       <w:r>
         <w:t>2.3.2 Usability, Accessibility and Functional Limitations</w:t>
       </w:r>
@@ -11003,7 +11006,7 @@
         <w:keepLines/>
         <w:spacing w:before="220" w:after="120"/>
       </w:pPr>
-      <w:bookmarkStart w:id="24" w:name="_Toc242925223"/>
+      <w:bookmarkStart w:id="24" w:name="_Toc243004394"/>
       <w:r>
         <w:t>2.3.3 Identified Gaps from Reviewed Systems</w:t>
       </w:r>
@@ -11104,7 +11107,7 @@
         <w:keepLines/>
         <w:spacing w:before="280" w:after="140"/>
       </w:pPr>
-      <w:bookmarkStart w:id="25" w:name="_Toc242925224"/>
+      <w:bookmarkStart w:id="25" w:name="_Toc243004395"/>
       <w:r>
         <w:t>2.4 Development of a Mobile-Based Integrated Madrasa Management System</w:t>
       </w:r>
@@ -11117,7 +11120,7 @@
         <w:keepLines/>
         <w:spacing w:before="220" w:after="120"/>
       </w:pPr>
-      <w:bookmarkStart w:id="26" w:name="_Toc242925225"/>
+      <w:bookmarkStart w:id="26" w:name="_Toc243004396"/>
       <w:r>
         <w:t>2.4.1 System Design and Architecture Overview</w:t>
       </w:r>
@@ -11142,7 +11145,7 @@
         <w:keepLines/>
         <w:spacing w:before="220" w:after="120"/>
       </w:pPr>
-      <w:bookmarkStart w:id="27" w:name="_Toc242925226"/>
+      <w:bookmarkStart w:id="27" w:name="_Toc243004397"/>
       <w:r>
         <w:t>2.4.2 Implementation Using React Native (Expo) and Supabase</w:t>
       </w:r>
@@ -11167,7 +11170,7 @@
         <w:keepLines/>
         <w:spacing w:before="220" w:after="120"/>
       </w:pPr>
-      <w:bookmarkStart w:id="28" w:name="_Toc242925227"/>
+      <w:bookmarkStart w:id="28" w:name="_Toc243004398"/>
       <w:r>
         <w:t>2.4.3 Integration of Administration and Quran Learning Modules</w:t>
       </w:r>
@@ -11196,7 +11199,7 @@
         <w:keepLines/>
         <w:spacing w:before="220" w:after="120"/>
       </w:pPr>
-      <w:bookmarkStart w:id="29" w:name="_Toc242925228"/>
+      <w:bookmarkStart w:id="29" w:name="_Toc243004399"/>
       <w:r>
         <w:t>2.4.4 Expected Benefits to Kenyan Madrasas</w:t>
       </w:r>
@@ -11218,7 +11221,7 @@
         <w:keepLines/>
         <w:spacing w:before="280" w:after="140"/>
       </w:pPr>
-      <w:bookmarkStart w:id="30" w:name="_Toc242925229"/>
+      <w:bookmarkStart w:id="30" w:name="_Toc243004400"/>
       <w:r>
         <w:t>2.5 Testing of the Digital Madrasa Mobile Application</w:t>
       </w:r>
@@ -11231,7 +11234,7 @@
         <w:keepLines/>
         <w:spacing w:before="220" w:after="120"/>
       </w:pPr>
-      <w:bookmarkStart w:id="31" w:name="_Toc242925230"/>
+      <w:bookmarkStart w:id="31" w:name="_Toc243004401"/>
       <w:r>
         <w:t>2.5.1 Functionality and Performance Testing</w:t>
       </w:r>
@@ -11253,7 +11256,7 @@
         <w:keepLines/>
         <w:spacing w:before="220" w:after="120"/>
       </w:pPr>
-      <w:bookmarkStart w:id="32" w:name="_Toc242925231"/>
+      <w:bookmarkStart w:id="32" w:name="_Toc243004402"/>
       <w:r>
         <w:t>2.5.2 Usability and User Experience Evaluation</w:t>
       </w:r>
@@ -11275,7 +11278,7 @@
         <w:keepLines/>
         <w:spacing w:before="220" w:after="120"/>
       </w:pPr>
-      <w:bookmarkStart w:id="33" w:name="_Toc242925232"/>
+      <w:bookmarkStart w:id="33" w:name="_Toc243004403"/>
       <w:r>
         <w:t>2.5.3 Reliability and Field Testing Approach</w:t>
       </w:r>
@@ -11301,7 +11304,7 @@
         <w:keepLines/>
         <w:spacing w:before="280" w:after="140"/>
       </w:pPr>
-      <w:bookmarkStart w:id="34" w:name="_Toc242925233"/>
+      <w:bookmarkStart w:id="34" w:name="_Toc243004404"/>
       <w:r>
         <w:t>2.6 Summary</w:t>
       </w:r>
@@ -11341,7 +11344,7 @@
         <w:pStyle w:val="Heading1"/>
         <w:spacing w:before="120" w:after="200"/>
       </w:pPr>
-      <w:bookmarkStart w:id="35" w:name="_Toc242925234"/>
+      <w:bookmarkStart w:id="35" w:name="_Toc243004405"/>
       <w:r>
         <w:t>3. SYSTEM DEVELOPMENT METHODOLOGY</w:t>
       </w:r>
@@ -11354,7 +11357,7 @@
         <w:keepLines/>
         <w:spacing w:before="280" w:after="140"/>
       </w:pPr>
-      <w:bookmarkStart w:id="36" w:name="_Toc242925235"/>
+      <w:bookmarkStart w:id="36" w:name="_Toc243004406"/>
       <w:r>
         <w:t>3.1 Introduction</w:t>
       </w:r>
@@ -11376,7 +11379,7 @@
         <w:keepLines/>
         <w:spacing w:before="280" w:after="140"/>
       </w:pPr>
-      <w:bookmarkStart w:id="37" w:name="_Toc242925236"/>
+      <w:bookmarkStart w:id="37" w:name="_Toc243004407"/>
       <w:r>
         <w:t>3.2 Methodological Approach</w:t>
       </w:r>
@@ -11412,7 +11415,7 @@
         </w:rPr>
         <w:lastRenderedPageBreak/>
         <w:drawing>
-          <wp:inline distT="0" distB="0" distL="0" distR="0" wp14:anchorId="189A34B6" wp14:editId="189A34B7">
+          <wp:inline distT="0" distB="0" distL="0" distR="0" wp14:anchorId="2571F7B9" wp14:editId="20394282">
             <wp:extent cx="4752975" cy="3771900"/>
             <wp:effectExtent l="0" t="0" r="0" b="0"/>
             <wp:docPr id="1" name="Picture 1"/>
@@ -11455,7 +11458,7 @@
       <w:pPr>
         <w:pStyle w:val="FigureCaption"/>
       </w:pPr>
-      <w:bookmarkStart w:id="38" w:name="_Toc242925319"/>
+      <w:bookmarkStart w:id="38" w:name="_Toc243004490"/>
       <w:r>
         <w:t>Figure 3.1 Agile Methodology</w:t>
       </w:r>
@@ -11468,7 +11471,7 @@
         <w:keepLines/>
         <w:spacing w:before="280" w:after="140"/>
       </w:pPr>
-      <w:bookmarkStart w:id="39" w:name="_Toc242925237"/>
+      <w:bookmarkStart w:id="39" w:name="_Toc243004408"/>
       <w:r>
         <w:t>3.3 Agile Development Phases</w:t>
       </w:r>
@@ -11490,7 +11493,7 @@
         <w:keepLines/>
         <w:spacing w:before="220" w:after="120"/>
       </w:pPr>
-      <w:bookmarkStart w:id="40" w:name="_Toc242925238"/>
+      <w:bookmarkStart w:id="40" w:name="_Toc243004409"/>
       <w:r>
         <w:t>3.3.1 Requirements Phase</w:t>
       </w:r>
@@ -11538,7 +11541,7 @@
         <w:keepLines/>
         <w:spacing w:before="220" w:after="120"/>
       </w:pPr>
-      <w:bookmarkStart w:id="41" w:name="_Toc242925239"/>
+      <w:bookmarkStart w:id="41" w:name="_Toc243004410"/>
       <w:r>
         <w:lastRenderedPageBreak/>
         <w:t>3.3.2 Design Phase</w:t>
@@ -11564,7 +11567,7 @@
         <w:keepLines/>
         <w:spacing w:before="220" w:after="120"/>
       </w:pPr>
-      <w:bookmarkStart w:id="42" w:name="_Toc242925240"/>
+      <w:bookmarkStart w:id="42" w:name="_Toc243004411"/>
       <w:r>
         <w:t>3.3.3 Development Phase</w:t>
       </w:r>
@@ -11589,7 +11592,7 @@
         <w:keepLines/>
         <w:spacing w:before="220" w:after="120"/>
       </w:pPr>
-      <w:bookmarkStart w:id="43" w:name="_Toc242925241"/>
+      <w:bookmarkStart w:id="43" w:name="_Toc243004412"/>
       <w:r>
         <w:t>3.3.4 Testing Phase</w:t>
       </w:r>
@@ -11663,7 +11666,7 @@
         <w:keepLines/>
         <w:spacing w:before="220" w:after="120"/>
       </w:pPr>
-      <w:bookmarkStart w:id="44" w:name="_Toc242925242"/>
+      <w:bookmarkStart w:id="44" w:name="_Toc243004413"/>
       <w:r>
         <w:lastRenderedPageBreak/>
         <w:t>3.3.5 Deployment Phase</w:t>
@@ -11686,7 +11689,7 @@
         <w:keepLines/>
         <w:spacing w:before="220" w:after="120"/>
       </w:pPr>
-      <w:bookmarkStart w:id="45" w:name="_Toc242925243"/>
+      <w:bookmarkStart w:id="45" w:name="_Toc243004414"/>
       <w:r>
         <w:t>3.3.6 Review Phase</w:t>
       </w:r>
@@ -11708,7 +11711,7 @@
         <w:keepLines/>
         <w:spacing w:before="280" w:after="140"/>
       </w:pPr>
-      <w:bookmarkStart w:id="46" w:name="_Toc242925244"/>
+      <w:bookmarkStart w:id="46" w:name="_Toc243004415"/>
       <w:r>
         <w:t>3.4 Summary</w:t>
       </w:r>
@@ -11745,7 +11748,7 @@
         <w:pStyle w:val="Heading1"/>
         <w:spacing w:before="120" w:after="200"/>
       </w:pPr>
-      <w:bookmarkStart w:id="47" w:name="_Toc242925245"/>
+      <w:bookmarkStart w:id="47" w:name="_Toc243004416"/>
       <w:r>
         <w:t>4. REQUIREMENTS GATHERING AND ANALYSIS</w:t>
       </w:r>
@@ -11758,7 +11761,7 @@
         <w:keepLines/>
         <w:spacing w:before="280" w:after="140"/>
       </w:pPr>
-      <w:bookmarkStart w:id="48" w:name="_Toc242925246"/>
+      <w:bookmarkStart w:id="48" w:name="_Toc243004417"/>
       <w:r>
         <w:t>4.1 Introduction</w:t>
       </w:r>
@@ -11783,7 +11786,7 @@
         <w:keepLines/>
         <w:spacing w:before="280" w:after="140"/>
       </w:pPr>
-      <w:bookmarkStart w:id="49" w:name="_Toc242925247"/>
+      <w:bookmarkStart w:id="49" w:name="_Toc243004418"/>
       <w:r>
         <w:t>4.2 Data Collection Approach</w:t>
       </w:r>
@@ -11805,7 +11808,7 @@
         <w:keepLines/>
         <w:spacing w:before="280" w:after="140"/>
       </w:pPr>
-      <w:bookmarkStart w:id="50" w:name="_Toc242925248"/>
+      <w:bookmarkStart w:id="50" w:name="_Toc243004419"/>
       <w:r>
         <w:t>4.3 Data Collection Methods</w:t>
       </w:r>
@@ -11889,7 +11892,7 @@
         <w:keepLines/>
         <w:spacing w:before="280" w:after="140"/>
       </w:pPr>
-      <w:bookmarkStart w:id="51" w:name="_Toc242925249"/>
+      <w:bookmarkStart w:id="51" w:name="_Toc243004420"/>
       <w:r>
         <w:t>4.4 Primary Data Collection</w:t>
       </w:r>
@@ -12181,7 +12184,7 @@
       <w:pPr>
         <w:pStyle w:val="TableCaption"/>
       </w:pPr>
-      <w:bookmarkStart w:id="52" w:name="_Toc242925343"/>
+      <w:bookmarkStart w:id="52" w:name="_Toc243004514"/>
       <w:r>
         <w:t>Table 4.1 Primary Data Collection</w:t>
       </w:r>
@@ -12194,7 +12197,7 @@
         <w:keepLines/>
         <w:spacing w:before="280" w:after="140"/>
       </w:pPr>
-      <w:bookmarkStart w:id="53" w:name="_Toc242925250"/>
+      <w:bookmarkStart w:id="53" w:name="_Toc243004421"/>
       <w:r>
         <w:t>4.5 Data Analysis</w:t>
       </w:r>
@@ -12216,7 +12219,7 @@
         <w:keepLines/>
         <w:spacing w:before="220" w:after="120"/>
       </w:pPr>
-      <w:bookmarkStart w:id="54" w:name="_Toc242925251"/>
+      <w:bookmarkStart w:id="54" w:name="_Toc243004422"/>
       <w:r>
         <w:t>4.5.1 Interview Data Summary</w:t>
       </w:r>
@@ -12617,7 +12620,7 @@
       <w:pPr>
         <w:pStyle w:val="TableCaption"/>
       </w:pPr>
-      <w:bookmarkStart w:id="55" w:name="_Toc242925344"/>
+      <w:bookmarkStart w:id="55" w:name="_Toc243004515"/>
       <w:r>
         <w:t>Table 4.2 Madrasa Owner and Teacher Interview Summary</w:t>
       </w:r>
@@ -12962,7 +12965,7 @@
       <w:pPr>
         <w:pStyle w:val="TableCaption"/>
       </w:pPr>
-      <w:bookmarkStart w:id="56" w:name="_Toc242925345"/>
+      <w:bookmarkStart w:id="56" w:name="_Toc243004516"/>
       <w:r>
         <w:t>Table 4.3 Parent Interview Summary</w:t>
       </w:r>
@@ -13258,7 +13261,7 @@
       <w:pPr>
         <w:pStyle w:val="TableCaption"/>
       </w:pPr>
-      <w:bookmarkStart w:id="57" w:name="_Toc242925346"/>
+      <w:bookmarkStart w:id="57" w:name="_Toc243004517"/>
       <w:r>
         <w:t>Table 4.4 Student Interview Summary</w:t>
       </w:r>
@@ -13271,7 +13274,7 @@
         <w:keepLines/>
         <w:spacing w:before="220" w:after="120"/>
       </w:pPr>
-      <w:bookmarkStart w:id="58" w:name="_Toc242925252"/>
+      <w:bookmarkStart w:id="58" w:name="_Toc243004423"/>
       <w:r>
         <w:t>4.5.2 Questionnaire Analysis</w:t>
       </w:r>
@@ -13396,7 +13399,7 @@
         <w:keepNext/>
         <w:spacing w:before="100" w:after="60"/>
       </w:pPr>
-      <w:bookmarkStart w:id="59" w:name="_Toc242925320"/>
+      <w:bookmarkStart w:id="59" w:name="_Toc243004491"/>
       <w:r>
         <w:t>Figure 4.1 Recording Student Attendance</w:t>
       </w:r>
@@ -13558,7 +13561,7 @@
         <w:keepNext/>
         <w:spacing w:before="100" w:after="60"/>
       </w:pPr>
-      <w:bookmarkStart w:id="60" w:name="_Toc242925321"/>
+      <w:bookmarkStart w:id="60" w:name="_Toc243004492"/>
       <w:r>
         <w:t>Figure 4.2 Memorisation Progress Tracking</w:t>
       </w:r>
@@ -13721,7 +13724,7 @@
         <w:keepNext/>
         <w:spacing w:before="100" w:after="60"/>
       </w:pPr>
-      <w:bookmarkStart w:id="61" w:name="_Toc242925322"/>
+      <w:bookmarkStart w:id="61" w:name="_Toc243004493"/>
       <w:r>
         <w:t>Figure 4.3 Fee Collection Methods</w:t>
       </w:r>
@@ -13905,7 +13908,7 @@
         <w:keepNext/>
         <w:spacing w:before="100" w:after="60"/>
       </w:pPr>
-      <w:bookmarkStart w:id="62" w:name="_Toc242925323"/>
+      <w:bookmarkStart w:id="62" w:name="_Toc243004494"/>
       <w:r>
         <w:t>Figure 4.4 Parent Access to Child Progress</w:t>
       </w:r>
@@ -14067,7 +14070,7 @@
         <w:keepNext/>
         <w:spacing w:before="100" w:after="60"/>
       </w:pPr>
-      <w:bookmarkStart w:id="63" w:name="_Toc242925324"/>
+      <w:bookmarkStart w:id="63" w:name="_Toc243004495"/>
       <w:r>
         <w:t>Figure 4.5 Willingness to Pay Fees via M-Pesa</w:t>
       </w:r>
@@ -14252,7 +14255,7 @@
         <w:keepNext/>
         <w:spacing w:before="100" w:after="60"/>
       </w:pPr>
-      <w:bookmarkStart w:id="64" w:name="_Toc242925325"/>
+      <w:bookmarkStart w:id="64" w:name="_Toc243004496"/>
       <w:r>
         <w:t>Figure 4.6 Recitation Assessment Methods</w:t>
       </w:r>
@@ -14414,7 +14417,7 @@
         <w:keepNext/>
         <w:spacing w:before="100" w:after="60"/>
       </w:pPr>
-      <w:bookmarkStart w:id="65" w:name="_Toc242925326"/>
+      <w:bookmarkStart w:id="65" w:name="_Toc243004497"/>
       <w:r>
         <w:t>Figure 4.7 Digital Recitation Practice</w:t>
       </w:r>
@@ -14486,7 +14489,7 @@
         <w:keepLines/>
         <w:spacing w:before="280" w:after="140"/>
       </w:pPr>
-      <w:bookmarkStart w:id="66" w:name="_Toc242925253"/>
+      <w:bookmarkStart w:id="66" w:name="_Toc243004424"/>
       <w:r>
         <w:t>4.6 Secondary Data Collection</w:t>
       </w:r>
@@ -14511,7 +14514,7 @@
         <w:keepLines/>
         <w:spacing w:before="280" w:after="140"/>
       </w:pPr>
-      <w:bookmarkStart w:id="67" w:name="_Toc242925254"/>
+      <w:bookmarkStart w:id="67" w:name="_Toc243004425"/>
       <w:r>
         <w:t>4.7 Requirements and Stakeholders Identification</w:t>
       </w:r>
@@ -14609,7 +14612,7 @@
         <w:keepLines/>
         <w:spacing w:before="280" w:after="140"/>
       </w:pPr>
-      <w:bookmarkStart w:id="68" w:name="_Toc242925255"/>
+      <w:bookmarkStart w:id="68" w:name="_Toc243004426"/>
       <w:r>
         <w:t>4.8 Challenges in Requirements Gathering and Analysis</w:t>
       </w:r>
@@ -14712,7 +14715,7 @@
         <w:keepLines/>
         <w:spacing w:before="280" w:after="140"/>
       </w:pPr>
-      <w:bookmarkStart w:id="69" w:name="_Toc242925256"/>
+      <w:bookmarkStart w:id="69" w:name="_Toc243004427"/>
       <w:r>
         <w:t>4.9 Summary</w:t>
       </w:r>
@@ -14749,7 +14752,7 @@
         <w:pStyle w:val="Heading1"/>
         <w:spacing w:before="120" w:after="200"/>
       </w:pPr>
-      <w:bookmarkStart w:id="70" w:name="_Toc242925257"/>
+      <w:bookmarkStart w:id="70" w:name="_Toc243004428"/>
       <w:r>
         <w:t>5. SYSTEM DESIGN</w:t>
       </w:r>
@@ -14762,7 +14765,7 @@
         <w:keepLines/>
         <w:spacing w:before="280" w:after="140"/>
       </w:pPr>
-      <w:bookmarkStart w:id="71" w:name="_Toc242925258"/>
+      <w:bookmarkStart w:id="71" w:name="_Toc243004429"/>
       <w:r>
         <w:t>5.1 Introduction</w:t>
       </w:r>
@@ -14784,7 +14787,7 @@
         <w:keepLines/>
         <w:spacing w:before="280" w:after="140"/>
       </w:pPr>
-      <w:bookmarkStart w:id="72" w:name="_Toc242925259"/>
+      <w:bookmarkStart w:id="72" w:name="_Toc243004430"/>
       <w:r>
         <w:t>5.2 Structural Diagram</w:t>
       </w:r>
@@ -14806,7 +14809,7 @@
         <w:keepLines/>
         <w:spacing w:before="220" w:after="120"/>
       </w:pPr>
-      <w:bookmarkStart w:id="73" w:name="_Toc242925260"/>
+      <w:bookmarkStart w:id="73" w:name="_Toc243004431"/>
       <w:r>
         <w:t>5.2.1 Class Diagram</w:t>
       </w:r>
@@ -14833,7 +14836,7 @@
         </w:rPr>
         <w:lastRenderedPageBreak/>
         <w:drawing>
-          <wp:inline distT="0" distB="0" distL="0" distR="0" wp14:anchorId="189A34B8" wp14:editId="189A34B9">
+          <wp:inline distT="0" distB="0" distL="0" distR="0" wp14:anchorId="4FB947F2" wp14:editId="1209FD23">
             <wp:extent cx="5124450" cy="6486525"/>
             <wp:effectExtent l="0" t="0" r="0" b="0"/>
             <wp:docPr id="2" name="Picture 2"/>
@@ -14876,7 +14879,7 @@
       <w:pPr>
         <w:pStyle w:val="FigureCaption"/>
       </w:pPr>
-      <w:bookmarkStart w:id="74" w:name="_Toc242925327"/>
+      <w:bookmarkStart w:id="74" w:name="_Toc243004498"/>
       <w:r>
         <w:t>Figure 5.1 Class Diagram</w:t>
       </w:r>
@@ -14889,7 +14892,7 @@
         <w:keepLines/>
         <w:spacing w:before="220" w:after="120"/>
       </w:pPr>
-      <w:bookmarkStart w:id="75" w:name="_Toc242925261"/>
+      <w:bookmarkStart w:id="75" w:name="_Toc243004432"/>
       <w:r>
         <w:t>5.2.2 Entity Relationship Diagram (ERD)</w:t>
       </w:r>
@@ -14919,7 +14922,7 @@
           <w:noProof/>
         </w:rPr>
         <w:drawing>
-          <wp:inline distT="0" distB="0" distL="0" distR="0" wp14:anchorId="189A34BA" wp14:editId="189A34BB">
+          <wp:inline distT="0" distB="0" distL="0" distR="0" wp14:anchorId="2440E29C" wp14:editId="68424BAB">
             <wp:extent cx="5486400" cy="7124700"/>
             <wp:effectExtent l="0" t="0" r="0" b="0"/>
             <wp:docPr id="3" name="Picture 3"/>
@@ -14962,7 +14965,7 @@
       <w:pPr>
         <w:pStyle w:val="FigureCaption"/>
       </w:pPr>
-      <w:bookmarkStart w:id="76" w:name="_Toc242925328"/>
+      <w:bookmarkStart w:id="76" w:name="_Toc243004499"/>
       <w:r>
         <w:t>Figure 5.2 ERD Diagram</w:t>
       </w:r>
@@ -14975,7 +14978,7 @@
         <w:keepLines/>
         <w:spacing w:before="280" w:after="140"/>
       </w:pPr>
-      <w:bookmarkStart w:id="77" w:name="_Toc242925262"/>
+      <w:bookmarkStart w:id="77" w:name="_Toc243004433"/>
       <w:r>
         <w:lastRenderedPageBreak/>
         <w:t>5.3 Behavioral Diagrams</w:t>
@@ -14998,7 +15001,7 @@
         <w:keepLines/>
         <w:spacing w:before="220" w:after="120"/>
       </w:pPr>
-      <w:bookmarkStart w:id="78" w:name="_Toc242925263"/>
+      <w:bookmarkStart w:id="78" w:name="_Toc243004434"/>
       <w:r>
         <w:t>5.3.1 Use Case Diagram</w:t>
       </w:r>
@@ -15028,7 +15031,7 @@
         </w:rPr>
         <w:lastRenderedPageBreak/>
         <w:drawing>
-          <wp:inline distT="0" distB="0" distL="0" distR="0" wp14:anchorId="189A34BC" wp14:editId="189A34BD">
+          <wp:inline distT="0" distB="0" distL="0" distR="0" wp14:anchorId="525DC685" wp14:editId="7295CFA1">
             <wp:extent cx="5305425" cy="5915025"/>
             <wp:effectExtent l="0" t="0" r="0" b="0"/>
             <wp:docPr id="4" name="Picture 4"/>
@@ -15071,7 +15074,7 @@
       <w:pPr>
         <w:pStyle w:val="FigureCaption"/>
       </w:pPr>
-      <w:bookmarkStart w:id="79" w:name="_Toc242925329"/>
+      <w:bookmarkStart w:id="79" w:name="_Toc243004500"/>
       <w:r>
         <w:t>Figure 5.3 Use Case Diagram</w:t>
       </w:r>
@@ -15084,7 +15087,7 @@
         <w:keepLines/>
         <w:spacing w:before="220" w:after="120"/>
       </w:pPr>
-      <w:bookmarkStart w:id="80" w:name="_Toc242925264"/>
+      <w:bookmarkStart w:id="80" w:name="_Toc243004435"/>
       <w:r>
         <w:t>5.3.2 Sequence Diagram</w:t>
       </w:r>
@@ -15111,7 +15114,7 @@
         </w:rPr>
         <w:lastRenderedPageBreak/>
         <w:drawing>
-          <wp:inline distT="0" distB="0" distL="0" distR="0" wp14:anchorId="189A34BE" wp14:editId="189A34BF">
+          <wp:inline distT="0" distB="0" distL="0" distR="0" wp14:anchorId="784B423B" wp14:editId="7A38BD41">
             <wp:extent cx="5762625" cy="4572000"/>
             <wp:effectExtent l="0" t="0" r="0" b="0"/>
             <wp:docPr id="5" name="Picture 5"/>
@@ -15154,7 +15157,7 @@
       <w:pPr>
         <w:pStyle w:val="FigureCaption"/>
       </w:pPr>
-      <w:bookmarkStart w:id="81" w:name="_Toc242925330"/>
+      <w:bookmarkStart w:id="81" w:name="_Toc243004501"/>
       <w:r>
         <w:t>Figure 5.4 Sequence Diagram</w:t>
       </w:r>
@@ -15167,7 +15170,7 @@
         <w:keepLines/>
         <w:spacing w:before="220" w:after="120"/>
       </w:pPr>
-      <w:bookmarkStart w:id="82" w:name="_Toc242925265"/>
+      <w:bookmarkStart w:id="82" w:name="_Toc243004436"/>
       <w:r>
         <w:t>5.3.3 Activity Diagram</w:t>
       </w:r>
@@ -15194,7 +15197,7 @@
         </w:rPr>
         <w:lastRenderedPageBreak/>
         <w:drawing>
-          <wp:inline distT="0" distB="0" distL="0" distR="0" wp14:anchorId="189A34C0" wp14:editId="189A34C1">
+          <wp:inline distT="0" distB="0" distL="0" distR="0" wp14:anchorId="6DC14F23" wp14:editId="2C05DA8B">
             <wp:extent cx="4210050" cy="5038725"/>
             <wp:effectExtent l="0" t="0" r="0" b="0"/>
             <wp:docPr id="6" name="Picture 6"/>
@@ -15237,7 +15240,7 @@
       <w:pPr>
         <w:pStyle w:val="FigureCaption"/>
       </w:pPr>
-      <w:bookmarkStart w:id="83" w:name="_Toc242925331"/>
+      <w:bookmarkStart w:id="83" w:name="_Toc243004502"/>
       <w:r>
         <w:t>Figure 5.5 Activity Diagram</w:t>
       </w:r>
@@ -15250,7 +15253,7 @@
         <w:keepLines/>
         <w:spacing w:before="280" w:after="140"/>
       </w:pPr>
-      <w:bookmarkStart w:id="84" w:name="_Toc242925266"/>
+      <w:bookmarkStart w:id="84" w:name="_Toc243004437"/>
       <w:r>
         <w:t>5.4 Database Schema</w:t>
       </w:r>
@@ -15277,7 +15280,7 @@
         </w:rPr>
         <w:lastRenderedPageBreak/>
         <w:drawing>
-          <wp:inline distT="0" distB="0" distL="0" distR="0" wp14:anchorId="189A34C2" wp14:editId="189A34C3">
+          <wp:inline distT="0" distB="0" distL="0" distR="0" wp14:anchorId="779DBE77" wp14:editId="79A0CF5E">
             <wp:extent cx="5667375" cy="4914900"/>
             <wp:effectExtent l="0" t="0" r="0" b="0"/>
             <wp:docPr id="7" name="Picture 7"/>
@@ -15320,7 +15323,7 @@
       <w:pPr>
         <w:pStyle w:val="FigureCaption"/>
       </w:pPr>
-      <w:bookmarkStart w:id="85" w:name="_Toc242925332"/>
+      <w:bookmarkStart w:id="85" w:name="_Toc243004503"/>
       <w:r>
         <w:t>Figure 5.6 Database Schema</w:t>
       </w:r>
@@ -15333,7 +15336,7 @@
         <w:keepLines/>
         <w:spacing w:before="280" w:after="140"/>
       </w:pPr>
-      <w:bookmarkStart w:id="86" w:name="_Toc242925267"/>
+      <w:bookmarkStart w:id="86" w:name="_Toc243004438"/>
       <w:r>
         <w:t>5.5 Wireframes</w:t>
       </w:r>
@@ -15360,7 +15363,7 @@
         </w:rPr>
         <w:lastRenderedPageBreak/>
         <w:drawing>
-          <wp:inline distT="0" distB="0" distL="0" distR="0" wp14:anchorId="189A34C4" wp14:editId="189A34C5">
+          <wp:inline distT="0" distB="0" distL="0" distR="0" wp14:anchorId="294037F8" wp14:editId="1FAFF173">
             <wp:extent cx="5762625" cy="3381375"/>
             <wp:effectExtent l="0" t="0" r="0" b="0"/>
             <wp:docPr id="8" name="Picture 8"/>
@@ -15403,7 +15406,7 @@
       <w:pPr>
         <w:pStyle w:val="FigureCaption"/>
       </w:pPr>
-      <w:bookmarkStart w:id="87" w:name="_Toc242925333"/>
+      <w:bookmarkStart w:id="87" w:name="_Toc243004504"/>
       <w:r>
         <w:t>Figure 5.7 Wireframes</w:t>
       </w:r>
@@ -15416,7 +15419,7 @@
         <w:keepLines/>
         <w:spacing w:before="280" w:after="140"/>
       </w:pPr>
-      <w:bookmarkStart w:id="88" w:name="_Toc242925268"/>
+      <w:bookmarkStart w:id="88" w:name="_Toc243004439"/>
       <w:r>
         <w:t>5.6 Summary</w:t>
       </w:r>
@@ -15453,7 +15456,7 @@
         <w:pStyle w:val="Heading1"/>
         <w:spacing w:before="120" w:after="200"/>
       </w:pPr>
-      <w:bookmarkStart w:id="89" w:name="_Toc242925269"/>
+      <w:bookmarkStart w:id="89" w:name="_Toc243004440"/>
       <w:r>
         <w:t>6. SYSTEM DEVELOPMENT</w:t>
       </w:r>
@@ -15466,7 +15469,7 @@
         <w:keepLines/>
         <w:spacing w:before="280" w:after="140"/>
       </w:pPr>
-      <w:bookmarkStart w:id="90" w:name="_Toc242925270"/>
+      <w:bookmarkStart w:id="90" w:name="_Toc243004441"/>
       <w:r>
         <w:t>6.1 Introduction</w:t>
       </w:r>
@@ -15488,7 +15491,7 @@
         <w:keepLines/>
         <w:spacing w:before="280" w:after="140"/>
       </w:pPr>
-      <w:bookmarkStart w:id="91" w:name="_Toc242925271"/>
+      <w:bookmarkStart w:id="91" w:name="_Toc243004442"/>
       <w:r>
         <w:t>6.2 System Development Tools and Techniques</w:t>
       </w:r>
@@ -15510,7 +15513,7 @@
         <w:keepLines/>
         <w:spacing w:before="220" w:after="120"/>
       </w:pPr>
-      <w:bookmarkStart w:id="92" w:name="_Toc242925272"/>
+      <w:bookmarkStart w:id="92" w:name="_Toc243004443"/>
       <w:r>
         <w:t>6.2.1 Integrated Development Environment (IDE)</w:t>
       </w:r>
@@ -15609,7 +15612,7 @@
         <w:keepNext/>
         <w:spacing w:before="100" w:after="60"/>
       </w:pPr>
-      <w:bookmarkStart w:id="93" w:name="_Toc242925334"/>
+      <w:bookmarkStart w:id="93" w:name="_Toc243004505"/>
       <w:r>
         <w:t>Figure 6.1 Visual Studio Code</w:t>
       </w:r>
@@ -15637,7 +15640,7 @@
         <w:keepLines/>
         <w:spacing w:before="220" w:after="120"/>
       </w:pPr>
-      <w:bookmarkStart w:id="94" w:name="_Toc242925273"/>
+      <w:bookmarkStart w:id="94" w:name="_Toc243004444"/>
       <w:r>
         <w:t>6.2.2 Front-end Development</w:t>
       </w:r>
@@ -15662,7 +15665,7 @@
         <w:keepLines/>
         <w:spacing w:before="220" w:after="120"/>
       </w:pPr>
-      <w:bookmarkStart w:id="95" w:name="_Toc242925274"/>
+      <w:bookmarkStart w:id="95" w:name="_Toc243004445"/>
       <w:r>
         <w:t>6.2.3 Database Management Tools</w:t>
       </w:r>
@@ -15771,7 +15774,7 @@
         <w:keepNext/>
         <w:spacing w:before="100" w:after="60"/>
       </w:pPr>
-      <w:bookmarkStart w:id="96" w:name="_Toc242925335"/>
+      <w:bookmarkStart w:id="96" w:name="_Toc243004506"/>
       <w:r>
         <w:t>Figure 6.2 Supabase Setup</w:t>
       </w:r>
@@ -15799,7 +15802,7 @@
         <w:keepLines/>
         <w:spacing w:before="280" w:after="140"/>
       </w:pPr>
-      <w:bookmarkStart w:id="97" w:name="_Toc242925275"/>
+      <w:bookmarkStart w:id="97" w:name="_Toc243004446"/>
       <w:r>
         <w:t>6.3 System Interfaces</w:t>
       </w:r>
@@ -15848,7 +15851,7 @@
         </w:rPr>
         <w:lastRenderedPageBreak/>
         <w:drawing>
-          <wp:inline distT="0" distB="0" distL="0" distR="0" wp14:anchorId="189A34C6" wp14:editId="189A34C7">
+          <wp:inline distT="0" distB="0" distL="0" distR="0" wp14:anchorId="3BCE7FC6" wp14:editId="7C08B534">
             <wp:extent cx="2381250" cy="5286375"/>
             <wp:effectExtent l="0" t="0" r="0" b="0"/>
             <wp:docPr id="9" name="Picture 9"/>
@@ -15891,7 +15894,7 @@
       <w:pPr>
         <w:pStyle w:val="FigureCaption"/>
       </w:pPr>
-      <w:bookmarkStart w:id="98" w:name="_Toc242925336"/>
+      <w:bookmarkStart w:id="98" w:name="_Toc243004507"/>
       <w:r>
         <w:t>Figure 6.3 App Interface Sign Up</w:t>
       </w:r>
@@ -15931,7 +15934,7 @@
         </w:rPr>
         <w:lastRenderedPageBreak/>
         <w:drawing>
-          <wp:inline distT="0" distB="0" distL="0" distR="0" wp14:anchorId="189A34C8" wp14:editId="189A34C9">
+          <wp:inline distT="0" distB="0" distL="0" distR="0" wp14:anchorId="751C89C4" wp14:editId="62DE2A66">
             <wp:extent cx="2381250" cy="5286375"/>
             <wp:effectExtent l="0" t="0" r="0" b="0"/>
             <wp:docPr id="10" name="Picture 10"/>
@@ -15974,7 +15977,7 @@
       <w:pPr>
         <w:pStyle w:val="FigureCaption"/>
       </w:pPr>
-      <w:bookmarkStart w:id="99" w:name="_Toc242925337"/>
+      <w:bookmarkStart w:id="99" w:name="_Toc243004508"/>
       <w:r>
         <w:t>Figure 6.4 Owner Dashboard</w:t>
       </w:r>
@@ -16014,7 +16017,7 @@
         </w:rPr>
         <w:lastRenderedPageBreak/>
         <w:drawing>
-          <wp:inline distT="0" distB="0" distL="0" distR="0" wp14:anchorId="189A34CA" wp14:editId="189A34CB">
+          <wp:inline distT="0" distB="0" distL="0" distR="0" wp14:anchorId="000D7130" wp14:editId="1EBBE1A8">
             <wp:extent cx="2381250" cy="5286375"/>
             <wp:effectExtent l="0" t="0" r="0" b="0"/>
             <wp:docPr id="11" name="Picture 11"/>
@@ -16057,7 +16060,7 @@
       <w:pPr>
         <w:pStyle w:val="FigureCaption"/>
       </w:pPr>
-      <w:bookmarkStart w:id="100" w:name="_Toc242925338"/>
+      <w:bookmarkStart w:id="100" w:name="_Toc243004509"/>
       <w:r>
         <w:t>Figure 6.5 Teacher Dashboard</w:t>
       </w:r>
@@ -16097,7 +16100,7 @@
         </w:rPr>
         <w:lastRenderedPageBreak/>
         <w:drawing>
-          <wp:inline distT="0" distB="0" distL="0" distR="0" wp14:anchorId="189A34CC" wp14:editId="189A34CD">
+          <wp:inline distT="0" distB="0" distL="0" distR="0" wp14:anchorId="28CCABBF" wp14:editId="4EE58AF6">
             <wp:extent cx="2381250" cy="5286375"/>
             <wp:effectExtent l="0" t="0" r="0" b="0"/>
             <wp:docPr id="12" name="Picture 12"/>
@@ -16140,7 +16143,7 @@
       <w:pPr>
         <w:pStyle w:val="FigureCaption"/>
       </w:pPr>
-      <w:bookmarkStart w:id="101" w:name="_Toc242925339"/>
+      <w:bookmarkStart w:id="101" w:name="_Toc243004510"/>
       <w:r>
         <w:t>Figure 6.6 Parent Dashboard</w:t>
       </w:r>
@@ -16180,7 +16183,7 @@
         </w:rPr>
         <w:lastRenderedPageBreak/>
         <w:drawing>
-          <wp:inline distT="0" distB="0" distL="0" distR="0" wp14:anchorId="189A34CE" wp14:editId="189A34CF">
+          <wp:inline distT="0" distB="0" distL="0" distR="0" wp14:anchorId="5710F1A2" wp14:editId="4012ADC4">
             <wp:extent cx="2381250" cy="5286375"/>
             <wp:effectExtent l="0" t="0" r="0" b="0"/>
             <wp:docPr id="13" name="Picture 13"/>
@@ -16223,7 +16226,7 @@
       <w:pPr>
         <w:pStyle w:val="FigureCaption"/>
       </w:pPr>
-      <w:bookmarkStart w:id="102" w:name="_Toc242925340"/>
+      <w:bookmarkStart w:id="102" w:name="_Toc243004511"/>
       <w:r>
         <w:t>Figure 6.7 Student Dashboard</w:t>
       </w:r>
@@ -16239,7 +16242,7 @@
           <w:b/>
           <w:bCs/>
         </w:rPr>
-        <w:t>Recitation and Live Learning Interfaces</w:t>
+        <w:t>Recitation, Live Learning and Badge Interfaces</w:t>
       </w:r>
     </w:p>
     <w:p>
@@ -16248,7 +16251,7 @@
         <w:jc w:val="both"/>
       </w:pPr>
       <w:r>
-        <w:t>Figure 6.8 shows the learning features. A teacher reviewing a recitation can play the pupil and a master reciter ayah by ayah; in the live reading room pupils raise their hands, the teacher chooses a reader, the ayah is highlighted on every phone and the teacher marks the reading; and the video library plays the Quran videos the teacher has chosen for the class.</w:t>
+        <w:t>Figure 6.8 shows the learning features. A teacher reviewing a recitation can play the pupil and a master reciter ayah by ayah; in the live reading room pupils raise their hands, the teacher chooses a reader, the ayah is highlighted on every phone and the teacher marks the reading; the video library plays the Quran videos the teacher has chosen for the class; and badges, worked out from the pupil’s own records, encourage the pupil.</w:t>
       </w:r>
     </w:p>
     <w:p>
@@ -16263,8 +16266,8 @@
         </w:rPr>
         <w:lastRenderedPageBreak/>
         <w:drawing>
-          <wp:inline distT="0" distB="0" distL="0" distR="0" wp14:anchorId="189A34D0" wp14:editId="189A34D1">
-            <wp:extent cx="5667375" cy="4257675"/>
+          <wp:inline distT="0" distB="0" distL="0" distR="0" wp14:anchorId="27A110D8" wp14:editId="691003BC">
+            <wp:extent cx="5667375" cy="3181350"/>
             <wp:effectExtent l="0" t="0" r="0" b="0"/>
             <wp:docPr id="14" name="Picture 14"/>
             <wp:cNvGraphicFramePr>
@@ -16289,7 +16292,7 @@
                   <pic:spPr bwMode="auto">
                     <a:xfrm>
                       <a:off x="0" y="0"/>
-                      <a:ext cx="5667375" cy="4257675"/>
+                      <a:ext cx="5667375" cy="3181350"/>
                     </a:xfrm>
                     <a:prstGeom prst="rect">
                       <a:avLst/>
@@ -16306,9 +16309,9 @@
       <w:pPr>
         <w:pStyle w:val="FigureCaption"/>
       </w:pPr>
-      <w:bookmarkStart w:id="103" w:name="_Toc242925341"/>
-      <w:r>
-        <w:t>Figure 6.8 Recitation and Live Learning Interfaces</w:t>
+      <w:bookmarkStart w:id="103" w:name="_Toc243004512"/>
+      <w:r>
+        <w:t>Figure 6.8 Recitation, Live Learning and Badge Interfaces</w:t>
       </w:r>
       <w:bookmarkEnd w:id="103"/>
     </w:p>
@@ -16346,7 +16349,7 @@
         </w:rPr>
         <w:lastRenderedPageBreak/>
         <w:drawing>
-          <wp:inline distT="0" distB="0" distL="0" distR="0" wp14:anchorId="189A34D2" wp14:editId="189A34D3">
+          <wp:inline distT="0" distB="0" distL="0" distR="0" wp14:anchorId="266C3843" wp14:editId="20B72A93">
             <wp:extent cx="5667375" cy="3181350"/>
             <wp:effectExtent l="0" t="0" r="0" b="0"/>
             <wp:docPr id="15" name="Picture 15"/>
@@ -16389,7 +16392,7 @@
       <w:pPr>
         <w:pStyle w:val="FigureCaption"/>
       </w:pPr>
-      <w:bookmarkStart w:id="104" w:name="_Toc242925342"/>
+      <w:bookmarkStart w:id="104" w:name="_Toc243004513"/>
       <w:r>
         <w:t>Figure 6.9 Payment, Messaging and Offline Interfaces</w:t>
       </w:r>
@@ -16402,7 +16405,7 @@
         <w:keepLines/>
         <w:spacing w:before="280" w:after="140"/>
       </w:pPr>
-      <w:bookmarkStart w:id="105" w:name="_Toc242925276"/>
+      <w:bookmarkStart w:id="105" w:name="_Toc243004447"/>
       <w:r>
         <w:t>6.4 Challenges Encountered During Development</w:t>
       </w:r>
@@ -16424,7 +16427,7 @@
         <w:keepLines/>
         <w:spacing w:before="220" w:after="120"/>
       </w:pPr>
-      <w:bookmarkStart w:id="106" w:name="_Toc242925277"/>
+      <w:bookmarkStart w:id="106" w:name="_Toc243004448"/>
       <w:r>
         <w:t>6.4.1 Technical Complexities</w:t>
       </w:r>
@@ -16456,7 +16459,7 @@
         <w:keepLines/>
         <w:spacing w:before="220" w:after="120"/>
       </w:pPr>
-      <w:bookmarkStart w:id="107" w:name="_Toc242925278"/>
+      <w:bookmarkStart w:id="107" w:name="_Toc243004449"/>
       <w:r>
         <w:t>6.4.2 User Adoption and Resistance</w:t>
       </w:r>
@@ -16478,7 +16481,7 @@
         <w:keepLines/>
         <w:spacing w:before="220" w:after="120"/>
       </w:pPr>
-      <w:bookmarkStart w:id="108" w:name="_Toc242925279"/>
+      <w:bookmarkStart w:id="108" w:name="_Toc243004450"/>
       <w:r>
         <w:t>6.4.3 Economic Constraints</w:t>
       </w:r>
@@ -16503,7 +16506,7 @@
         <w:keepLines/>
         <w:spacing w:before="220" w:after="120"/>
       </w:pPr>
-      <w:bookmarkStart w:id="109" w:name="_Toc242925280"/>
+      <w:bookmarkStart w:id="109" w:name="_Toc243004451"/>
       <w:r>
         <w:t>6.4.4 Continuous Updates and Supports</w:t>
       </w:r>
@@ -16525,7 +16528,7 @@
         <w:keepLines/>
         <w:spacing w:before="280" w:after="140"/>
       </w:pPr>
-      <w:bookmarkStart w:id="110" w:name="_Toc242925281"/>
+      <w:bookmarkStart w:id="110" w:name="_Toc243004452"/>
       <w:r>
         <w:t>6.5 Summary</w:t>
       </w:r>
@@ -16537,10 +16540,7 @@
         <w:jc w:val="both"/>
       </w:pPr>
       <w:r>
-        <w:t>This chapter described the development of the Digital Madrasa Mobile Application (ILMORA): Visual Studio Code as the development environment, React Native with Expo for the front end, and Supabase for the database, authentication, storage and server functions. It presented the sign-up screen and the dashboards for owners, teachers, parents and students together with the learning, payment and messaging features, and discussed the challenges of technical complexity, user adoption, limited resources and contin</w:t>
-      </w:r>
-      <w:r>
-        <w:t>uous maintenance, together with how each was addressed.</w:t>
+        <w:t>This chapter described the development of the Digital Madrasa Mobile Application (ILMORA): Visual Studio Code as the development environment, React Native with Expo for the front end, and Supabase for the database, authentication, storage and server functions. It presented the sign-up screen and the main interfaces, and discussed the challenges of technical complexity, user adoption, limited resources and continuous maintenance, together with how each was addressed.</w:t>
       </w:r>
     </w:p>
     <w:p>
@@ -16565,7 +16565,7 @@
         <w:pStyle w:val="Heading1"/>
         <w:spacing w:before="120" w:after="200"/>
       </w:pPr>
-      <w:bookmarkStart w:id="111" w:name="_Toc242925282"/>
+      <w:bookmarkStart w:id="111" w:name="_Toc243004453"/>
       <w:r>
         <w:t>7. SYSTEM TESTING AND DEPLOYMENT</w:t>
       </w:r>
@@ -16578,7 +16578,7 @@
         <w:keepLines/>
         <w:spacing w:before="280" w:after="140"/>
       </w:pPr>
-      <w:bookmarkStart w:id="112" w:name="_Toc242925283"/>
+      <w:bookmarkStart w:id="112" w:name="_Toc243004454"/>
       <w:r>
         <w:t>7.1 Introduction</w:t>
       </w:r>
@@ -16600,7 +16600,7 @@
         <w:keepLines/>
         <w:spacing w:before="280" w:after="140"/>
       </w:pPr>
-      <w:bookmarkStart w:id="113" w:name="_Toc242925284"/>
+      <w:bookmarkStart w:id="113" w:name="_Toc243004455"/>
       <w:r>
         <w:t>7.2 System Testing and Validation</w:t>
       </w:r>
@@ -16622,7 +16622,7 @@
         <w:keepLines/>
         <w:spacing w:before="220" w:after="120"/>
       </w:pPr>
-      <w:bookmarkStart w:id="114" w:name="_Toc242925285"/>
+      <w:bookmarkStart w:id="114" w:name="_Toc243004456"/>
       <w:r>
         <w:t>7.2.1 Unit Tests</w:t>
       </w:r>
@@ -16634,7 +16634,10 @@
         <w:jc w:val="both"/>
       </w:pPr>
       <w:r>
-        <w:t>Unit testing examines individual components in isolation. Unit tests were written with Vitest for the logic that does not need a server: input validation, QR token signing, M-Pesa and card payment handling, notification rules, memorisation totals, recitation assessment, the AI assistant’s check on figures, the hifz plan, master-reciter timing, video links and the offline attendance queue. All 172 unit tests in 22 test files passed when run on 15 October 2026. Table 7.1 shows representative cases.</w:t>
+        <w:t>Unit testing examines individual components in isolation. Unit tests were written with Vitest for the logic that does not need a server: input validation, QR token signing, M-Pesa and card payment handling, notification rules, memorisation totals, recitation assessment, the AI assistant’s check on figures, the hifz plan, master-reciter timing, video links, the offline attendance queue, and streaks and badges. All 185 unit tests in 23 test files passed when run on 16 October 2026. Table 7.1 shows representat</w:t>
+      </w:r>
+      <w:r>
+        <w:t>ive cases.</w:t>
       </w:r>
     </w:p>
     <w:p>
@@ -17811,7 +17814,7 @@
       <w:pPr>
         <w:pStyle w:val="TableCaption"/>
       </w:pPr>
-      <w:bookmarkStart w:id="115" w:name="_Toc242925347"/>
+      <w:bookmarkStart w:id="115" w:name="_Toc243004518"/>
       <w:r>
         <w:t>Table 7.1 Unit Testing</w:t>
       </w:r>
@@ -17824,7 +17827,7 @@
         <w:keepLines/>
         <w:spacing w:before="220" w:after="120"/>
       </w:pPr>
-      <w:bookmarkStart w:id="116" w:name="_Toc242925286"/>
+      <w:bookmarkStart w:id="116" w:name="_Toc243004457"/>
       <w:r>
         <w:t>7.2.2 Functional Testing</w:t>
       </w:r>
@@ -19052,7 +19055,7 @@
       <w:pPr>
         <w:pStyle w:val="TableCaption"/>
       </w:pPr>
-      <w:bookmarkStart w:id="117" w:name="_Toc242925348"/>
+      <w:bookmarkStart w:id="117" w:name="_Toc243004519"/>
       <w:r>
         <w:t>Table 7.2 Functional Testing</w:t>
       </w:r>
@@ -19065,7 +19068,7 @@
         <w:keepLines/>
         <w:spacing w:before="220" w:after="120"/>
       </w:pPr>
-      <w:bookmarkStart w:id="118" w:name="_Toc242925287"/>
+      <w:bookmarkStart w:id="118" w:name="_Toc243004458"/>
       <w:r>
         <w:t>7.2.3 User Interface (UI) Testing</w:t>
       </w:r>
@@ -20051,7 +20054,7 @@
       <w:pPr>
         <w:pStyle w:val="TableCaption"/>
       </w:pPr>
-      <w:bookmarkStart w:id="119" w:name="_Toc242925349"/>
+      <w:bookmarkStart w:id="119" w:name="_Toc243004520"/>
       <w:r>
         <w:t>Table 7.3 User Interface Testing</w:t>
       </w:r>
@@ -20064,7 +20067,7 @@
         <w:keepLines/>
         <w:spacing w:before="280" w:after="140"/>
       </w:pPr>
-      <w:bookmarkStart w:id="120" w:name="_Toc242925288"/>
+      <w:bookmarkStart w:id="120" w:name="_Toc243004459"/>
       <w:r>
         <w:t>7.3 Testing Results</w:t>
       </w:r>
@@ -20283,7 +20286,7 @@
                 <w:sz w:val="20"/>
                 <w:szCs w:val="20"/>
               </w:rPr>
-              <w:t>172</w:t>
+              <w:t>185</w:t>
             </w:r>
           </w:p>
         </w:tc>
@@ -20306,7 +20309,7 @@
                 <w:sz w:val="20"/>
                 <w:szCs w:val="20"/>
               </w:rPr>
-              <w:t>172</w:t>
+              <w:t>185</w:t>
             </w:r>
           </w:p>
         </w:tc>
@@ -20713,7 +20716,7 @@
       <w:pPr>
         <w:pStyle w:val="TableCaption"/>
       </w:pPr>
-      <w:bookmarkStart w:id="121" w:name="_Toc242925350"/>
+      <w:bookmarkStart w:id="121" w:name="_Toc243004521"/>
       <w:r>
         <w:t>Table 7.4 Testing Results</w:t>
       </w:r>
@@ -20726,7 +20729,7 @@
         <w:keepLines/>
         <w:spacing w:before="280" w:after="140"/>
       </w:pPr>
-      <w:bookmarkStart w:id="122" w:name="_Toc242925289"/>
+      <w:bookmarkStart w:id="122" w:name="_Toc243004460"/>
       <w:r>
         <w:t>7.4 System Deployment</w:t>
       </w:r>
@@ -20752,7 +20755,7 @@
         <w:keepLines/>
         <w:spacing w:before="220" w:after="120"/>
       </w:pPr>
-      <w:bookmarkStart w:id="123" w:name="_Toc242925290"/>
+      <w:bookmarkStart w:id="123" w:name="_Toc243004461"/>
       <w:r>
         <w:t>7.4.1 Current Deployment Methods</w:t>
       </w:r>
@@ -20795,19 +20798,6 @@
     </w:p>
     <w:p>
       <w:pPr>
-        <w:pStyle w:val="Heading3"/>
-        <w:keepNext/>
-        <w:keepLines/>
-        <w:spacing w:before="220" w:after="120"/>
-      </w:pPr>
-      <w:bookmarkStart w:id="124" w:name="_Toc242925291"/>
-      <w:r>
-        <w:t>7.4.2 Future Deployment Plans</w:t>
-      </w:r>
-      <w:bookmarkEnd w:id="124"/>
-    </w:p>
-    <w:p>
-      <w:pPr>
         <w:pStyle w:val="ListParagraph"/>
         <w:numPr>
           <w:ilvl w:val="0"/>
@@ -20816,8 +20806,21 @@
         <w:spacing w:after="90" w:line="340" w:lineRule="auto"/>
       </w:pPr>
       <w:r>
-        <w:t>Google Play Store: publishing the app will make installation easier and more trusted, and provide automatic updates.</w:t>
-      </w:r>
+        <w:t>Web: the same codebase is published on Expo’s free hosting at https://https-ilmora-expo-app.expo.app, where the administrator’s console runs.</w:t>
+      </w:r>
+    </w:p>
+    <w:p>
+      <w:pPr>
+        <w:pStyle w:val="Heading3"/>
+        <w:keepNext/>
+        <w:keepLines/>
+        <w:spacing w:before="220" w:after="120"/>
+      </w:pPr>
+      <w:bookmarkStart w:id="124" w:name="_Toc243004462"/>
+      <w:r>
+        <w:t>7.4.2 Future Deployment Plans</w:t>
+      </w:r>
+      <w:bookmarkEnd w:id="124"/>
     </w:p>
     <w:p>
       <w:pPr>
@@ -20829,7 +20832,7 @@
         <w:spacing w:after="90" w:line="340" w:lineRule="auto"/>
       </w:pPr>
       <w:r>
-        <w:t>Live payment and messaging services: moving M-Pesa from the Daraja sandbox to a registered Paybill or Till, and connecting Paystack for cards, the e-mail and SMS providers, and Firebase for push notifications, with real credentials.</w:t>
+        <w:t>Google Play Store: publishing the app will make installation easier and more trusted, and provide automatic updates.</w:t>
       </w:r>
     </w:p>
     <w:p>
@@ -20842,7 +20845,7 @@
         <w:spacing w:after="90" w:line="340" w:lineRule="auto"/>
       </w:pPr>
       <w:r>
-        <w:t>In-app video: switching on the built in-app video for live lessons once a funded video provider account is available.</w:t>
+        <w:t>Live payment and messaging services: moving M-Pesa from the Daraja sandbox to a registered Paybill or Till, and connecting Paystack for cards, the e-mail and SMS providers, and Firebase for push notifications, with real credentials.</w:t>
       </w:r>
     </w:p>
     <w:p>
@@ -20855,7 +20858,7 @@
         <w:spacing w:after="90" w:line="340" w:lineRule="auto"/>
       </w:pPr>
       <w:r>
-        <w:t>Web-based dashboard: hosting the platform administrator’s web console so that the madrasas on the platform can be managed from a browser.</w:t>
+        <w:t>In-app video: switching on the built in-app video for live lessons once a funded video provider account is available.</w:t>
       </w:r>
     </w:p>
     <w:p>
@@ -20865,7 +20868,7 @@
         <w:keepLines/>
         <w:spacing w:before="280" w:after="140"/>
       </w:pPr>
-      <w:bookmarkStart w:id="125" w:name="_Toc242925292"/>
+      <w:bookmarkStart w:id="125" w:name="_Toc243004463"/>
       <w:r>
         <w:t>7.5 Summary</w:t>
       </w:r>
@@ -20877,10 +20880,10 @@
         <w:jc w:val="both"/>
       </w:pPr>
       <w:r>
-        <w:t>This chapter presented the testing and deployment of the Digital Madrasa Mobile Application (ILMORA). Unit, functional, database security and user interface testing showed that the core features, including sign-in, admission, attendance, invoicing, M-Pesa and card payment, AI feedback with consent and parent access, work as required on the installed app, and that users cannot reach records outside their madrasa or role. The backend is deployed on Supabase, the app is shared as an APK, and future plans inclu</w:t>
-      </w:r>
-      <w:r>
-        <w:t>de the Google Play Store, live payment and messaging services, and a hosted web dashboard.</w:t>
+        <w:t>This chapter presented the testing and deployment of the Digital Madrasa Mobile Application (ILMORA). Unit, functional, database security and user interface testing showed that the core features, including sign-in, admission, attendance, invoicing, M-Pesa and card payment, AI feedback with consent and parent access, work as required on the installed app, and that users cannot reach records outside their madrasa or role. The backend runs on Supabase, the app is shared as an APK and a website, and future plan</w:t>
+      </w:r>
+      <w:r>
+        <w:t>s include the Play Store, live payments and in-app video.</w:t>
       </w:r>
     </w:p>
     <w:p>
@@ -20905,7 +20908,7 @@
         <w:pStyle w:val="Heading1"/>
         <w:spacing w:before="120" w:after="200"/>
       </w:pPr>
-      <w:bookmarkStart w:id="126" w:name="_Toc242925293"/>
+      <w:bookmarkStart w:id="126" w:name="_Toc243004464"/>
       <w:r>
         <w:t>8. DISCUSSIONS, FUTURE WORKS AND RECOMMENDATIONS</w:t>
       </w:r>
@@ -20918,7 +20921,7 @@
         <w:keepLines/>
         <w:spacing w:before="280" w:after="140"/>
       </w:pPr>
-      <w:bookmarkStart w:id="127" w:name="_Toc242925294"/>
+      <w:bookmarkStart w:id="127" w:name="_Toc243004465"/>
       <w:r>
         <w:t>8.1 Introduction</w:t>
       </w:r>
@@ -20940,7 +20943,7 @@
         <w:keepLines/>
         <w:spacing w:before="280" w:after="140"/>
       </w:pPr>
-      <w:bookmarkStart w:id="128" w:name="_Toc242925295"/>
+      <w:bookmarkStart w:id="128" w:name="_Toc243004466"/>
       <w:r>
         <w:t>8.2 Discussions of Objectives</w:t>
       </w:r>
@@ -21009,14 +21012,14 @@
         <w:jc w:val="both"/>
       </w:pPr>
       <w:r>
-        <w:t xml:space="preserve">The system was developed with React Native and Expo for the front end and Supabase for the backend. Owners, teachers, parents and students each have a dedicated dashboard, and admission, classes, manual and QR attendance, memorisation, assignments, recitation review with AI feedback, certificates, invoicing, M-Pesa and card payment, and notifications were implemented against the live backend. The application, branded ILMORA, also offers master-reciter comparison, recite-along practice, a daily hifz plan, a </w:t>
-      </w:r>
-      <w:r>
-        <w:t xml:space="preserve">live reading room with scheduled Meet or </w:t>
+        <w:t>The system was developed with React Native and Expo for the front end and Supabase for the backend. Owners, teachers, parents and students each have a dedicated dashboard, and admission, classes, manual and QR attendance, memorisation, assignments, recitation review with AI feedback, certificates, invoicing, M-Pesa and card payment, and notifications were implemented against the live backend. The application, branded ILMORA, also offers master-reciter comparison, recite-along practice, a daily hifz plan, hi</w:t>
+      </w:r>
+      <w:r>
+        <w:t>fz streaks and badges, a web console for the platform administrator, a live reading room with scheduled Meet or Zoom sessions, a teacher-</w:t>
       </w:r>
       <w:r>
         <w:lastRenderedPageBreak/>
-        <w:t>Zoom sessions, a teacher-chosen Quran video library, parent–teacher messaging, pupil sponsorship, spoken reports, USSD access, offline attendance and an impact dashboard.</w:t>
+        <w:t>chosen Quran video library, parent–teacher messaging, pupil sponsorship, spoken reports, USSD access, offline attendance and an impact dashboard.</w:t>
       </w:r>
     </w:p>
     <w:p>
@@ -21038,7 +21041,7 @@
         <w:jc w:val="both"/>
       </w:pPr>
       <w:r>
-        <w:t>Unit, functional and user interface testing confirmed that the core features work as required: all 172 unit tests and 78 functional test cases passed, 21 database suites proved 145 security guarantees, and the installed app passed 30 of 31 interface checks. M-Pesa is connected to Safaricom’s Daraja sandbox. The tests showed that users cannot reach records outside their madrasa or role. A usability study with real users, push notifications and testing on a range of physical phones remain to be done.</w:t>
+        <w:t>Unit, functional and user interface testing confirmed that the core features work as required: all 185 unit tests and 78 functional test cases passed, 21 database suites proved 145 security guarantees, and the installed app passed 30 of 31 interface checks. M-Pesa is connected to Safaricom’s Daraja sandbox. The tests showed that users cannot reach records outside their madrasa or role. A usability study with real users, push notifications and testing on a range of physical phones remain to be done.</w:t>
       </w:r>
     </w:p>
     <w:p>
@@ -21048,7 +21051,7 @@
         <w:keepLines/>
         <w:spacing w:before="280" w:after="140"/>
       </w:pPr>
-      <w:bookmarkStart w:id="129" w:name="_Toc242925296"/>
+      <w:bookmarkStart w:id="129" w:name="_Toc243004467"/>
       <w:r>
         <w:t>8.3 Future Work</w:t>
       </w:r>
@@ -21070,7 +21073,7 @@
         <w:keepLines/>
         <w:spacing w:before="220" w:after="120"/>
       </w:pPr>
-      <w:bookmarkStart w:id="130" w:name="_Toc242925297"/>
+      <w:bookmarkStart w:id="130" w:name="_Toc243004468"/>
       <w:r>
         <w:t>8.3.1 Deployment to Google Play Store</w:t>
       </w:r>
@@ -21092,7 +21095,7 @@
         <w:keepLines/>
         <w:spacing w:before="220" w:after="120"/>
       </w:pPr>
-      <w:bookmarkStart w:id="131" w:name="_Toc242925298"/>
+      <w:bookmarkStart w:id="131" w:name="_Toc243004469"/>
       <w:r>
         <w:t>8.3.2 Development of Web-Based Admin Dashboard</w:t>
       </w:r>
@@ -21104,7 +21107,7 @@
         <w:jc w:val="both"/>
       </w:pPr>
       <w:r>
-        <w:t>The platform administrator’s web console should be hosted and extended with reports, so that the madrasas on the platform, their subscriptions and their activity can be monitored from a browser.</w:t>
+        <w:t>The platform administrator’s web console is now hosted and shows every madrasa, the platform’s impact and an audit log. It should be extended with downloadable reports and subscription management, so that the madrasas on the platform, their subscriptions and their activity can be monitored and acted on from a browser.</w:t>
       </w:r>
     </w:p>
     <w:p>
@@ -21114,7 +21117,7 @@
         <w:keepLines/>
         <w:spacing w:before="220" w:after="120"/>
       </w:pPr>
-      <w:bookmarkStart w:id="132" w:name="_Toc242925299"/>
+      <w:bookmarkStart w:id="132" w:name="_Toc243004470"/>
       <w:r>
         <w:t>8.3.3 Integration of Push Notifications and Messaging</w:t>
       </w:r>
@@ -21136,7 +21139,7 @@
         <w:keepLines/>
         <w:spacing w:before="220" w:after="120"/>
       </w:pPr>
-      <w:bookmarkStart w:id="133" w:name="_Toc242925300"/>
+      <w:bookmarkStart w:id="133" w:name="_Toc243004471"/>
       <w:r>
         <w:lastRenderedPageBreak/>
         <w:t>8.3.4 Smart Alerts and Recommendations</w:t>
@@ -21159,7 +21162,7 @@
         <w:keepLines/>
         <w:spacing w:before="220" w:after="120"/>
       </w:pPr>
-      <w:bookmarkStart w:id="134" w:name="_Toc242925301"/>
+      <w:bookmarkStart w:id="134" w:name="_Toc243004472"/>
       <w:r>
         <w:t>8.3.5 Enhanced Offline Functionality</w:t>
       </w:r>
@@ -21181,7 +21184,7 @@
         <w:keepLines/>
         <w:spacing w:before="280" w:after="140"/>
       </w:pPr>
-      <w:bookmarkStart w:id="135" w:name="_Toc242925302"/>
+      <w:bookmarkStart w:id="135" w:name="_Toc243004473"/>
       <w:r>
         <w:t>8.4 Recommendations</w:t>
       </w:r>
@@ -21203,7 +21206,7 @@
         <w:keepLines/>
         <w:spacing w:before="220" w:after="120"/>
       </w:pPr>
-      <w:bookmarkStart w:id="136" w:name="_Toc242925303"/>
+      <w:bookmarkStart w:id="136" w:name="_Toc243004474"/>
       <w:r>
         <w:t>8.4.1 Continuous User Engagement</w:t>
       </w:r>
@@ -21225,7 +21228,7 @@
         <w:keepLines/>
         <w:spacing w:before="220" w:after="120"/>
       </w:pPr>
-      <w:bookmarkStart w:id="137" w:name="_Toc242925304"/>
+      <w:bookmarkStart w:id="137" w:name="_Toc243004475"/>
       <w:r>
         <w:t>8.4.2 Strengthening Data Security</w:t>
       </w:r>
@@ -21247,7 +21250,7 @@
         <w:keepLines/>
         <w:spacing w:before="220" w:after="120"/>
       </w:pPr>
-      <w:bookmarkStart w:id="138" w:name="_Toc242925305"/>
+      <w:bookmarkStart w:id="138" w:name="_Toc243004476"/>
       <w:r>
         <w:t>8.4.3 Regular System Updates</w:t>
       </w:r>
@@ -21269,7 +21272,7 @@
         <w:keepLines/>
         <w:spacing w:before="220" w:after="120"/>
       </w:pPr>
-      <w:bookmarkStart w:id="139" w:name="_Toc242925306"/>
+      <w:bookmarkStart w:id="139" w:name="_Toc243004477"/>
       <w:r>
         <w:t>8.4.4 Institutional and Government Collaboration</w:t>
       </w:r>
@@ -21291,7 +21294,7 @@
         <w:keepLines/>
         <w:spacing w:before="220" w:after="120"/>
       </w:pPr>
-      <w:bookmarkStart w:id="140" w:name="_Toc242925307"/>
+      <w:bookmarkStart w:id="140" w:name="_Toc243004478"/>
       <w:r>
         <w:lastRenderedPageBreak/>
         <w:t>8.4.5 Optimization for Low-End Devices</w:t>
@@ -21314,7 +21317,7 @@
         <w:keepLines/>
         <w:spacing w:before="280" w:after="140"/>
       </w:pPr>
-      <w:bookmarkStart w:id="141" w:name="_Toc242925308"/>
+      <w:bookmarkStart w:id="141" w:name="_Toc243004479"/>
       <w:r>
         <w:t>8.5 Summary</w:t>
       </w:r>
@@ -21326,10 +21329,10 @@
         <w:jc w:val="both"/>
       </w:pPr>
       <w:r>
-        <w:t>This chapter discussed how the Digital Madrasa Mobile Application (ILMORA) addressed the challenges of madrasa administration and Quran learning in Kenya. The system brings records, attendance, memorisation, recitation review, parent access and fee payment into one secure platform. Future work includes publishing on the Google Play Store, a hosted web dashboard, live notifications and payments, in-app video, smart revision alerts and fuller offline support, while the recommendations emphasise user engagemen</w:t>
-      </w:r>
-      <w:r>
-        <w:t>t, data security, regular updates, institutional collaboration and optimisation for low-end devices.</w:t>
+        <w:t>This chapter discussed how the Digital Madrasa Mobile Application (ILMORA) addressed the challenges of madrasa administration and Quran learning in Kenya. The system brings records, attendance, memorisation, recitation review, parent access and fee payment into one secure platform. Future work includes publishing on the Google Play Store, reports in the web console, live notifications and payments, in-app video, smart revision alerts and fuller offline support, while the recommendations emphasise user engag</w:t>
+      </w:r>
+      <w:r>
+        <w:t>ement, data security, regular updates, institutional collaboration and optimisation for low-end devices.</w:t>
       </w:r>
     </w:p>
     <w:p>
@@ -21338,7 +21341,7 @@
         <w:pageBreakBefore/>
         <w:spacing w:before="240" w:after="320"/>
       </w:pPr>
-      <w:bookmarkStart w:id="142" w:name="_Toc242925309"/>
+      <w:bookmarkStart w:id="142" w:name="_Toc243004480"/>
       <w:r>
         <w:lastRenderedPageBreak/>
         <w:t>Appendix</w:t>
@@ -21352,7 +21355,7 @@
         <w:keepLines/>
         <w:spacing w:before="280" w:after="140"/>
       </w:pPr>
-      <w:bookmarkStart w:id="143" w:name="_Toc242925310"/>
+      <w:bookmarkStart w:id="143" w:name="_Toc243004481"/>
       <w:r>
         <w:t>A.1: User Survey Questionnaire</w:t>
       </w:r>
@@ -21365,7 +21368,7 @@
         <w:keepLines/>
         <w:spacing w:before="220" w:after="120"/>
       </w:pPr>
-      <w:bookmarkStart w:id="144" w:name="_Toc242925311"/>
+      <w:bookmarkStart w:id="144" w:name="_Toc243004482"/>
       <w:r>
         <w:t>Section A: Madrasa Owner and Teacher Questionnaire</w:t>
       </w:r>
@@ -21537,7 +21540,7 @@
         <w:keepLines/>
         <w:spacing w:before="220" w:after="120"/>
       </w:pPr>
-      <w:bookmarkStart w:id="145" w:name="_Toc242925312"/>
+      <w:bookmarkStart w:id="145" w:name="_Toc243004483"/>
       <w:r>
         <w:t>Section B: Parent Questionnaire</w:t>
       </w:r>
@@ -21641,7 +21644,7 @@
         <w:keepLines/>
         <w:spacing w:before="220" w:after="120"/>
       </w:pPr>
-      <w:bookmarkStart w:id="146" w:name="_Toc242925313"/>
+      <w:bookmarkStart w:id="146" w:name="_Toc243004484"/>
       <w:r>
         <w:t>Section C: Student Questionnaire</w:t>
       </w:r>
@@ -21752,7 +21755,7 @@
         <w:keepLines/>
         <w:spacing w:before="280" w:after="140"/>
       </w:pPr>
-      <w:bookmarkStart w:id="147" w:name="_Toc242925314"/>
+      <w:bookmarkStart w:id="147" w:name="_Toc243004485"/>
       <w:r>
         <w:t>A.2: Work Plan and Schedule</w:t>
       </w:r>
@@ -22994,7 +22997,7 @@
         <w:keepLines/>
         <w:spacing w:before="280" w:after="140"/>
       </w:pPr>
-      <w:bookmarkStart w:id="148" w:name="_Toc242925315"/>
+      <w:bookmarkStart w:id="148" w:name="_Toc243004486"/>
       <w:r>
         <w:t>A.3: Budget</w:t>
       </w:r>
@@ -24338,7 +24341,7 @@
         <w:keepLines/>
         <w:spacing w:before="280" w:after="140"/>
       </w:pPr>
-      <w:bookmarkStart w:id="149" w:name="_Toc242925316"/>
+      <w:bookmarkStart w:id="149" w:name="_Toc243004487"/>
       <w:r>
         <w:t>A.4: My Project Repository</w:t>
       </w:r>
@@ -24450,7 +24453,7 @@
         <w:keepLines/>
         <w:spacing w:before="280" w:after="140"/>
       </w:pPr>
-      <w:bookmarkStart w:id="150" w:name="_Toc242925317"/>
+      <w:bookmarkStart w:id="150" w:name="_Toc243004488"/>
       <w:r>
         <w:t>A.5: Plagiarism Report</w:t>
       </w:r>
@@ -24546,7 +24549,7 @@
         <w:spacing w:before="240" w:after="320"/>
         <w:jc w:val="center"/>
       </w:pPr>
-      <w:bookmarkStart w:id="151" w:name="_Toc242925318"/>
+      <w:bookmarkStart w:id="151" w:name="_Toc243004489"/>
       <w:r>
         <w:lastRenderedPageBreak/>
         <w:t>REFERENCES</w:t>
@@ -25460,122 +25463,122 @@
 <file path=word/numbering.xml><?xml version="1.0" encoding="utf-8"?>
 <w:numbering xmlns:wpc="http://schemas.microsoft.com/office/word/2010/wordprocessingCanvas" xmlns:cx="http://schemas.microsoft.com/office/drawing/2014/chartex" xmlns:cx1="http://schemas.microsoft.com/office/drawing/2015/9/8/chartex" xmlns:cx2="http://schemas.microsoft.com/office/drawing/2015/10/21/chartex" xmlns:cx3="http://schemas.microsoft.com/office/drawing/2016/5/9/chartex" xmlns:cx4="http://schemas.microsoft.com/office/drawing/2016/5/10/chartex" xmlns:cx5="http://schemas.microsoft.com/office/drawing/2016/5/11/chartex" xmlns:cx6="http://schemas.microsoft.com/office/drawing/2016/5/12/chartex" xmlns:cx7="http://schemas.microsoft.com/office/drawing/2016/5/13/chartex" xmlns:cx8="http://schemas.microsoft.com/office/drawing/2016/5/14/chartex" xmlns:mc="http://schemas.openxmlformats.org/markup-compatibility/2006" xmlns:aink="http://schemas.microsoft.com/office/drawing/2016/ink" xmlns:am3d="http://schemas.microsoft.com/office/drawing/2017/model3d" xmlns:o="urn:schemas-microsoft-com:office:office" xmlns:oel="http://schemas.microsoft.com/office/2019/extlst" xmlns:r="http://schemas.openxmlformats.org/officeDocument/2006/relationships" xmlns:m="http://schemas.openxmlformats.org/officeDocument/2006/math" xmlns:v="urn:schemas-microsoft-com:vml" xmlns:wp14="http://schemas.microsoft.com/office/word/2010/wordprocessingDrawing" xmlns:wp="http://schemas.openxmlformats.org/drawingml/2006/wordprocessingDrawing" xmlns:w10="urn:schemas-microsoft-com:office:word" xmlns:w="http://schemas.openxmlformats.org/wordprocessingml/2006/main" xmlns:w14="http://schemas.microsoft.com/office/word/2010/wordml" xmlns:w15="http://schemas.microsoft.com/office/word/2012/wordml" xmlns:w16cex="http://schemas.microsoft.com/office/word/2018/wordml/cex" xmlns:w16cid="http://schemas.microsoft.com/office/word/2016/wordml/cid" xmlns:w16="http://schemas.microsoft.com/office/word/2018/wordml" xmlns:w16du="http://schemas.microsoft.com/office/word/2023/wordml/word16du" xmlns:w16sdtdh="http://schemas.microsoft.com/office/word/2020/wordml/sdtdatahash" xmlns:w16sdtfl="http://schemas.microsoft.com/office/word/2024/wordml/sdtformatlock" xmlns:w16se="http://schemas.microsoft.com/office/word/2015/wordml/symex" xmlns:wpg="http://schemas.microsoft.com/office/word/2010/wordprocessingGroup" xmlns:wpi="http://schemas.microsoft.com/office/word/2010/wordprocessingInk" xmlns:wne="http://schemas.microsoft.com/office/word/2006/wordml" xmlns:wps="http://schemas.microsoft.com/office/word/2010/wordprocessingShape" mc:Ignorable="w14 w15 w16se w16cid w16 w16cex w16sdtdh w16sdtfl w16du wp14">
   <w:abstractNum w:abstractNumId="0" w15:restartNumberingAfterBreak="0">
-    <w:nsid w:val="52DE6532"/>
+    <w:nsid w:val="169226FA"/>
     <w:multiLevelType w:val="hybridMultilevel"/>
-    <w:tmpl w:val="E65CFEAC"/>
-    <w:lvl w:ilvl="0" w:tplc="937C980E">
+    <w:tmpl w:val="1610D420"/>
+    <w:lvl w:ilvl="0" w:tplc="4B3CB890">
       <w:start w:val="1"/>
-      <w:numFmt w:val="decimal"/>
-      <w:lvlText w:val="%1."/>
+      <w:numFmt w:val="bullet"/>
+      <w:lvlText w:val="•"/>
       <w:lvlJc w:val="left"/>
       <w:pPr>
         <w:ind w:left="720" w:hanging="360"/>
       </w:pPr>
     </w:lvl>
-    <w:lvl w:ilvl="1" w:tplc="B838C8E4">
+    <w:lvl w:ilvl="1" w:tplc="DB340D6E" w:tentative="1">
+      <w:start w:val="1"/>
+      <w:numFmt w:val="bullet"/>
+      <w:lvlText w:val="◦"/>
+      <w:lvlJc w:val="left"/>
+      <w:pPr>
+        <w:ind w:left="1440" w:hanging="360"/>
+      </w:pPr>
+    </w:lvl>
+    <w:lvl w:ilvl="2" w:tplc="770A1814">
       <w:numFmt w:val="decimal"/>
       <w:lvlText w:val=""/>
       <w:lvlJc w:val="left"/>
     </w:lvl>
-    <w:lvl w:ilvl="2" w:tplc="77E646E4">
+    <w:lvl w:ilvl="3" w:tplc="3C26E22C">
       <w:numFmt w:val="decimal"/>
       <w:lvlText w:val=""/>
       <w:lvlJc w:val="left"/>
     </w:lvl>
-    <w:lvl w:ilvl="3" w:tplc="E8489BA4">
+    <w:lvl w:ilvl="4" w:tplc="65889AB6">
       <w:numFmt w:val="decimal"/>
       <w:lvlText w:val=""/>
       <w:lvlJc w:val="left"/>
     </w:lvl>
-    <w:lvl w:ilvl="4" w:tplc="8C4E1F92">
+    <w:lvl w:ilvl="5" w:tplc="CAD25222">
       <w:numFmt w:val="decimal"/>
       <w:lvlText w:val=""/>
       <w:lvlJc w:val="left"/>
     </w:lvl>
-    <w:lvl w:ilvl="5" w:tplc="A9B29CC4">
+    <w:lvl w:ilvl="6" w:tplc="54C8FFDC">
       <w:numFmt w:val="decimal"/>
       <w:lvlText w:val=""/>
       <w:lvlJc w:val="left"/>
     </w:lvl>
-    <w:lvl w:ilvl="6" w:tplc="859C2AB0">
+    <w:lvl w:ilvl="7" w:tplc="39EEEE2C">
       <w:numFmt w:val="decimal"/>
       <w:lvlText w:val=""/>
       <w:lvlJc w:val="left"/>
     </w:lvl>
-    <w:lvl w:ilvl="7" w:tplc="FCE6870A">
-      <w:numFmt w:val="decimal"/>
-      <w:lvlText w:val=""/>
-      <w:lvlJc w:val="left"/>
-    </w:lvl>
-    <w:lvl w:ilvl="8" w:tplc="17209AF8">
+    <w:lvl w:ilvl="8" w:tplc="AA10D71C">
       <w:numFmt w:val="decimal"/>
       <w:lvlText w:val=""/>
       <w:lvlJc w:val="left"/>
     </w:lvl>
   </w:abstractNum>
   <w:abstractNum w:abstractNumId="1" w15:restartNumberingAfterBreak="0">
-    <w:nsid w:val="55C22A24"/>
+    <w:nsid w:val="2105625C"/>
     <w:multiLevelType w:val="hybridMultilevel"/>
-    <w:tmpl w:val="D82A65DC"/>
-    <w:lvl w:ilvl="0" w:tplc="47260AF6">
+    <w:tmpl w:val="3B4E93B2"/>
+    <w:lvl w:ilvl="0" w:tplc="9BAC806A">
       <w:start w:val="1"/>
-      <w:numFmt w:val="bullet"/>
-      <w:lvlText w:val="•"/>
+      <w:numFmt w:val="decimal"/>
+      <w:lvlText w:val="%1."/>
       <w:lvlJc w:val="left"/>
       <w:pPr>
         <w:ind w:left="720" w:hanging="360"/>
       </w:pPr>
     </w:lvl>
-    <w:lvl w:ilvl="1" w:tplc="E0EA1F58" w:tentative="1">
-      <w:start w:val="1"/>
-      <w:numFmt w:val="bullet"/>
-      <w:lvlText w:val="◦"/>
-      <w:lvlJc w:val="left"/>
-      <w:pPr>
-        <w:ind w:left="1440" w:hanging="360"/>
-      </w:pPr>
-    </w:lvl>
-    <w:lvl w:ilvl="2" w:tplc="C79C405A">
+    <w:lvl w:ilvl="1" w:tplc="C5D40248">
       <w:numFmt w:val="decimal"/>
       <w:lvlText w:val=""/>
       <w:lvlJc w:val="left"/>
     </w:lvl>
-    <w:lvl w:ilvl="3" w:tplc="44D894BC">
+    <w:lvl w:ilvl="2" w:tplc="C54808FC">
       <w:numFmt w:val="decimal"/>
       <w:lvlText w:val=""/>
       <w:lvlJc w:val="left"/>
     </w:lvl>
-    <w:lvl w:ilvl="4" w:tplc="5FAEF06E">
+    <w:lvl w:ilvl="3" w:tplc="0B16A552">
       <w:numFmt w:val="decimal"/>
       <w:lvlText w:val=""/>
       <w:lvlJc w:val="left"/>
     </w:lvl>
-    <w:lvl w:ilvl="5" w:tplc="6C5A300C">
+    <w:lvl w:ilvl="4" w:tplc="A9F0100A">
       <w:numFmt w:val="decimal"/>
       <w:lvlText w:val=""/>
       <w:lvlJc w:val="left"/>
     </w:lvl>
-    <w:lvl w:ilvl="6" w:tplc="C32C1ACA">
+    <w:lvl w:ilvl="5" w:tplc="CDF0E8DE">
       <w:numFmt w:val="decimal"/>
       <w:lvlText w:val=""/>
       <w:lvlJc w:val="left"/>
     </w:lvl>
-    <w:lvl w:ilvl="7" w:tplc="1A2A2DD6">
+    <w:lvl w:ilvl="6" w:tplc="3CD421FC">
       <w:numFmt w:val="decimal"/>
       <w:lvlText w:val=""/>
       <w:lvlJc w:val="left"/>
     </w:lvl>
-    <w:lvl w:ilvl="8" w:tplc="EA1CE80E">
+    <w:lvl w:ilvl="7" w:tplc="46800D4A">
+      <w:numFmt w:val="decimal"/>
+      <w:lvlText w:val=""/>
+      <w:lvlJc w:val="left"/>
+    </w:lvl>
+    <w:lvl w:ilvl="8" w:tplc="2DD6DD68">
       <w:numFmt w:val="decimal"/>
       <w:lvlText w:val=""/>
       <w:lvlJc w:val="left"/>
     </w:lvl>
   </w:abstractNum>
   <w:abstractNum w:abstractNumId="2" w15:restartNumberingAfterBreak="0">
-    <w:nsid w:val="6E3D7185"/>
+    <w:nsid w:val="6E46467E"/>
     <w:multiLevelType w:val="hybridMultilevel"/>
-    <w:tmpl w:val="508C9C24"/>
-    <w:lvl w:ilvl="0" w:tplc="A664C3E8" w:tentative="1">
+    <w:tmpl w:val="B504D8CC"/>
+    <w:lvl w:ilvl="0" w:tplc="89EA4992" w:tentative="1">
       <w:start w:val="1"/>
       <w:numFmt w:val="bullet"/>
       <w:lvlText w:val="●"/>
@@ -25584,7 +25587,7 @@
         <w:ind w:left="720" w:hanging="360"/>
       </w:pPr>
     </w:lvl>
-    <w:lvl w:ilvl="1" w:tplc="459A9A7A" w:tentative="1">
+    <w:lvl w:ilvl="1" w:tplc="BDF27EDC" w:tentative="1">
       <w:start w:val="1"/>
       <w:numFmt w:val="bullet"/>
       <w:lvlText w:val="○"/>
@@ -25593,7 +25596,7 @@
         <w:ind w:left="1440" w:hanging="360"/>
       </w:pPr>
     </w:lvl>
-    <w:lvl w:ilvl="2" w:tplc="C8FE4F60" w:tentative="1">
+    <w:lvl w:ilvl="2" w:tplc="1D743E62" w:tentative="1">
       <w:start w:val="1"/>
       <w:numFmt w:val="bullet"/>
       <w:lvlText w:val="■"/>
@@ -25602,7 +25605,7 @@
         <w:ind w:left="2160" w:hanging="360"/>
       </w:pPr>
     </w:lvl>
-    <w:lvl w:ilvl="3" w:tplc="6E4240B2" w:tentative="1">
+    <w:lvl w:ilvl="3" w:tplc="C25242E8" w:tentative="1">
       <w:start w:val="1"/>
       <w:numFmt w:val="bullet"/>
       <w:lvlText w:val="●"/>
@@ -25611,7 +25614,7 @@
         <w:ind w:left="2880" w:hanging="360"/>
       </w:pPr>
     </w:lvl>
-    <w:lvl w:ilvl="4" w:tplc="80DE5136" w:tentative="1">
+    <w:lvl w:ilvl="4" w:tplc="2CCA8630" w:tentative="1">
       <w:start w:val="1"/>
       <w:numFmt w:val="bullet"/>
       <w:lvlText w:val="○"/>
@@ -25620,7 +25623,7 @@
         <w:ind w:left="3600" w:hanging="360"/>
       </w:pPr>
     </w:lvl>
-    <w:lvl w:ilvl="5" w:tplc="15301AC2" w:tentative="1">
+    <w:lvl w:ilvl="5" w:tplc="7332C2D2" w:tentative="1">
       <w:start w:val="1"/>
       <w:numFmt w:val="bullet"/>
       <w:lvlText w:val="■"/>
@@ -25629,7 +25632,7 @@
         <w:ind w:left="4320" w:hanging="360"/>
       </w:pPr>
     </w:lvl>
-    <w:lvl w:ilvl="6" w:tplc="0B4CD43C" w:tentative="1">
+    <w:lvl w:ilvl="6" w:tplc="805485A8" w:tentative="1">
       <w:start w:val="1"/>
       <w:numFmt w:val="bullet"/>
       <w:lvlText w:val="●"/>
@@ -25638,7 +25641,7 @@
         <w:ind w:left="5040" w:hanging="360"/>
       </w:pPr>
     </w:lvl>
-    <w:lvl w:ilvl="7" w:tplc="7E1A4EE2" w:tentative="1">
+    <w:lvl w:ilvl="7" w:tplc="E61A0934" w:tentative="1">
       <w:start w:val="1"/>
       <w:numFmt w:val="bullet"/>
       <w:lvlText w:val="●"/>
@@ -25647,7 +25650,7 @@
         <w:ind w:left="5760" w:hanging="360"/>
       </w:pPr>
     </w:lvl>
-    <w:lvl w:ilvl="8" w:tplc="A288E7BC" w:tentative="1">
+    <w:lvl w:ilvl="8" w:tplc="88BACC52" w:tentative="1">
       <w:start w:val="1"/>
       <w:numFmt w:val="bullet"/>
       <w:lvlText w:val="●"/>
@@ -25657,26 +25660,26 @@
       </w:pPr>
     </w:lvl>
   </w:abstractNum>
-  <w:num w:numId="1" w16cid:durableId="1015958306">
+  <w:num w:numId="1" w16cid:durableId="1571191663">
     <w:abstractNumId w:val="2"/>
     <w:lvlOverride w:ilvl="0">
       <w:startOverride w:val="1"/>
     </w:lvlOverride>
   </w:num>
-  <w:num w:numId="2" w16cid:durableId="389767704">
-    <w:abstractNumId w:val="0"/>
+  <w:num w:numId="2" w16cid:durableId="1053233429">
+    <w:abstractNumId w:val="1"/>
     <w:lvlOverride w:ilvl="0">
       <w:startOverride w:val="1"/>
     </w:lvlOverride>
   </w:num>
-  <w:num w:numId="3" w16cid:durableId="452747500">
-    <w:abstractNumId w:val="0"/>
+  <w:num w:numId="3" w16cid:durableId="324625990">
+    <w:abstractNumId w:val="1"/>
     <w:lvlOverride w:ilvl="0">
       <w:startOverride w:val="1"/>
     </w:lvlOverride>
   </w:num>
-  <w:num w:numId="4" w16cid:durableId="1854107732">
-    <w:abstractNumId w:val="1"/>
+  <w:num w:numId="4" w16cid:durableId="1080635426">
+    <w:abstractNumId w:val="0"/>
     <w:lvlOverride w:ilvl="0">
       <w:startOverride w:val="1"/>
     </w:lvlOverride>
@@ -26346,7 +26349,7 @@
     <w:autoRedefine/>
     <w:uiPriority w:val="39"/>
     <w:unhideWhenUsed/>
-    <w:rsid w:val="00EE6828"/>
+    <w:rsid w:val="00C67DEB"/>
     <w:pPr>
       <w:spacing w:after="100"/>
     </w:pPr>
@@ -26358,7 +26361,7 @@
     <w:autoRedefine/>
     <w:uiPriority w:val="39"/>
     <w:unhideWhenUsed/>
-    <w:rsid w:val="00EE6828"/>
+    <w:rsid w:val="00C67DEB"/>
     <w:pPr>
       <w:spacing w:after="100"/>
       <w:ind w:left="240"/>
@@ -26371,7 +26374,7 @@
     <w:autoRedefine/>
     <w:uiPriority w:val="39"/>
     <w:unhideWhenUsed/>
-    <w:rsid w:val="00EE6828"/>
+    <w:rsid w:val="00C67DEB"/>
     <w:pPr>
       <w:spacing w:after="100"/>
       <w:ind w:left="480"/>
@@ -26384,7 +26387,7 @@
     <w:autoRedefine/>
     <w:uiPriority w:val="39"/>
     <w:unhideWhenUsed/>
-    <w:rsid w:val="00EE6828"/>
+    <w:rsid w:val="00C67DEB"/>
     <w:pPr>
       <w:spacing w:after="100" w:line="278" w:lineRule="auto"/>
       <w:ind w:left="720"/>
@@ -26402,7 +26405,7 @@
     <w:autoRedefine/>
     <w:uiPriority w:val="39"/>
     <w:unhideWhenUsed/>
-    <w:rsid w:val="00EE6828"/>
+    <w:rsid w:val="00C67DEB"/>
     <w:pPr>
       <w:spacing w:after="100" w:line="278" w:lineRule="auto"/>
       <w:ind w:left="960"/>
@@ -26420,7 +26423,7 @@
     <w:autoRedefine/>
     <w:uiPriority w:val="39"/>
     <w:unhideWhenUsed/>
-    <w:rsid w:val="00EE6828"/>
+    <w:rsid w:val="00C67DEB"/>
     <w:pPr>
       <w:spacing w:after="100" w:line="278" w:lineRule="auto"/>
       <w:ind w:left="1200"/>
@@ -26438,7 +26441,7 @@
     <w:autoRedefine/>
     <w:uiPriority w:val="39"/>
     <w:unhideWhenUsed/>
-    <w:rsid w:val="00EE6828"/>
+    <w:rsid w:val="00C67DEB"/>
     <w:pPr>
       <w:spacing w:after="100" w:line="278" w:lineRule="auto"/>
       <w:ind w:left="1440"/>
@@ -26456,7 +26459,7 @@
     <w:autoRedefine/>
     <w:uiPriority w:val="39"/>
     <w:unhideWhenUsed/>
-    <w:rsid w:val="00EE6828"/>
+    <w:rsid w:val="00C67DEB"/>
     <w:pPr>
       <w:spacing w:after="100" w:line="278" w:lineRule="auto"/>
       <w:ind w:left="1680"/>
@@ -26474,7 +26477,7 @@
     <w:autoRedefine/>
     <w:uiPriority w:val="39"/>
     <w:unhideWhenUsed/>
-    <w:rsid w:val="00EE6828"/>
+    <w:rsid w:val="00C67DEB"/>
     <w:pPr>
       <w:spacing w:after="100" w:line="278" w:lineRule="auto"/>
       <w:ind w:left="1920"/>
@@ -26491,7 +26494,7 @@
     <w:uiPriority w:val="99"/>
     <w:semiHidden/>
     <w:unhideWhenUsed/>
-    <w:rsid w:val="00EE6828"/>
+    <w:rsid w:val="00C67DEB"/>
     <w:rPr>
       <w:color w:val="605E5C"/>
       <w:shd w:val="clear" w:color="auto" w:fill="E1DFDD"/>

</xml_diff>